<commit_message>
fix: correlation rotulo in html tables
</commit_message>
<xml_diff>
--- a/docs/index.docx
+++ b/docs/index.docx
@@ -4831,9 +4831,6 @@
                     <w:jc w:val="center"/>
                   </w:pPr>
                   <w:r>
-                    <w:rPr>
-                      <w:rStyle w:val="VerbatimChar"/>
-                    </w:rPr>
                     <w:t xml:space="preserve">psycho=~Q5</w:t>
                   </w:r>
                 </w:p>
@@ -4901,9 +4898,6 @@
                     <w:jc w:val="center"/>
                   </w:pPr>
                   <w:r>
-                    <w:rPr>
-                      <w:rStyle w:val="VerbatimChar"/>
-                    </w:rPr>
                     <w:t xml:space="preserve">psycho=~Q6</w:t>
                   </w:r>
                 </w:p>
@@ -4971,9 +4965,6 @@
                     <w:jc w:val="center"/>
                   </w:pPr>
                   <w:r>
-                    <w:rPr>
-                      <w:rStyle w:val="VerbatimChar"/>
-                    </w:rPr>
                     <w:t xml:space="preserve">psycho=~Q7</w:t>
                   </w:r>
                 </w:p>
@@ -5041,9 +5032,6 @@
                     <w:jc w:val="center"/>
                   </w:pPr>
                   <w:r>
-                    <w:rPr>
-                      <w:rStyle w:val="VerbatimChar"/>
-                    </w:rPr>
                     <w:t xml:space="preserve">psycho=~Q11</w:t>
                   </w:r>
                 </w:p>
@@ -5111,9 +5099,6 @@
                     <w:jc w:val="center"/>
                   </w:pPr>
                   <w:r>
-                    <w:rPr>
-                      <w:rStyle w:val="VerbatimChar"/>
-                    </w:rPr>
                     <w:t xml:space="preserve">psycho=~Q19</w:t>
                   </w:r>
                 </w:p>
@@ -5181,9 +5166,6 @@
                     <w:jc w:val="center"/>
                   </w:pPr>
                   <w:r>
-                    <w:rPr>
-                      <w:rStyle w:val="VerbatimChar"/>
-                    </w:rPr>
                     <w:t xml:space="preserve">psycho=~Q26</w:t>
                   </w:r>
                 </w:p>
@@ -5251,9 +5233,6 @@
                     <w:jc w:val="center"/>
                   </w:pPr>
                   <w:r>
-                    <w:rPr>
-                      <w:rStyle w:val="VerbatimChar"/>
-                    </w:rPr>
                     <w:t xml:space="preserve">physical=~Q3</w:t>
                   </w:r>
                 </w:p>
@@ -5321,9 +5300,6 @@
                     <w:jc w:val="center"/>
                   </w:pPr>
                   <w:r>
-                    <w:rPr>
-                      <w:rStyle w:val="VerbatimChar"/>
-                    </w:rPr>
                     <w:t xml:space="preserve">physical=~Q4</w:t>
                   </w:r>
                 </w:p>
@@ -5391,9 +5367,6 @@
                     <w:jc w:val="center"/>
                   </w:pPr>
                   <w:r>
-                    <w:rPr>
-                      <w:rStyle w:val="VerbatimChar"/>
-                    </w:rPr>
                     <w:t xml:space="preserve">physical=~Q10</w:t>
                   </w:r>
                 </w:p>
@@ -5461,9 +5434,6 @@
                     <w:jc w:val="center"/>
                   </w:pPr>
                   <w:r>
-                    <w:rPr>
-                      <w:rStyle w:val="VerbatimChar"/>
-                    </w:rPr>
                     <w:t xml:space="preserve">physical=~Q15</w:t>
                   </w:r>
                 </w:p>
@@ -5531,9 +5501,6 @@
                     <w:jc w:val="center"/>
                   </w:pPr>
                   <w:r>
-                    <w:rPr>
-                      <w:rStyle w:val="VerbatimChar"/>
-                    </w:rPr>
                     <w:t xml:space="preserve">physical=~Q16</w:t>
                   </w:r>
                 </w:p>
@@ -5601,9 +5568,6 @@
                     <w:jc w:val="center"/>
                   </w:pPr>
                   <w:r>
-                    <w:rPr>
-                      <w:rStyle w:val="VerbatimChar"/>
-                    </w:rPr>
                     <w:t xml:space="preserve">physical=~Q17</w:t>
                   </w:r>
                 </w:p>
@@ -5671,9 +5635,6 @@
                     <w:jc w:val="center"/>
                   </w:pPr>
                   <w:r>
-                    <w:rPr>
-                      <w:rStyle w:val="VerbatimChar"/>
-                    </w:rPr>
                     <w:t xml:space="preserve">physical=~Q18</w:t>
                   </w:r>
                 </w:p>
@@ -5741,9 +5702,6 @@
                     <w:jc w:val="center"/>
                   </w:pPr>
                   <w:r>
-                    <w:rPr>
-                      <w:rStyle w:val="VerbatimChar"/>
-                    </w:rPr>
                     <w:t xml:space="preserve">social=~Q20</w:t>
                   </w:r>
                 </w:p>
@@ -5811,9 +5769,6 @@
                     <w:jc w:val="center"/>
                   </w:pPr>
                   <w:r>
-                    <w:rPr>
-                      <w:rStyle w:val="VerbatimChar"/>
-                    </w:rPr>
                     <w:t xml:space="preserve">social=~Q21</w:t>
                   </w:r>
                 </w:p>
@@ -5881,9 +5836,6 @@
                     <w:jc w:val="center"/>
                   </w:pPr>
                   <w:r>
-                    <w:rPr>
-                      <w:rStyle w:val="VerbatimChar"/>
-                    </w:rPr>
                     <w:t xml:space="preserve">social=~Q22</w:t>
                   </w:r>
                 </w:p>
@@ -5951,9 +5903,6 @@
                     <w:jc w:val="center"/>
                   </w:pPr>
                   <w:r>
-                    <w:rPr>
-                      <w:rStyle w:val="VerbatimChar"/>
-                    </w:rPr>
                     <w:t xml:space="preserve">environment=~Q8</w:t>
                   </w:r>
                 </w:p>
@@ -6021,9 +5970,6 @@
                     <w:jc w:val="center"/>
                   </w:pPr>
                   <w:r>
-                    <w:rPr>
-                      <w:rStyle w:val="VerbatimChar"/>
-                    </w:rPr>
                     <w:t xml:space="preserve">environment=~Q9</w:t>
                   </w:r>
                 </w:p>
@@ -6091,9 +6037,6 @@
                     <w:jc w:val="center"/>
                   </w:pPr>
                   <w:r>
-                    <w:rPr>
-                      <w:rStyle w:val="VerbatimChar"/>
-                    </w:rPr>
                     <w:t xml:space="preserve">environment=~Q12</w:t>
                   </w:r>
                 </w:p>
@@ -6161,9 +6104,6 @@
                     <w:jc w:val="center"/>
                   </w:pPr>
                   <w:r>
-                    <w:rPr>
-                      <w:rStyle w:val="VerbatimChar"/>
-                    </w:rPr>
                     <w:t xml:space="preserve">environment=~Q13</w:t>
                   </w:r>
                 </w:p>
@@ -6231,9 +6171,6 @@
                     <w:jc w:val="center"/>
                   </w:pPr>
                   <w:r>
-                    <w:rPr>
-                      <w:rStyle w:val="VerbatimChar"/>
-                    </w:rPr>
                     <w:t xml:space="preserve">environment=~Q14</w:t>
                   </w:r>
                 </w:p>
@@ -6301,9 +6238,6 @@
                     <w:jc w:val="center"/>
                   </w:pPr>
                   <w:r>
-                    <w:rPr>
-                      <w:rStyle w:val="VerbatimChar"/>
-                    </w:rPr>
                     <w:t xml:space="preserve">environment=~Q23</w:t>
                   </w:r>
                 </w:p>
@@ -6371,9 +6305,6 @@
                     <w:jc w:val="center"/>
                   </w:pPr>
                   <w:r>
-                    <w:rPr>
-                      <w:rStyle w:val="VerbatimChar"/>
-                    </w:rPr>
                     <w:t xml:space="preserve">environment=~Q24</w:t>
                   </w:r>
                 </w:p>
@@ -6441,9 +6372,6 @@
                     <w:jc w:val="center"/>
                   </w:pPr>
                   <w:r>
-                    <w:rPr>
-                      <w:rStyle w:val="VerbatimChar"/>
-                    </w:rPr>
                     <w:t xml:space="preserve">environment=~Q25</w:t>
                   </w:r>
                 </w:p>
@@ -6511,9 +6439,6 @@
                     <w:jc w:val="center"/>
                   </w:pPr>
                   <w:r>
-                    <w:rPr>
-                      <w:rStyle w:val="VerbatimChar"/>
-                    </w:rPr>
                     <w:t xml:space="preserve">Q3~~Q4</w:t>
                   </w:r>
                 </w:p>
@@ -6581,9 +6506,6 @@
                     <w:jc w:val="center"/>
                   </w:pPr>
                   <w:r>
-                    <w:rPr>
-                      <w:rStyle w:val="VerbatimChar"/>
-                    </w:rPr>
                     <w:t xml:space="preserve">psycho~~psycho</w:t>
                   </w:r>
                 </w:p>
@@ -6651,9 +6573,6 @@
                     <w:jc w:val="center"/>
                   </w:pPr>
                   <w:r>
-                    <w:rPr>
-                      <w:rStyle w:val="VerbatimChar"/>
-                    </w:rPr>
                     <w:t xml:space="preserve">psycho~~physical</w:t>
                   </w:r>
                 </w:p>
@@ -6721,9 +6640,6 @@
                     <w:jc w:val="center"/>
                   </w:pPr>
                   <w:r>
-                    <w:rPr>
-                      <w:rStyle w:val="VerbatimChar"/>
-                    </w:rPr>
                     <w:t xml:space="preserve">psycho~~social</w:t>
                   </w:r>
                 </w:p>
@@ -6791,9 +6707,6 @@
                     <w:jc w:val="center"/>
                   </w:pPr>
                   <w:r>
-                    <w:rPr>
-                      <w:rStyle w:val="VerbatimChar"/>
-                    </w:rPr>
                     <w:t xml:space="preserve">psycho~~environment</w:t>
                   </w:r>
                 </w:p>
@@ -6861,9 +6774,6 @@
                     <w:jc w:val="center"/>
                   </w:pPr>
                   <w:r>
-                    <w:rPr>
-                      <w:rStyle w:val="VerbatimChar"/>
-                    </w:rPr>
                     <w:t xml:space="preserve">physical~~physical</w:t>
                   </w:r>
                 </w:p>
@@ -6931,9 +6841,6 @@
                     <w:jc w:val="center"/>
                   </w:pPr>
                   <w:r>
-                    <w:rPr>
-                      <w:rStyle w:val="VerbatimChar"/>
-                    </w:rPr>
                     <w:t xml:space="preserve">physical~~social</w:t>
                   </w:r>
                 </w:p>
@@ -7001,9 +6908,6 @@
                     <w:jc w:val="center"/>
                   </w:pPr>
                   <w:r>
-                    <w:rPr>
-                      <w:rStyle w:val="VerbatimChar"/>
-                    </w:rPr>
                     <w:t xml:space="preserve">physical~~environment</w:t>
                   </w:r>
                 </w:p>
@@ -7071,9 +6975,6 @@
                     <w:jc w:val="center"/>
                   </w:pPr>
                   <w:r>
-                    <w:rPr>
-                      <w:rStyle w:val="VerbatimChar"/>
-                    </w:rPr>
                     <w:t xml:space="preserve">social~~social</w:t>
                   </w:r>
                 </w:p>
@@ -7141,9 +7042,6 @@
                     <w:jc w:val="center"/>
                   </w:pPr>
                   <w:r>
-                    <w:rPr>
-                      <w:rStyle w:val="VerbatimChar"/>
-                    </w:rPr>
                     <w:t xml:space="preserve">social~~environment</w:t>
                   </w:r>
                 </w:p>
@@ -7211,9 +7109,6 @@
                     <w:jc w:val="center"/>
                   </w:pPr>
                   <w:r>
-                    <w:rPr>
-                      <w:rStyle w:val="VerbatimChar"/>
-                    </w:rPr>
                     <w:t xml:space="preserve">environment~~environment</w:t>
                   </w:r>
                 </w:p>
@@ -7281,9 +7176,6 @@
                     <w:jc w:val="center"/>
                   </w:pPr>
                   <w:r>
-                    <w:rPr>
-                      <w:rStyle w:val="VerbatimChar"/>
-                    </w:rPr>
                     <w:t xml:space="preserve">Q5~~Q5</w:t>
                   </w:r>
                 </w:p>
@@ -7351,9 +7243,6 @@
                     <w:jc w:val="center"/>
                   </w:pPr>
                   <w:r>
-                    <w:rPr>
-                      <w:rStyle w:val="VerbatimChar"/>
-                    </w:rPr>
                     <w:t xml:space="preserve">Q6~~Q6</w:t>
                   </w:r>
                 </w:p>
@@ -7421,9 +7310,6 @@
                     <w:jc w:val="center"/>
                   </w:pPr>
                   <w:r>
-                    <w:rPr>
-                      <w:rStyle w:val="VerbatimChar"/>
-                    </w:rPr>
                     <w:t xml:space="preserve">Q7~~Q7</w:t>
                   </w:r>
                 </w:p>
@@ -7491,9 +7377,6 @@
                     <w:jc w:val="center"/>
                   </w:pPr>
                   <w:r>
-                    <w:rPr>
-                      <w:rStyle w:val="VerbatimChar"/>
-                    </w:rPr>
                     <w:t xml:space="preserve">Q11~~Q11</w:t>
                   </w:r>
                 </w:p>
@@ -7561,9 +7444,6 @@
                     <w:jc w:val="center"/>
                   </w:pPr>
                   <w:r>
-                    <w:rPr>
-                      <w:rStyle w:val="VerbatimChar"/>
-                    </w:rPr>
                     <w:t xml:space="preserve">Q19~~Q19</w:t>
                   </w:r>
                 </w:p>
@@ -7631,9 +7511,6 @@
                     <w:jc w:val="center"/>
                   </w:pPr>
                   <w:r>
-                    <w:rPr>
-                      <w:rStyle w:val="VerbatimChar"/>
-                    </w:rPr>
                     <w:t xml:space="preserve">Q26~~Q26</w:t>
                   </w:r>
                 </w:p>
@@ -7701,9 +7578,6 @@
                     <w:jc w:val="center"/>
                   </w:pPr>
                   <w:r>
-                    <w:rPr>
-                      <w:rStyle w:val="VerbatimChar"/>
-                    </w:rPr>
                     <w:t xml:space="preserve">Q3~~Q3</w:t>
                   </w:r>
                 </w:p>
@@ -7771,9 +7645,6 @@
                     <w:jc w:val="center"/>
                   </w:pPr>
                   <w:r>
-                    <w:rPr>
-                      <w:rStyle w:val="VerbatimChar"/>
-                    </w:rPr>
                     <w:t xml:space="preserve">Q4~~Q4</w:t>
                   </w:r>
                 </w:p>
@@ -7841,9 +7712,6 @@
                     <w:jc w:val="center"/>
                   </w:pPr>
                   <w:r>
-                    <w:rPr>
-                      <w:rStyle w:val="VerbatimChar"/>
-                    </w:rPr>
                     <w:t xml:space="preserve">Q10~~Q10</w:t>
                   </w:r>
                 </w:p>
@@ -7911,9 +7779,6 @@
                     <w:jc w:val="center"/>
                   </w:pPr>
                   <w:r>
-                    <w:rPr>
-                      <w:rStyle w:val="VerbatimChar"/>
-                    </w:rPr>
                     <w:t xml:space="preserve">Q15~~Q15</w:t>
                   </w:r>
                 </w:p>
@@ -7981,9 +7846,6 @@
                     <w:jc w:val="center"/>
                   </w:pPr>
                   <w:r>
-                    <w:rPr>
-                      <w:rStyle w:val="VerbatimChar"/>
-                    </w:rPr>
                     <w:t xml:space="preserve">Q16~~Q16</w:t>
                   </w:r>
                 </w:p>
@@ -8051,9 +7913,6 @@
                     <w:jc w:val="center"/>
                   </w:pPr>
                   <w:r>
-                    <w:rPr>
-                      <w:rStyle w:val="VerbatimChar"/>
-                    </w:rPr>
                     <w:t xml:space="preserve">Q17~~Q17</w:t>
                   </w:r>
                 </w:p>
@@ -8121,9 +7980,6 @@
                     <w:jc w:val="center"/>
                   </w:pPr>
                   <w:r>
-                    <w:rPr>
-                      <w:rStyle w:val="VerbatimChar"/>
-                    </w:rPr>
                     <w:t xml:space="preserve">Q18~~Q18</w:t>
                   </w:r>
                 </w:p>
@@ -8191,9 +8047,6 @@
                     <w:jc w:val="center"/>
                   </w:pPr>
                   <w:r>
-                    <w:rPr>
-                      <w:rStyle w:val="VerbatimChar"/>
-                    </w:rPr>
                     <w:t xml:space="preserve">Q20~~Q20</w:t>
                   </w:r>
                 </w:p>
@@ -8261,9 +8114,6 @@
                     <w:jc w:val="center"/>
                   </w:pPr>
                   <w:r>
-                    <w:rPr>
-                      <w:rStyle w:val="VerbatimChar"/>
-                    </w:rPr>
                     <w:t xml:space="preserve">Q21~~Q21</w:t>
                   </w:r>
                 </w:p>
@@ -8331,9 +8181,6 @@
                     <w:jc w:val="center"/>
                   </w:pPr>
                   <w:r>
-                    <w:rPr>
-                      <w:rStyle w:val="VerbatimChar"/>
-                    </w:rPr>
                     <w:t xml:space="preserve">Q22~~Q22</w:t>
                   </w:r>
                 </w:p>
@@ -8401,9 +8248,6 @@
                     <w:jc w:val="center"/>
                   </w:pPr>
                   <w:r>
-                    <w:rPr>
-                      <w:rStyle w:val="VerbatimChar"/>
-                    </w:rPr>
                     <w:t xml:space="preserve">Q8~~Q8</w:t>
                   </w:r>
                 </w:p>
@@ -8471,9 +8315,6 @@
                     <w:jc w:val="center"/>
                   </w:pPr>
                   <w:r>
-                    <w:rPr>
-                      <w:rStyle w:val="VerbatimChar"/>
-                    </w:rPr>
                     <w:t xml:space="preserve">Q9~~Q9</w:t>
                   </w:r>
                 </w:p>
@@ -8541,9 +8382,6 @@
                     <w:jc w:val="center"/>
                   </w:pPr>
                   <w:r>
-                    <w:rPr>
-                      <w:rStyle w:val="VerbatimChar"/>
-                    </w:rPr>
                     <w:t xml:space="preserve">Q12~~Q12</w:t>
                   </w:r>
                 </w:p>
@@ -8611,9 +8449,6 @@
                     <w:jc w:val="center"/>
                   </w:pPr>
                   <w:r>
-                    <w:rPr>
-                      <w:rStyle w:val="VerbatimChar"/>
-                    </w:rPr>
                     <w:t xml:space="preserve">Q13~~Q13</w:t>
                   </w:r>
                 </w:p>
@@ -8681,9 +8516,6 @@
                     <w:jc w:val="center"/>
                   </w:pPr>
                   <w:r>
-                    <w:rPr>
-                      <w:rStyle w:val="VerbatimChar"/>
-                    </w:rPr>
                     <w:t xml:space="preserve">Q14~~Q14</w:t>
                   </w:r>
                 </w:p>
@@ -8751,9 +8583,6 @@
                     <w:jc w:val="center"/>
                   </w:pPr>
                   <w:r>
-                    <w:rPr>
-                      <w:rStyle w:val="VerbatimChar"/>
-                    </w:rPr>
                     <w:t xml:space="preserve">Q23~~Q23</w:t>
                   </w:r>
                 </w:p>
@@ -8821,9 +8650,6 @@
                     <w:jc w:val="center"/>
                   </w:pPr>
                   <w:r>
-                    <w:rPr>
-                      <w:rStyle w:val="VerbatimChar"/>
-                    </w:rPr>
                     <w:t xml:space="preserve">Q24~~Q24</w:t>
                   </w:r>
                 </w:p>
@@ -8891,9 +8717,6 @@
                     <w:jc w:val="center"/>
                   </w:pPr>
                   <w:r>
-                    <w:rPr>
-                      <w:rStyle w:val="VerbatimChar"/>
-                    </w:rPr>
                     <w:t xml:space="preserve">Q25~~Q25</w:t>
                   </w:r>
                 </w:p>
@@ -8961,9 +8784,6 @@
                     <w:jc w:val="center"/>
                   </w:pPr>
                   <w:r>
-                    <w:rPr>
-                      <w:rStyle w:val="VerbatimChar"/>
-                    </w:rPr>
                     <w:t xml:space="preserve">psycho=~Q8</w:t>
                   </w:r>
                 </w:p>
@@ -9031,9 +8851,6 @@
                     <w:jc w:val="center"/>
                   </w:pPr>
                   <w:r>
-                    <w:rPr>
-                      <w:rStyle w:val="VerbatimChar"/>
-                    </w:rPr>
                     <w:t xml:space="preserve">psycho=~Q9</w:t>
                   </w:r>
                 </w:p>
@@ -9101,9 +8918,6 @@
                     <w:jc w:val="center"/>
                   </w:pPr>
                   <w:r>
-                    <w:rPr>
-                      <w:rStyle w:val="VerbatimChar"/>
-                    </w:rPr>
                     <w:t xml:space="preserve">environment=~Q15</w:t>
                   </w:r>
                 </w:p>
@@ -9746,7 +9560,7 @@
                     <w:jc w:val="center"/>
                   </w:pPr>
                   <w:r>
-                    <w:t xml:space="preserve">Q3Q4</w:t>
+                    <w:t xml:space="preserve">Q3–Q4</w:t>
                   </w:r>
                   <w:r>
                     <w:t xml:space="preserve"> </w:t>

</xml_diff>

<commit_message>
fix: R comand inline issues
</commit_message>
<xml_diff>
--- a/docs/index.docx
+++ b/docs/index.docx
@@ -31,7 +31,7 @@
         <w:pStyle w:val="Date"/>
       </w:pPr>
       <w:r>
-        <w:t xml:space="preserve">2026-04-18</w:t>
+        <w:t xml:space="preserve">2026-04-20</w:t>
       </w:r>
     </w:p>
     <w:p>
@@ -14321,7 +14321,7 @@
         <w:t xml:space="preserve"> </w:t>
       </w:r>
       <w:r>
-        <w:t xml:space="preserve">increases, the power curves rise steadily, showing that the same degree of misspecification becomes easier to detect in larger samples. The point at which each curve crosses the conventional target level (e.g., $ .80 $) marks the approximate minimum sample size required for that fit index to achieve adequate discriminatory performance.</w:t>
+        <w:t xml:space="preserve">increases, the power curves rise steadily, showing that the same degree of misspecification becomes easier to detect in larger samples. The point at which each curve crosses the conventional target level (e.g., .80) marks the approximate minimum sample size required for that fit index to achieve adequate discriminatory performance.</w:t>
       </w:r>
     </w:p>
     <w:p>
@@ -14999,37 +14999,7 @@
         <w:pStyle w:val="BodyText"/>
       </w:pPr>
       <w:r>
-        <w:t xml:space="preserve">Taken together, the pattern of results is clear: $</w:t>
-      </w:r>
-      <w:r>
-        <w:t xml:space="preserve"> </w:t>
-      </w:r>
-      <w:r>
-        <w:t xml:space="preserve"> </w:t>
-      </w:r>
-      <w:r>
-        <w:t xml:space="preserve">&gt;</w:t>
-      </w:r>
-      <w:r>
-        <w:t xml:space="preserve"> </w:t>
-      </w:r>
-      <w:r>
-        <w:t xml:space="preserve"> </w:t>
-      </w:r>
-      <w:r>
-        <w:t xml:space="preserve">&gt;</w:t>
-      </w:r>
-      <w:r>
-        <w:t xml:space="preserve"> </w:t>
-      </w:r>
-      <w:r>
-        <w:t xml:space="preserve"> </w:t>
-      </w:r>
-      <w:r>
-        <w:t xml:space="preserve"> </w:t>
-      </w:r>
-      <w:r>
-        <w:t xml:space="preserve">$ in terms of power. Thus, within this specific analysis, SRMR provided the strongest discrimination, RMSEA also performed strongly, and CFI and TLI were just above the conventional</w:t>
+        <w:t xml:space="preserve">Taken together, the pattern of results is clear: SRMR &gt; RMSEA &gt; CFI/TLI in terms of power. Thus, within this specific analysis, SRMR provided the strongest discrimination, RMSEA also performed strongly, and CFI and TLI were just above the conventional</w:t>
       </w:r>
       <w:r>
         <w:t xml:space="preserve"> </w:t>
@@ -15060,55 +15030,106 @@
         <w:pStyle w:val="FirstParagraph"/>
       </w:pPr>
       <w:r>
-        <w:t xml:space="preserve">When traditional cutoffs are used, the analysis adopts fixed threshold values such as $</w:t>
-      </w:r>
-      <w:r>
-        <w:t xml:space="preserve"> </w:t>
-      </w:r>
-      <w:r>
-        <w:t xml:space="preserve"> </w:t>
-      </w:r>
-      <w:r>
-        <w:t xml:space="preserve"> </w:t>
-      </w:r>
-      <w:r>
-        <w:t xml:space="preserve">$, $</w:t>
-      </w:r>
-      <w:r>
-        <w:t xml:space="preserve"> </w:t>
-      </w:r>
-      <w:r>
-        <w:t xml:space="preserve"> </w:t>
-      </w:r>
-      <w:r>
-        <w:t xml:space="preserve"> </w:t>
-      </w:r>
-      <w:r>
-        <w:t xml:space="preserve">$, $</w:t>
-      </w:r>
-      <w:r>
-        <w:t xml:space="preserve"> </w:t>
-      </w:r>
-      <w:r>
-        <w:t xml:space="preserve"> </w:t>
-      </w:r>
-      <w:r>
-        <w:t xml:space="preserve"> </w:t>
-      </w:r>
-      <w:r>
-        <w:t xml:space="preserve">$, and $</w:t>
-      </w:r>
-      <w:r>
-        <w:t xml:space="preserve"> </w:t>
-      </w:r>
-      <w:r>
-        <w:t xml:space="preserve"> </w:t>
-      </w:r>
-      <w:r>
-        <w:t xml:space="preserve"> </w:t>
-      </w:r>
-      <w:r>
-        <w:t xml:space="preserve">$ as the decision boundaries for acceptable fit. Conceptually, this means that power is defined here as the proportion of replications in which the misspecified model crosses those predefined boundaries in the direction of worse fit.</w:t>
+        <w:t xml:space="preserve">When traditional cutoffs are used, the analysis adopts fixed threshold values such as</w:t>
+      </w:r>
+      <w:r>
+        <w:t xml:space="preserve"> </w:t>
+      </w:r>
+      <m:oMath>
+        <m:r>
+          <m:rPr>
+            <m:nor/>
+            <m:sty m:val="p"/>
+          </m:rPr>
+          <m:t>RMSEA</m:t>
+        </m:r>
+        <m:r>
+          <m:rPr>
+            <m:sty m:val="p"/>
+          </m:rPr>
+          <m:t>≤</m:t>
+        </m:r>
+        <m:r>
+          <m:t>.06</m:t>
+        </m:r>
+      </m:oMath>
+      <w:r>
+        <w:t xml:space="preserve">,</w:t>
+      </w:r>
+      <w:r>
+        <w:t xml:space="preserve"> </w:t>
+      </w:r>
+      <m:oMath>
+        <m:r>
+          <m:rPr>
+            <m:nor/>
+            <m:sty m:val="p"/>
+          </m:rPr>
+          <m:t>CFI</m:t>
+        </m:r>
+        <m:r>
+          <m:rPr>
+            <m:sty m:val="p"/>
+          </m:rPr>
+          <m:t>≥</m:t>
+        </m:r>
+        <m:r>
+          <m:t>.95</m:t>
+        </m:r>
+      </m:oMath>
+      <w:r>
+        <w:t xml:space="preserve">,</w:t>
+      </w:r>
+      <w:r>
+        <w:t xml:space="preserve"> </w:t>
+      </w:r>
+      <m:oMath>
+        <m:r>
+          <m:rPr>
+            <m:nor/>
+            <m:sty m:val="p"/>
+          </m:rPr>
+          <m:t>TLI</m:t>
+        </m:r>
+        <m:r>
+          <m:rPr>
+            <m:sty m:val="p"/>
+          </m:rPr>
+          <m:t>≥</m:t>
+        </m:r>
+        <m:r>
+          <m:t>.95</m:t>
+        </m:r>
+      </m:oMath>
+      <w:r>
+        <w:t xml:space="preserve">, and</w:t>
+      </w:r>
+      <w:r>
+        <w:t xml:space="preserve"> </w:t>
+      </w:r>
+      <m:oMath>
+        <m:r>
+          <m:rPr>
+            <m:nor/>
+            <m:sty m:val="p"/>
+          </m:rPr>
+          <m:t>SRMR</m:t>
+        </m:r>
+        <m:r>
+          <m:rPr>
+            <m:sty m:val="p"/>
+          </m:rPr>
+          <m:t>≤</m:t>
+        </m:r>
+        <m:r>
+          <m:t>.06</m:t>
+        </m:r>
+      </m:oMath>
+      <w:r>
+        <w:t xml:space="preserve"> </w:t>
+      </w:r>
+      <w:r>
+        <w:t xml:space="preserve">as the decision boundaries for acceptable fit. Conceptually, this means that power is defined here as the proportion of replications in which the misspecified model crosses those predefined boundaries in the direction of worse fit.</w:t>
       </w:r>
     </w:p>
     <w:p>
@@ -20855,7 +20876,7 @@
     </w:p>
     <w:bookmarkEnd w:id="111"/>
     <w:bookmarkEnd w:id="112"/>
-    <w:bookmarkStart w:id="147" w:name="X1209260cfd11d7a4f20ced4599fb769750fdbcd"/>
+    <w:bookmarkStart w:id="146" w:name="X1209260cfd11d7a4f20ced4599fb769750fdbcd"/>
     <w:p>
       <w:pPr>
         <w:pStyle w:val="Heading2"/>
@@ -22353,7 +22374,32 @@
         <w:t xml:space="preserve"> </w:t>
       </w:r>
       <w:r>
-        <w:t xml:space="preserve">perspective under the optimal model. The Monte Carlo setup used here evaluates how power changes as $ N $ varies and then identifies the smallest sample size required for each parameter to attain the target power level of $ .80 $. In the</w:t>
+        <w:t xml:space="preserve">perspective under the optimal model. The Monte Carlo setup used here evaluates how power changes as</w:t>
+      </w:r>
+      <w:r>
+        <w:t xml:space="preserve"> </w:t>
+      </w:r>
+      <m:oMath>
+        <m:r>
+          <m:t>N</m:t>
+        </m:r>
+      </m:oMath>
+      <w:r>
+        <w:t xml:space="preserve"> </w:t>
+      </w:r>
+      <w:r>
+        <w:t xml:space="preserve">varies and then identifies the smallest sample size required for each parameter to attain the target power level of</w:t>
+      </w:r>
+      <w:r>
+        <w:t xml:space="preserve"> </w:t>
+      </w:r>
+      <m:oMath>
+        <m:r>
+          <m:t>.80</m:t>
+        </m:r>
+      </m:oMath>
+      <w:r>
+        <w:t xml:space="preserve">. In the</w:t>
       </w:r>
       <w:r>
         <w:t xml:space="preserve"> </w:t>
@@ -22655,7 +22701,21 @@
         <w:t xml:space="preserve"> </w:t>
       </w:r>
       <w:r>
-        <w:t xml:space="preserve">shows a very sparse set of finite sample-size requirements under the optimal model. Only seven parameters remained with finite $ N $ values after filtering (not shown in the table), which indicates that, within the simulated range, these are the parameters for which a specific minimum sample size could be directly reported.</w:t>
+        <w:t xml:space="preserve">shows a very sparse set of finite sample-size requirements under the optimal model. Only seven parameters remained with finite</w:t>
+      </w:r>
+      <w:r>
+        <w:t xml:space="preserve"> </w:t>
+      </w:r>
+      <m:oMath>
+        <m:r>
+          <m:t>N</m:t>
+        </m:r>
+      </m:oMath>
+      <w:r>
+        <w:t xml:space="preserve"> </w:t>
+      </w:r>
+      <w:r>
+        <w:t xml:space="preserve">values after filtering (not shown in the table), which indicates that, within the simulated range, these are the parameters for which a specific minimum sample size could be directly reported.</w:t>
       </w:r>
     </w:p>
     <w:p>
@@ -22799,17 +22859,66 @@
         <w:pStyle w:val="BodyText"/>
       </w:pPr>
       <w:r>
-        <w:t xml:space="preserve">Overall, the result is highly concentrated: most reported parameters are already adequately powered at $ N = 51 $, and only one parameter pushes the requirement upward. In practical terms, the optimal model appears easy to recover for the listed loadings and residual variances, while the residual covariance $ Q3</w:t>
-      </w:r>
-      <w:r>
-        <w:t xml:space="preserve"> </w:t>
-      </w:r>
-      <w:r>
-        <w:t xml:space="preserve">Q4 $ is the sole finite bottleneck in this table.</w:t>
+        <w:t xml:space="preserve">Overall, the result is highly concentrated: most reported parameters are already adequately powered at</w:t>
+      </w:r>
+      <w:r>
+        <w:t xml:space="preserve"> </w:t>
+      </w:r>
+      <m:oMath>
+        <m:r>
+          <m:t>N</m:t>
+        </m:r>
+        <m:r>
+          <m:rPr>
+            <m:sty m:val="p"/>
+          </m:rPr>
+          <m:t>=</m:t>
+        </m:r>
+        <m:r>
+          <m:t>51</m:t>
+        </m:r>
+      </m:oMath>
+      <w:r>
+        <w:t xml:space="preserve">, and only one parameter pushes the requirement upward. In practical terms, the optimal model appears easy to recover for the listed loadings and residual variances, while the residual covariance</w:t>
+      </w:r>
+      <w:r>
+        <w:t xml:space="preserve"> </w:t>
+      </w:r>
+      <m:oMath>
+        <m:r>
+          <m:t>Q</m:t>
+        </m:r>
+        <m:r>
+          <m:t>3</m:t>
+        </m:r>
+        <m:r>
+          <m:rPr>
+            <m:sty m:val="p"/>
+          </m:rPr>
+          <m:t>∼</m:t>
+        </m:r>
+        <m:r>
+          <m:rPr>
+            <m:sty m:val="p"/>
+          </m:rPr>
+          <m:t>∼</m:t>
+        </m:r>
+        <m:r>
+          <m:t>Q</m:t>
+        </m:r>
+        <m:r>
+          <m:t>4</m:t>
+        </m:r>
+      </m:oMath>
+      <w:r>
+        <w:t xml:space="preserve"> </w:t>
+      </w:r>
+      <w:r>
+        <w:t xml:space="preserve">is the sole finite bottleneck in this table.</w:t>
       </w:r>
     </w:p>
     <w:bookmarkEnd w:id="118"/>
-    <w:bookmarkStart w:id="133" w:name="X7d577e1026a98d88b87af03225c2d7813854c3a"/>
+    <w:bookmarkStart w:id="145" w:name="X7d577e1026a98d88b87af03225c2d7813854c3a"/>
     <w:p>
       <w:pPr>
         <w:pStyle w:val="Heading3"/>
@@ -22865,7 +22974,21 @@
         <w:pStyle w:val="BodyText"/>
       </w:pPr>
       <w:r>
-        <w:t xml:space="preserve">The power curves across sample size show how the probability of rejecting the misspecified model evolves as $ N $ increases. This is consistent with the general theory of power in SEM, according to which power increases as the overlap between the null and alternative sampling distributions decreases, and that separation is strengthened by larger samples and clearer model discrepancy</w:t>
+        <w:t xml:space="preserve">The power curves across sample size show how the probability of rejecting the misspecified model evolves as</w:t>
+      </w:r>
+      <w:r>
+        <w:t xml:space="preserve"> </w:t>
+      </w:r>
+      <m:oMath>
+        <m:r>
+          <m:t>N</m:t>
+        </m:r>
+      </m:oMath>
+      <w:r>
+        <w:t xml:space="preserve"> </w:t>
+      </w:r>
+      <w:r>
+        <w:t xml:space="preserve">increases. This is consistent with the general theory of power in SEM, according to which power increases as the overlap between the null and alternative sampling distributions decreases, and that separation is strengthened by larger samples and clearer model discrepancy</w:t>
       </w:r>
       <w:r>
         <w:t xml:space="preserve"> </w:t>
@@ -22894,7 +23017,21 @@
         <w:t xml:space="preserve">simsem</w:t>
       </w:r>
       <w:r>
-        <w:t xml:space="preserve">, these curves can be displayed either as raw empirical patterns or as smoothed functions based on logistic regression when sample size varies across replications. The smoothed representation is useful because it summarizes the relation between the reject/retain decision and $ N $ into a continuous power function, whereas the unsmoothed version helps inspect the empirical fit-index distributions more directly</w:t>
+        <w:t xml:space="preserve">, these curves can be displayed either as raw empirical patterns or as smoothed functions based on logistic regression when sample size varies across replications. The smoothed representation is useful because it summarizes the relation between the reject/retain decision and</w:t>
+      </w:r>
+      <w:r>
+        <w:t xml:space="preserve"> </w:t>
+      </w:r>
+      <m:oMath>
+        <m:r>
+          <m:t>N</m:t>
+        </m:r>
+      </m:oMath>
+      <w:r>
+        <w:t xml:space="preserve"> </w:t>
+      </w:r>
+      <w:r>
+        <w:t xml:space="preserve">into a continuous power function, whereas the unsmoothed version helps inspect the empirical fit-index distributions more directly</w:t>
       </w:r>
       <w:r>
         <w:t xml:space="preserve"> </w:t>
@@ -23525,7 +23662,27 @@
         </m:r>
       </m:oMath>
       <w:r>
-        <w:t xml:space="preserve">, the estimated power values were $ &gt; .80 $ for all four indices, but they differed substantially in magnitude. RMSEA and SRMR showed very high power, with values close to</w:t>
+        <w:t xml:space="preserve">, the estimated power values were</w:t>
+      </w:r>
+      <w:r>
+        <w:t xml:space="preserve"> </w:t>
+      </w:r>
+      <m:oMath>
+        <m:r>
+          <m:rPr>
+            <m:sty m:val="p"/>
+          </m:rPr>
+          <m:t>&gt;</m:t>
+        </m:r>
+        <m:r>
+          <m:t>.80</m:t>
+        </m:r>
+      </m:oMath>
+      <w:r>
+        <w:t xml:space="preserve"> </w:t>
+      </w:r>
+      <w:r>
+        <w:t xml:space="preserve">for all four indices, but they differed substantially in magnitude. RMSEA and SRMR showed very high power, with values close to</w:t>
       </w:r>
       <w:r>
         <w:t xml:space="preserve"> </w:t>
@@ -23661,24 +23818,13 @@
       </w:r>
     </w:p>
     <w:bookmarkEnd w:id="131"/>
-    <w:bookmarkStart w:id="132" w:name="optimistic-model-2"/>
+    <w:bookmarkStart w:id="144" w:name="optimistic-model-2"/>
     <w:p>
       <w:pPr>
         <w:pStyle w:val="Heading4"/>
       </w:pPr>
       <w:r>
         <w:t xml:space="preserve">5.1.2 Optimistic model</w:t>
-      </w:r>
-    </w:p>
-    <w:bookmarkEnd w:id="132"/>
-    <w:bookmarkEnd w:id="133"/>
-    <w:bookmarkStart w:id="146" w:name="conceptual-background"/>
-    <w:p>
-      <w:pPr>
-        <w:pStyle w:val="Heading3"/>
-      </w:pPr>
-      <w:r>
-        <w:t xml:space="preserve">5.2 Conceptual background</w:t>
       </w:r>
     </w:p>
     <w:p>
@@ -23765,7 +23911,7 @@
       <w:tr>
         <w:tc>
           <w:tcPr/>
-          <w:bookmarkStart w:id="137" w:name="fig-power-curve-opt"/>
+          <w:bookmarkStart w:id="135" w:name="fig-power-curve-opt"/>
           <w:p>
             <w:pPr>
               <w:pStyle w:val="Compact"/>
@@ -23776,18 +23922,18 @@
                 <wp:inline>
                   <wp:extent cx="5334000" cy="3333749"/>
                   <wp:effectExtent b="0" l="0" r="0" t="0"/>
-                  <wp:docPr descr="" title="" id="135" name="Picture"/>
+                  <wp:docPr descr="" title="" id="133" name="Picture"/>
                   <a:graphic>
                     <a:graphicData uri="http://schemas.openxmlformats.org/drawingml/2006/picture">
                       <pic:pic>
                         <pic:nvPicPr>
-                          <pic:cNvPr descr="index_files/figure-docx/Scripts-AnalysisScripts-03_simulation_ideal-fig-power-curve-opt-output-1.png" id="136" name="Picture"/>
+                          <pic:cNvPr descr="index_files/figure-docx/Scripts-AnalysisScripts-03_simulation_ideal-fig-power-curve-opt-output-1.png" id="134" name="Picture"/>
                           <pic:cNvPicPr>
                             <a:picLocks noChangeArrowheads="1" noChangeAspect="1"/>
                           </pic:cNvPicPr>
                         </pic:nvPicPr>
                         <pic:blipFill>
-                          <a:blip r:embed="rId134"/>
+                          <a:blip r:embed="rId132"/>
                           <a:stretch>
                             <a:fillRect/>
                           </a:stretch>
@@ -23827,7 +23973,7 @@
               <w:t xml:space="preserve">Figure 13: Power curves for fit indices using the optimal population model.</w:t>
             </w:r>
           </w:p>
-          <w:bookmarkEnd w:id="137"/>
+          <w:bookmarkEnd w:id="135"/>
         </w:tc>
       </w:tr>
     </w:tbl>
@@ -23847,7 +23993,7 @@
         </w:rPr>
         <w:t xml:space="preserve"> </w:t>
       </w:r>
-      <w:hyperlink r:id="rId138">
+      <w:hyperlink r:id="rId136">
         <w:r>
           <w:rPr>
             <w:rStyle w:val="Hyperlink"/>
@@ -23870,7 +24016,7 @@
       <w:tr>
         <w:tc>
           <w:tcPr/>
-          <w:bookmarkStart w:id="142" w:name="fig-fit-curve-opt"/>
+          <w:bookmarkStart w:id="140" w:name="fig-fit-curve-opt"/>
           <w:p>
             <w:pPr>
               <w:pStyle w:val="Compact"/>
@@ -23881,18 +24027,18 @@
                 <wp:inline>
                   <wp:extent cx="5334000" cy="3333749"/>
                   <wp:effectExtent b="0" l="0" r="0" t="0"/>
-                  <wp:docPr descr="" title="" id="140" name="Picture"/>
+                  <wp:docPr descr="" title="" id="138" name="Picture"/>
                   <a:graphic>
                     <a:graphicData uri="http://schemas.openxmlformats.org/drawingml/2006/picture">
                       <pic:pic>
                         <pic:nvPicPr>
-                          <pic:cNvPr descr="index_files/figure-docx/Scripts-AnalysisScripts-03_simulation_ideal-fig-fit-curve-opt-output-1.png" id="141" name="Picture"/>
+                          <pic:cNvPr descr="index_files/figure-docx/Scripts-AnalysisScripts-03_simulation_ideal-fig-fit-curve-opt-output-1.png" id="139" name="Picture"/>
                           <pic:cNvPicPr>
                             <a:picLocks noChangeArrowheads="1" noChangeAspect="1"/>
                           </pic:cNvPicPr>
                         </pic:nvPicPr>
                         <pic:blipFill>
-                          <a:blip r:embed="rId139"/>
+                          <a:blip r:embed="rId137"/>
                           <a:stretch>
                             <a:fillRect/>
                           </a:stretch>
@@ -23932,7 +24078,7 @@
               <w:t xml:space="preserve">Figure 14: Power curves for fit indices using the optimal population model without logistic smoothing.</w:t>
             </w:r>
           </w:p>
-          <w:bookmarkEnd w:id="142"/>
+          <w:bookmarkEnd w:id="140"/>
         </w:tc>
       </w:tr>
     </w:tbl>
@@ -23952,7 +24098,7 @@
         </w:rPr>
         <w:t xml:space="preserve"> </w:t>
       </w:r>
-      <w:hyperlink r:id="rId143">
+      <w:hyperlink r:id="rId141">
         <w:r>
           <w:rPr>
             <w:rStyle w:val="Hyperlink"/>
@@ -24085,7 +24231,7 @@
       <w:tr>
         <w:tc>
           <w:tcPr/>
-          <w:bookmarkStart w:id="144" w:name="tbl-power-cutoff-opt"/>
+          <w:bookmarkStart w:id="142" w:name="tbl-power-cutoff-opt"/>
           <w:p>
             <w:pPr>
               <w:jc w:val="center"/>
@@ -24310,7 +24456,7 @@
               </w:tc>
             </w:tr>
           </w:tbl>
-          <w:bookmarkEnd w:id="144"/>
+          <w:bookmarkEnd w:id="142"/>
           <w:p/>
         </w:tc>
       </w:tr>
@@ -24331,7 +24477,7 @@
         </w:rPr>
         <w:t xml:space="preserve"> </w:t>
       </w:r>
-      <w:hyperlink r:id="rId145">
+      <w:hyperlink r:id="rId143">
         <w:r>
           <w:rPr>
             <w:rStyle w:val="Hyperlink"/>
@@ -24366,7 +24512,27 @@
         </m:r>
       </m:oMath>
       <w:r>
-        <w:t xml:space="preserve">, the estimated power values are $ &gt; .80 $ for all four indices, but they differ in magnitude. The power values at this sample size is show in</w:t>
+        <w:t xml:space="preserve">, the estimated power values are</w:t>
+      </w:r>
+      <w:r>
+        <w:t xml:space="preserve"> </w:t>
+      </w:r>
+      <m:oMath>
+        <m:r>
+          <m:rPr>
+            <m:sty m:val="p"/>
+          </m:rPr>
+          <m:t>&gt;</m:t>
+        </m:r>
+        <m:r>
+          <m:t>.80</m:t>
+        </m:r>
+      </m:oMath>
+      <w:r>
+        <w:t xml:space="preserve"> </w:t>
+      </w:r>
+      <w:r>
+        <w:t xml:space="preserve">for all four indices, but they differ in magnitude. The power values at this sample size is show in</w:t>
       </w:r>
       <w:r>
         <w:t xml:space="preserve"> </w:t>
@@ -24456,9 +24622,10 @@
         <w:t xml:space="preserve">. In contrast, CFI and TLI are the more demanding indices in this setting, because their power at the same sample size is adequate but still comparatively limited.</w:t>
       </w:r>
     </w:p>
+    <w:bookmarkEnd w:id="144"/>
+    <w:bookmarkEnd w:id="145"/>
     <w:bookmarkEnd w:id="146"/>
-    <w:bookmarkEnd w:id="147"/>
-    <w:bookmarkStart w:id="152" w:name="sec-sim-robust"/>
+    <w:bookmarkStart w:id="174" w:name="sec-sim-robust"/>
     <w:p>
       <w:pPr>
         <w:pStyle w:val="Heading2"/>
@@ -24472,16 +24639,53 @@
         <w:pStyle w:val="FirstParagraph"/>
       </w:pPr>
       <w:r>
-        <w:t xml:space="preserve">Most applied survey data violate the ideal assumptions. Simulating how analytical robustness deteriorates helps us adjust the planned sample sizes to offset the expected penalty.</w:t>
-      </w:r>
-    </w:p>
-    <w:bookmarkStart w:id="148" w:name="sec-nonnormal"/>
+        <w:t xml:space="preserve">Power analysis in structural equation modeling should be framed as a design-stage procedure that connects substantive expectations, model specification, and data conditions to the probability of obtaining informative statistical tests, rather than as a mechanical search for a single “minimum</w:t>
+      </w:r>
+      <w:r>
+        <w:t xml:space="preserve"> </w:t>
+      </w:r>
+      <m:oMath>
+        <m:r>
+          <m:t>N</m:t>
+        </m:r>
+      </m:oMath>
+      <w:r>
+        <w:t xml:space="preserve">” rule</w:t>
+      </w:r>
+      <w:r>
+        <w:t xml:space="preserve"> </w:t>
+      </w:r>
+      <w:r>
+        <w:t xml:space="preserve">(Feng &amp; Hancock, 2023; Wang, 2023)</w:t>
+      </w:r>
+      <w:r>
+        <w:t xml:space="preserve">.</w:t>
+      </w:r>
+    </w:p>
+    <w:p>
+      <w:pPr>
+        <w:pStyle w:val="BodyText"/>
+      </w:pPr>
+      <w:r>
+        <w:t xml:space="preserve">SEM power analysis is strongest when it is anchored in a plausible population-generating mechanism rather than in generic rules of thumb or model-free calculators borrowed from simpler analyses</w:t>
+      </w:r>
+      <w:r>
+        <w:t xml:space="preserve"> </w:t>
+      </w:r>
+      <w:r>
+        <w:t xml:space="preserve">(Feng &amp; Hancock, 2023; Kyriazos, 2018)</w:t>
+      </w:r>
+      <w:r>
+        <w:t xml:space="preserve">.</w:t>
+      </w:r>
+    </w:p>
+    <w:bookmarkStart w:id="159" w:name="sec-missing"/>
     <w:p>
       <w:pPr>
         <w:pStyle w:val="Heading3"/>
       </w:pPr>
       <w:r>
-        <w:t xml:space="preserve">6.1 Non-Normality</w:t>
+        <w:t xml:space="preserve">6.1 Missing Data (MCAR)</w:t>
       </w:r>
     </w:p>
     <w:p>
@@ -24489,201 +24693,177 @@
         <w:pStyle w:val="FirstParagraph"/>
       </w:pPr>
       <w:r>
-        <w:t xml:space="preserve">Applying continuous but non-normal (e.g., highly skewed or kurtotic) generation exposes the vulnerability of unadjusted normal-theory ML tests, emphasizing the necessity of robust estimators (e.g., MLR).</w:t>
-      </w:r>
-    </w:p>
-    <w:bookmarkEnd w:id="148"/>
-    <w:bookmarkStart w:id="149" w:name="sec-missing"/>
-    <w:p>
-      <w:pPr>
-        <w:pStyle w:val="Heading3"/>
-      </w:pPr>
-      <w:r>
-        <w:t xml:space="preserve">6.2 Missing Data (MCAR)</w:t>
-      </w:r>
-    </w:p>
-    <w:p>
-      <w:pPr>
-        <w:pStyle w:val="FirstParagraph"/>
-      </w:pPr>
-      <w:r>
-        <w:t xml:space="preserve">Missing data effectively shrinks</w:t>
-      </w:r>
-      <w:r>
-        <w:t xml:space="preserve"> </w:t>
-      </w:r>
-      <m:oMath>
-        <m:r>
-          <m:t>N</m:t>
-        </m:r>
-      </m:oMath>
-      <w:r>
-        <w:t xml:space="preserve"> </w:t>
-      </w:r>
-      <w:r>
-        <w:t xml:space="preserve">through a loss of information, meaning empirical sample sizes must often be adjusted proportionately. This simulation evaluates the explicit power penalty of</w:t>
-      </w:r>
-      <w:r>
-        <w:t xml:space="preserve"> </w:t>
-      </w:r>
-      <m:oMath>
-        <m:r>
-          <m:t>10</m:t>
-        </m:r>
-        <m:r>
-          <m:rPr>
-            <m:sty m:val="p"/>
-          </m:rPr>
-          <m:t>%</m:t>
-        </m:r>
-      </m:oMath>
-      <w:r>
-        <w:t xml:space="preserve"> </w:t>
-      </w:r>
-      <w:r>
-        <w:t xml:space="preserve">Missing Completely at Random strings.</w:t>
-      </w:r>
-    </w:p>
-    <w:bookmarkEnd w:id="149"/>
-    <w:bookmarkStart w:id="150" w:name="sec-sensitivity"/>
-    <w:p>
-      <w:pPr>
-        <w:pStyle w:val="Heading3"/>
-      </w:pPr>
-      <w:r>
-        <w:t xml:space="preserve">6.3 Sensitivity Across Population Models</w:t>
-      </w:r>
-    </w:p>
-    <w:p>
-      <w:pPr>
-        <w:pStyle w:val="FirstParagraph"/>
-      </w:pPr>
-      <w:r>
-        <w:t xml:space="preserve">A robust power analysis examines boundaries. How drastically does necessary</w:t>
-      </w:r>
-      <w:r>
-        <w:t xml:space="preserve"> </w:t>
-      </w:r>
-      <m:oMath>
-        <m:r>
-          <m:t>N</m:t>
-        </m:r>
-      </m:oMath>
-      <w:r>
-        <w:t xml:space="preserve"> </w:t>
-      </w:r>
-      <w:r>
-        <w:t xml:space="preserve">shift when our assumption about structural quality is overly naive, or overly optimistic?</w:t>
-      </w:r>
-    </w:p>
-    <w:bookmarkEnd w:id="150"/>
-    <w:bookmarkStart w:id="151" w:name="sec-scenarios-comparison"/>
-    <w:p>
-      <w:pPr>
-        <w:pStyle w:val="Heading3"/>
-      </w:pPr>
-      <w:r>
-        <w:t xml:space="preserve">6.4 Comparison</w:t>
-      </w:r>
-    </w:p>
-    <w:bookmarkEnd w:id="151"/>
-    <w:bookmarkEnd w:id="152"/>
-    <w:bookmarkStart w:id="153" w:name="sec-null-vs-alt"/>
-    <w:p>
-      <w:pPr>
-        <w:pStyle w:val="Heading2"/>
-      </w:pPr>
-      <w:r>
-        <w:t xml:space="preserve">7 Population Model vs. Empirical Model</w:t>
-      </w:r>
-    </w:p>
-    <w:p>
-      <w:pPr>
-        <w:pStyle w:val="FirstParagraph"/>
-      </w:pPr>
-      <w:r>
-        <w:t xml:space="preserve">Consider an epistemological question driving CFA: can we statistically distinguish the theorized population structure from an empirically estimated model with trivial incidental misspecifications that are ubiquitous in real-life sample covariance matrices? In this section, we compare empirical power distributions generated under a</w:t>
-      </w:r>
-      <w:r>
-        <w:t xml:space="preserve"> </w:t>
-      </w:r>
-      <w:r>
-        <w:t xml:space="preserve">“Null”</w:t>
-      </w:r>
-      <w:r>
-        <w:t xml:space="preserve"> </w:t>
-      </w:r>
-      <w:r>
-        <w:t xml:space="preserve">(empirical sample parameters representing noise) and an</w:t>
-      </w:r>
-      <w:r>
-        <w:t xml:space="preserve"> </w:t>
-      </w:r>
-      <w:r>
-        <w:t xml:space="preserve">“Alternative”</w:t>
-      </w:r>
-      <w:r>
-        <w:t xml:space="preserve"> </w:t>
-      </w:r>
-      <w:r>
-        <w:t xml:space="preserve">(our clean meta-analytic population model).</w:t>
-      </w:r>
-    </w:p>
-    <w:bookmarkEnd w:id="153"/>
-    <w:bookmarkStart w:id="154" w:name="sec-posthoc-analytical"/>
-    <w:p>
-      <w:pPr>
-        <w:pStyle w:val="Heading2"/>
-      </w:pPr>
-      <w:r>
-        <w:t xml:space="preserve">8 Post Hoc: Achieved Power</w:t>
-      </w:r>
-    </w:p>
-    <w:p>
-      <w:pPr>
-        <w:pStyle w:val="FirstParagraph"/>
-      </w:pPr>
-      <w:r>
-        <w:t xml:space="preserve">For the empirical WHOQOL-BREF dataset,</w:t>
-      </w:r>
-      <w:r>
-        <w:t xml:space="preserve"> </w:t>
-      </w:r>
-      <m:oMath>
-        <m:r>
-          <m:t>N</m:t>
-        </m:r>
-        <m:r>
-          <m:rPr>
-            <m:sty m:val="p"/>
-          </m:rPr>
-          <m:t>=</m:t>
-        </m:r>
-        <m:r>
-          <m:t>1</m:t>
-        </m:r>
-        <m:r>
-          <m:rPr>
-            <m:sty m:val="p"/>
-          </m:rPr>
-          <m:t>,</m:t>
-        </m:r>
-        <m:r>
-          <m:t>047</m:t>
-        </m:r>
-      </m:oMath>
-      <w:r>
-        <w:t xml:space="preserve">. What is our achieved power if true RMSEA is 0.05?</w:t>
-      </w:r>
-    </w:p>
-    <w:bookmarkEnd w:id="154"/>
-    <w:bookmarkStart w:id="155" w:name="sec-synthesis"/>
-    <w:p>
-      <w:pPr>
-        <w:pStyle w:val="Heading2"/>
-      </w:pPr>
-      <w:r>
-        <w:t xml:space="preserve">9 When to Use What: Analytical vs. Simulation</w:t>
+        <w:t xml:space="preserve">Missing data must be treated as part of the design problem, not as a secondary complication to be handled only after estimation, because missingness reduces available information and therefore generally lowers estimation efficiency and statistical power</w:t>
+      </w:r>
+      <w:r>
+        <w:t xml:space="preserve"> </w:t>
+      </w:r>
+      <w:r>
+        <w:t xml:space="preserve">(Feng &amp; Hancock, 2023; Jak et al., 2021)</w:t>
+      </w:r>
+      <w:r>
+        <w:t xml:space="preserve">.</w:t>
+      </w:r>
+    </w:p>
+    <w:p>
+      <w:pPr>
+        <w:pStyle w:val="BodyText"/>
+      </w:pPr>
+      <w:r>
+        <w:t xml:space="preserve">From this perspective, the relevant question is not only how many cases are planned, but how much usable information remains under the anticipated missing-data process</w:t>
+      </w:r>
+      <w:r>
+        <w:t xml:space="preserve"> </w:t>
+      </w:r>
+      <w:r>
+        <w:t xml:space="preserve">(Feng &amp; Hancock, 2023)</w:t>
+      </w:r>
+      <w:r>
+        <w:t xml:space="preserve">.</w:t>
+      </w:r>
+    </w:p>
+    <w:p>
+      <w:pPr>
+        <w:pStyle w:val="BodyText"/>
+      </w:pPr>
+      <w:r>
+        <w:t xml:space="preserve">This is one reason Monte Carlo power analysis is especially valuable in SEM with missing data: it allows the analyst to generate data under a prespecified population model, impose realistic missingness mechanisms such as MCAR or MAR, fit the intended analysis model, and estimate power empirically under the same conditions expected in practice</w:t>
+      </w:r>
+      <w:r>
+        <w:t xml:space="preserve"> </w:t>
+      </w:r>
+      <w:r>
+        <w:t xml:space="preserve">(Feng &amp; Hancock, 2023; Moshagen &amp; Bader, 2024)</w:t>
+      </w:r>
+      <w:r>
+        <w:t xml:space="preserve">.</w:t>
+      </w:r>
+    </w:p>
+    <w:p>
+      <w:pPr>
+        <w:pStyle w:val="BodyText"/>
+      </w:pPr>
+      <w:r>
+        <w:t xml:space="preserve">Simulation-based power analysis is also advantageous when assumptions underlying purely analytical solutions become less credible, such as in the presence of incomplete data, non-normality, or more complex model structures</w:t>
+      </w:r>
+      <w:r>
+        <w:t xml:space="preserve"> </w:t>
+      </w:r>
+      <w:r>
+        <w:t xml:space="preserve">(Feng &amp; Hancock, 2023; Moshagen &amp; Bader, 2024; Wang, 2023)</w:t>
+      </w:r>
+      <w:r>
+        <w:t xml:space="preserve">.</w:t>
+      </w:r>
+    </w:p>
+    <w:p>
+      <w:pPr>
+        <w:pStyle w:val="BodyText"/>
+      </w:pPr>
+      <w:r>
+        <w:t xml:space="preserve">In this sense, the Monte Carlo approach is not merely a computational alternative, but a way to align sample size planning with the actual data-generating conditions anticipated for the study</w:t>
+      </w:r>
+      <w:r>
+        <w:t xml:space="preserve"> </w:t>
+      </w:r>
+      <w:r>
+        <w:t xml:space="preserve">(Moshagen &amp; Bader, 2024; Wang, 2023)</w:t>
+      </w:r>
+      <w:r>
+        <w:t xml:space="preserve">.</w:t>
+      </w:r>
+    </w:p>
+    <w:p>
+      <w:pPr>
+        <w:pStyle w:val="BodyText"/>
+      </w:pPr>
+      <w:r>
+        <w:t xml:space="preserve">Conceptually, the purpose of the analysis is therefore twofold: first, to ensure enough sensitivity to test the focal theoretical relations, and second, to ensure enough sensitivity to evaluate whether the overall model remains substantively interpretable under the planned conditions</w:t>
+      </w:r>
+      <w:r>
+        <w:t xml:space="preserve"> </w:t>
+      </w:r>
+      <w:r>
+        <w:t xml:space="preserve">(Feng &amp; Hancock, 2023; Wang, 2023)</w:t>
+      </w:r>
+      <w:r>
+        <w:t xml:space="preserve">.</w:t>
+      </w:r>
+    </w:p>
+    <w:p>
+      <w:pPr>
+        <w:pStyle w:val="BodyText"/>
+      </w:pPr>
+      <w:r>
+        <w:t xml:space="preserve">When missing data are expected, this dual objective becomes even more important, because power for parameter detection and power for fit evaluation may deteriorate at different rates as information is lost</w:t>
+      </w:r>
+      <w:r>
+        <w:t xml:space="preserve"> </w:t>
+      </w:r>
+      <w:r>
+        <w:t xml:space="preserve">(Feng &amp; Hancock, 2023; Wang, 2023)</w:t>
+      </w:r>
+      <w:r>
+        <w:t xml:space="preserve">.</w:t>
+      </w:r>
+    </w:p>
+    <w:p>
+      <w:pPr>
+        <w:pStyle w:val="BodyText"/>
+      </w:pPr>
+      <w:r>
+        <w:t xml:space="preserve">A well-justified SEM power analysis thus rests on explicit assumptions about the population model, the magnitude of focal effects, the measurement structure, the estimation framework, and the expected missing-data mechanism</w:t>
+      </w:r>
+      <w:r>
+        <w:t xml:space="preserve"> </w:t>
+      </w:r>
+      <w:r>
+        <w:t xml:space="preserve">(Jak et al., 2021; Moshagen &amp; Bader, 2024; Wang, 2023)</w:t>
+      </w:r>
+      <w:r>
+        <w:t xml:space="preserve">.</w:t>
+      </w:r>
+    </w:p>
+    <w:p>
+      <w:pPr>
+        <w:pStyle w:val="BodyText"/>
+      </w:pPr>
+      <w:r>
+        <w:t xml:space="preserve">Under this logic, the reported power results should be understood as conditional on a theoretically motivated scenario, not as universal guarantees, which is precisely why transparent documentation of assumptions is essential in reproducible SEM workflows</w:t>
+      </w:r>
+      <w:r>
+        <w:t xml:space="preserve"> </w:t>
+      </w:r>
+      <w:r>
+        <w:t xml:space="preserve">(Feng &amp; Hancock, 2023; Moshagen &amp; Bader, 2024)</w:t>
+      </w:r>
+      <w:r>
+        <w:t xml:space="preserve">.</w:t>
+      </w:r>
+    </w:p>
+    <w:p>
+      <w:pPr>
+        <w:pStyle w:val="BodyText"/>
+      </w:pPr>
+      <w:r>
+        <w:t xml:space="preserve">The</w:t>
+      </w:r>
+      <w:r>
+        <w:t xml:space="preserve"> </w:t>
+      </w:r>
+      <w:hyperlink w:anchor="fig-power-curve-missing">
+        <w:r>
+          <w:rPr>
+            <w:rStyle w:val="Hyperlink"/>
+          </w:rPr>
+          <w:t xml:space="preserve">Figure 15</w:t>
+        </w:r>
+      </w:hyperlink>
+      <w:r>
+        <w:t xml:space="preserve"> </w:t>
+      </w:r>
+      <w:r>
+        <w:t xml:space="preserve">shows the power curves for the four fit indices under the 10% missing MCAR missing-data scenario. The curves indicate that power is generally lower across the sample-size range compared to the ideal condition, which is expected due to the loss of information caused by missing data.</w:t>
       </w:r>
     </w:p>
     <w:tbl>
@@ -24691,354 +24871,1682 @@
         <w:tblStyle w:val="Table"/>
         <w:tblW w:type="pct" w:w="5000"/>
         <w:tblLayout w:type="fixed"/>
-        <w:tblLook w:firstRow="1" w:lastRow="0" w:firstColumn="0" w:lastColumn="0" w:noHBand="0" w:noVBand="0" w:val="0020"/>
+        <w:tblLook w:firstRow="0" w:lastRow="0" w:firstColumn="0" w:lastColumn="0" w:noHBand="0" w:noVBand="0" w:val="0000"/>
       </w:tblPr>
       <w:tblGrid>
-        <w:gridCol w:w="2640"/>
-        <w:gridCol w:w="2640"/>
-        <w:gridCol w:w="2640"/>
+        <w:gridCol w:w="7920"/>
       </w:tblGrid>
       <w:tr>
-        <w:trPr>
-          <w:tblHeader w:val="on"/>
-        </w:trPr>
         <w:tc>
           <w:tcPr/>
+          <w:bookmarkStart w:id="150" w:name="fig-power-curve-missing"/>
           <w:p>
             <w:pPr>
               <w:pStyle w:val="Compact"/>
-              <w:jc w:val="left"/>
+              <w:jc w:val="center"/>
             </w:pPr>
             <w:r>
-              <w:t xml:space="preserve">Feature</w:t>
+              <w:drawing>
+                <wp:inline>
+                  <wp:extent cx="5334000" cy="3333749"/>
+                  <wp:effectExtent b="0" l="0" r="0" t="0"/>
+                  <wp:docPr descr="" title="" id="148" name="Picture"/>
+                  <a:graphic>
+                    <a:graphicData uri="http://schemas.openxmlformats.org/drawingml/2006/picture">
+                      <pic:pic>
+                        <pic:nvPicPr>
+                          <pic:cNvPr descr="index_files/figure-docx/Scripts-AnalysisScripts-04_simulation_robust-fig-power-curve-missing-output-1.png" id="149" name="Picture"/>
+                          <pic:cNvPicPr>
+                            <a:picLocks noChangeArrowheads="1" noChangeAspect="1"/>
+                          </pic:cNvPicPr>
+                        </pic:nvPicPr>
+                        <pic:blipFill>
+                          <a:blip r:embed="rId147"/>
+                          <a:stretch>
+                            <a:fillRect/>
+                          </a:stretch>
+                        </pic:blipFill>
+                        <pic:spPr bwMode="auto">
+                          <a:xfrm>
+                            <a:off x="0" y="0"/>
+                            <a:ext cx="5334000" cy="3333749"/>
+                          </a:xfrm>
+                          <a:prstGeom prst="rect">
+                            <a:avLst/>
+                          </a:prstGeom>
+                          <a:noFill/>
+                          <a:ln w="9525">
+                            <a:noFill/>
+                            <a:headEnd/>
+                            <a:tailEnd/>
+                          </a:ln>
+                        </pic:spPr>
+                      </pic:pic>
+                    </a:graphicData>
+                  </a:graphic>
+                </wp:inline>
+              </w:drawing>
             </w:r>
           </w:p>
+          <w:p>
+            <w:pPr>
+              <w:jc w:val="center"/>
+            </w:pPr>
+            <w:pPr>
+              <w:jc w:val="left"/>
+              <w:spacing w:before="200"/>
+              <w:pStyle w:val="ImageCaption"/>
+            </w:pPr>
+            <w:r>
+              <w:t xml:space="preserve">Figure 15: Power curves for fit indices under missing data conditions.</w:t>
+            </w:r>
+          </w:p>
+          <w:bookmarkEnd w:id="150"/>
         </w:tc>
+      </w:tr>
+    </w:tbl>
+    <w:p>
+      <w:pPr>
+        <w:pStyle w:val="BodyText"/>
+      </w:pPr>
+      <w:r>
+        <w:rPr>
+          <w:vertAlign w:val="subscript"/>
+        </w:rPr>
+        <w:t xml:space="preserve">Source:</w:t>
+      </w:r>
+      <w:r>
+        <w:rPr>
+          <w:vertAlign w:val="subscript"/>
+        </w:rPr>
+        <w:t xml:space="preserve"> </w:t>
+      </w:r>
+      <w:hyperlink r:id="rId151">
+        <w:r>
+          <w:rPr>
+            <w:rStyle w:val="Hyperlink"/>
+            <w:vertAlign w:val="subscript"/>
+          </w:rPr>
+          <w:t xml:space="preserve">Simulation — Realistic Scenarios</w:t>
+        </w:r>
+      </w:hyperlink>
+    </w:p>
+    <w:p>
+      <w:pPr>
+        <w:pStyle w:val="BodyText"/>
+      </w:pPr>
+      <w:r>
+        <w:t xml:space="preserve">The</w:t>
+      </w:r>
+      <w:r>
+        <w:t xml:space="preserve"> </w:t>
+      </w:r>
+      <w:hyperlink w:anchor="fig-fit-curve-missing">
+        <w:r>
+          <w:rPr>
+            <w:rStyle w:val="Hyperlink"/>
+          </w:rPr>
+          <w:t xml:space="preserve">Figure 16</w:t>
+        </w:r>
+      </w:hyperlink>
+      <w:r>
+        <w:t xml:space="preserve"> </w:t>
+      </w:r>
+      <w:r>
+        <w:t xml:space="preserve">shows the empirical distributions of the fit indices under the reference and alternative conditions with 10% MCAR missing data. The separation between the two conditions is less pronounced than in the ideal scenario, especially for CFI and TLI, which show more overlap in their distributions at smaller and intermediate sample sizes.</w:t>
+      </w:r>
+    </w:p>
+    <w:tbl>
+      <w:tblPr>
+        <w:tblStyle w:val="Table"/>
+        <w:tblW w:type="pct" w:w="5000"/>
+        <w:tblLayout w:type="fixed"/>
+        <w:tblLook w:firstRow="0" w:lastRow="0" w:firstColumn="0" w:lastColumn="0" w:noHBand="0" w:noVBand="0" w:val="0000"/>
+      </w:tblPr>
+      <w:tblGrid>
+        <w:gridCol w:w="7920"/>
+      </w:tblGrid>
+      <w:tr>
         <w:tc>
           <w:tcPr/>
+          <w:bookmarkStart w:id="155" w:name="fig-fit-curve-missing"/>
           <w:p>
             <w:pPr>
               <w:pStyle w:val="Compact"/>
-              <w:jc w:val="left"/>
+              <w:jc w:val="center"/>
             </w:pPr>
             <w:r>
-              <w:t xml:space="preserve">Analytical (</w:t>
-            </w:r>
-            <w:r>
-              <w:rPr>
-                <w:rStyle w:val="VerbatimChar"/>
-              </w:rPr>
-              <w:t xml:space="preserve">semPower</w:t>
-            </w:r>
-            <w:r>
-              <w:t xml:space="preserve">/</w:t>
-            </w:r>
-            <w:r>
-              <w:rPr>
-                <w:rStyle w:val="VerbatimChar"/>
-              </w:rPr>
-              <w:t xml:space="preserve">semTools</w:t>
-            </w:r>
-            <w:r>
-              <w:t xml:space="preserve">)</w:t>
+              <w:drawing>
+                <wp:inline>
+                  <wp:extent cx="5334000" cy="3333749"/>
+                  <wp:effectExtent b="0" l="0" r="0" t="0"/>
+                  <wp:docPr descr="" title="" id="153" name="Picture"/>
+                  <a:graphic>
+                    <a:graphicData uri="http://schemas.openxmlformats.org/drawingml/2006/picture">
+                      <pic:pic>
+                        <pic:nvPicPr>
+                          <pic:cNvPr descr="index_files/figure-docx/Scripts-AnalysisScripts-04_simulation_robust-fig-fit-curve-missing-output-1.png" id="154" name="Picture"/>
+                          <pic:cNvPicPr>
+                            <a:picLocks noChangeArrowheads="1" noChangeAspect="1"/>
+                          </pic:cNvPicPr>
+                        </pic:nvPicPr>
+                        <pic:blipFill>
+                          <a:blip r:embed="rId152"/>
+                          <a:stretch>
+                            <a:fillRect/>
+                          </a:stretch>
+                        </pic:blipFill>
+                        <pic:spPr bwMode="auto">
+                          <a:xfrm>
+                            <a:off x="0" y="0"/>
+                            <a:ext cx="5334000" cy="3333749"/>
+                          </a:xfrm>
+                          <a:prstGeom prst="rect">
+                            <a:avLst/>
+                          </a:prstGeom>
+                          <a:noFill/>
+                          <a:ln w="9525">
+                            <a:noFill/>
+                            <a:headEnd/>
+                            <a:tailEnd/>
+                          </a:ln>
+                        </pic:spPr>
+                      </pic:pic>
+                    </a:graphicData>
+                  </a:graphic>
+                </wp:inline>
+              </w:drawing>
             </w:r>
           </w:p>
+          <w:p>
+            <w:pPr>
+              <w:jc w:val="center"/>
+            </w:pPr>
+            <w:pPr>
+              <w:jc w:val="left"/>
+              <w:spacing w:before="200"/>
+              <w:pStyle w:val="ImageCaption"/>
+            </w:pPr>
+            <w:r>
+              <w:t xml:space="preserve">Figure 16: Power curves for fit indices under missing data conditions without logistic smoothing.</w:t>
+            </w:r>
+          </w:p>
+          <w:bookmarkEnd w:id="155"/>
         </w:tc>
+      </w:tr>
+    </w:tbl>
+    <w:p>
+      <w:pPr>
+        <w:pStyle w:val="BodyText"/>
+      </w:pPr>
+      <w:r>
+        <w:rPr>
+          <w:vertAlign w:val="subscript"/>
+        </w:rPr>
+        <w:t xml:space="preserve">Source:</w:t>
+      </w:r>
+      <w:r>
+        <w:rPr>
+          <w:vertAlign w:val="subscript"/>
+        </w:rPr>
+        <w:t xml:space="preserve"> </w:t>
+      </w:r>
+      <w:hyperlink r:id="rId156">
+        <w:r>
+          <w:rPr>
+            <w:rStyle w:val="Hyperlink"/>
+            <w:vertAlign w:val="subscript"/>
+          </w:rPr>
+          <w:t xml:space="preserve">Simulation — Realistic Scenarios</w:t>
+        </w:r>
+      </w:hyperlink>
+    </w:p>
+    <w:p>
+      <w:pPr>
+        <w:pStyle w:val="BodyText"/>
+      </w:pPr>
+      <w:r>
+        <w:t xml:space="preserve">The</w:t>
+      </w:r>
+      <w:r>
+        <w:t xml:space="preserve"> </w:t>
+      </w:r>
+      <w:hyperlink w:anchor="tbl-power-cutoff-missing">
+        <w:r>
+          <w:rPr>
+            <w:rStyle w:val="Hyperlink"/>
+          </w:rPr>
+          <w:t xml:space="preserve">Table 12</w:t>
+        </w:r>
+      </w:hyperlink>
+      <w:r>
+        <w:t xml:space="preserve"> </w:t>
+      </w:r>
+      <w:r>
+        <w:t xml:space="preserve">summarizes the power and cutoff values for each fit index at</w:t>
+      </w:r>
+      <w:r>
+        <w:t xml:space="preserve"> </w:t>
+      </w:r>
+      <m:oMath>
+        <m:r>
+          <m:t>N</m:t>
+        </m:r>
+        <m:r>
+          <m:rPr>
+            <m:sty m:val="p"/>
+          </m:rPr>
+          <m:t>=</m:t>
+        </m:r>
+        <m:r>
+          <m:t>359</m:t>
+        </m:r>
+      </m:oMath>
+      <w:r>
+        <w:t xml:space="preserve"> </w:t>
+      </w:r>
+      <w:r>
+        <w:t xml:space="preserve">under the missing data scenario. The estimated power values are lower than in the ideal condition, with RMSEA and SRMR still showing relatively high power, while CFI and TLI have notably reduced power, indicating that they are more sensitive to the loss of information caused by missing data.</w:t>
+      </w:r>
+    </w:p>
+    <w:tbl>
+      <w:tblPr>
+        <w:tblStyle w:val="Table"/>
+        <w:tblW w:type="pct" w:w="5000"/>
+        <w:tblLayout w:type="fixed"/>
+        <w:tblLook w:firstRow="0" w:lastRow="0" w:firstColumn="0" w:lastColumn="0" w:noHBand="0" w:noVBand="0" w:val="0000"/>
+      </w:tblPr>
+      <w:tblGrid>
+        <w:gridCol w:w="7920"/>
+      </w:tblGrid>
+      <w:tr>
         <w:tc>
           <w:tcPr/>
+          <w:bookmarkStart w:id="157" w:name="tbl-power-cutoff-missing"/>
+          <w:p>
+            <w:pPr>
+              <w:jc w:val="center"/>
+            </w:pPr>
+            <w:pPr>
+              <w:jc w:val="left"/>
+              <w:spacing w:before="200"/>
+              <w:pStyle w:val="ImageCaption"/>
+            </w:pPr>
+            <w:r>
+              <w:t xml:space="preserve">Table 12: Power and fit index cutoff values under missing data conditions at N = 359.</w:t>
+            </w:r>
+          </w:p>
+          <w:tbl>
+            <w:tblPr>
+              <w:tblStyle w:val="Table"/>
+              <w:tblW w:type="auto" w:w="0"/>
+              <w:tblLook w:firstRow="1" w:lastRow="0" w:firstColumn="0" w:lastColumn="0" w:noHBand="0" w:noVBand="0" w:val="0020"/>
+            </w:tblPr>
+            <w:tblGrid>
+              <w:gridCol w:w="1584"/>
+              <w:gridCol w:w="1584"/>
+              <w:gridCol w:w="1584"/>
+              <w:gridCol w:w="1584"/>
+              <w:gridCol w:w="1584"/>
+            </w:tblGrid>
+            <w:tr>
+              <w:trPr>
+                <w:tblHeader w:val="on"/>
+              </w:trPr>
+              <w:tc>
+                <w:tcPr/>
+                <w:p>
+                  <w:pPr>
+                    <w:pStyle w:val="Compact"/>
+                  </w:pPr>
+                </w:p>
+              </w:tc>
+              <w:tc>
+                <w:tcPr/>
+                <w:p>
+                  <w:pPr>
+                    <w:pStyle w:val="Compact"/>
+                    <w:jc w:val="center"/>
+                    <w:jc w:val="center"/>
+                  </w:pPr>
+                  <w:r>
+                    <w:t xml:space="preserve">RMSEA</w:t>
+                  </w:r>
+                </w:p>
+              </w:tc>
+              <w:tc>
+                <w:tcPr/>
+                <w:p>
+                  <w:pPr>
+                    <w:pStyle w:val="Compact"/>
+                    <w:jc w:val="center"/>
+                    <w:jc w:val="center"/>
+                  </w:pPr>
+                  <w:r>
+                    <w:t xml:space="preserve">SRMR</w:t>
+                  </w:r>
+                </w:p>
+              </w:tc>
+              <w:tc>
+                <w:tcPr/>
+                <w:p>
+                  <w:pPr>
+                    <w:pStyle w:val="Compact"/>
+                    <w:jc w:val="center"/>
+                    <w:jc w:val="center"/>
+                  </w:pPr>
+                  <w:r>
+                    <w:t xml:space="preserve">CFI</w:t>
+                  </w:r>
+                </w:p>
+              </w:tc>
+              <w:tc>
+                <w:tcPr/>
+                <w:p>
+                  <w:pPr>
+                    <w:pStyle w:val="Compact"/>
+                    <w:jc w:val="center"/>
+                    <w:jc w:val="center"/>
+                  </w:pPr>
+                  <w:r>
+                    <w:t xml:space="preserve">TLI</w:t>
+                  </w:r>
+                </w:p>
+              </w:tc>
+            </w:tr>
+            <w:tr>
+              <w:tc>
+                <w:tcPr/>
+                <w:p>
+                  <w:pPr>
+                    <w:pStyle w:val="Compact"/>
+                    <w:jc w:val="center"/>
+                  </w:pPr>
+                  <w:r>
+                    <w:t xml:space="preserve">Power</w:t>
+                  </w:r>
+                </w:p>
+              </w:tc>
+              <w:tc>
+                <w:tcPr/>
+                <w:p>
+                  <w:pPr>
+                    <w:pStyle w:val="Compact"/>
+                    <w:jc w:val="center"/>
+                    <w:jc w:val="center"/>
+                  </w:pPr>
+                  <w:r>
+                    <w:t xml:space="preserve">0.947</w:t>
+                  </w:r>
+                </w:p>
+              </w:tc>
+              <w:tc>
+                <w:tcPr/>
+                <w:p>
+                  <w:pPr>
+                    <w:pStyle w:val="Compact"/>
+                    <w:jc w:val="center"/>
+                    <w:jc w:val="center"/>
+                  </w:pPr>
+                  <w:r>
+                    <w:t xml:space="preserve">0.987</w:t>
+                  </w:r>
+                </w:p>
+              </w:tc>
+              <w:tc>
+                <w:tcPr/>
+                <w:p>
+                  <w:pPr>
+                    <w:pStyle w:val="Compact"/>
+                    <w:jc w:val="center"/>
+                    <w:jc w:val="center"/>
+                  </w:pPr>
+                  <w:r>
+                    <w:t xml:space="preserve">0.802</w:t>
+                  </w:r>
+                </w:p>
+              </w:tc>
+              <w:tc>
+                <w:tcPr/>
+                <w:p>
+                  <w:pPr>
+                    <w:pStyle w:val="Compact"/>
+                    <w:jc w:val="center"/>
+                    <w:jc w:val="center"/>
+                  </w:pPr>
+                  <w:r>
+                    <w:t xml:space="preserve">0.806</w:t>
+                  </w:r>
+                </w:p>
+              </w:tc>
+            </w:tr>
+            <w:tr>
+              <w:tc>
+                <w:tcPr/>
+                <w:p>
+                  <w:pPr>
+                    <w:pStyle w:val="Compact"/>
+                    <w:jc w:val="center"/>
+                  </w:pPr>
+                  <w:r>
+                    <w:t xml:space="preserve">Cutoff</w:t>
+                  </w:r>
+                </w:p>
+              </w:tc>
+              <w:tc>
+                <w:tcPr/>
+                <w:p>
+                  <w:pPr>
+                    <w:pStyle w:val="Compact"/>
+                    <w:jc w:val="center"/>
+                    <w:jc w:val="center"/>
+                  </w:pPr>
+                  <w:r>
+                    <w:t xml:space="preserve">0.011</w:t>
+                  </w:r>
+                </w:p>
+              </w:tc>
+              <w:tc>
+                <w:tcPr/>
+                <w:p>
+                  <w:pPr>
+                    <w:pStyle w:val="Compact"/>
+                    <w:jc w:val="center"/>
+                    <w:jc w:val="center"/>
+                  </w:pPr>
+                  <w:r>
+                    <w:t xml:space="preserve">0.035</w:t>
+                  </w:r>
+                </w:p>
+              </w:tc>
+              <w:tc>
+                <w:tcPr/>
+                <w:p>
+                  <w:pPr>
+                    <w:pStyle w:val="Compact"/>
+                    <w:jc w:val="center"/>
+                    <w:jc w:val="center"/>
+                  </w:pPr>
+                  <w:r>
+                    <w:t xml:space="preserve">1.008</w:t>
+                  </w:r>
+                </w:p>
+              </w:tc>
+              <w:tc>
+                <w:tcPr/>
+                <w:p>
+                  <w:pPr>
+                    <w:pStyle w:val="Compact"/>
+                    <w:jc w:val="center"/>
+                    <w:jc w:val="center"/>
+                  </w:pPr>
+                  <w:r>
+                    <w:t xml:space="preserve">1.010</w:t>
+                  </w:r>
+                </w:p>
+              </w:tc>
+            </w:tr>
+          </w:tbl>
+          <w:bookmarkEnd w:id="157"/>
+          <w:p/>
+        </w:tc>
+      </w:tr>
+    </w:tbl>
+    <w:p>
+      <w:pPr>
+        <w:pStyle w:val="BodyText"/>
+      </w:pPr>
+      <w:r>
+        <w:rPr>
+          <w:vertAlign w:val="subscript"/>
+        </w:rPr>
+        <w:t xml:space="preserve">Source:</w:t>
+      </w:r>
+      <w:r>
+        <w:rPr>
+          <w:vertAlign w:val="subscript"/>
+        </w:rPr>
+        <w:t xml:space="preserve"> </w:t>
+      </w:r>
+      <w:hyperlink r:id="rId158">
+        <w:r>
+          <w:rPr>
+            <w:rStyle w:val="Hyperlink"/>
+            <w:vertAlign w:val="subscript"/>
+          </w:rPr>
+          <w:t xml:space="preserve">Simulation — Realistic Scenarios</w:t>
+        </w:r>
+      </w:hyperlink>
+    </w:p>
+    <w:p>
+      <w:pPr>
+        <w:pStyle w:val="BodyText"/>
+      </w:pPr>
+      <w:r>
+        <w:t xml:space="preserve">At</w:t>
+      </w:r>
+      <w:r>
+        <w:t xml:space="preserve"> </w:t>
+      </w:r>
+      <m:oMath>
+        <m:r>
+          <m:t>N</m:t>
+        </m:r>
+        <m:r>
+          <m:rPr>
+            <m:sty m:val="p"/>
+          </m:rPr>
+          <m:t>=</m:t>
+        </m:r>
+        <m:r>
+          <m:t>359</m:t>
+        </m:r>
+      </m:oMath>
+      <w:r>
+        <w:t xml:space="preserve">, the empirical power values are 0.947 for RMSEA, 0.987 for SRMR, 0.802 for CFI, and 0.806 for TLI.</w:t>
+      </w:r>
+    </w:p>
+    <w:p>
+      <w:pPr>
+        <w:pStyle w:val="BodyText"/>
+      </w:pPr>
+      <w:r>
+        <w:t xml:space="preserve">These results show a clear difference in performance across indices. SRMR presents the highest power, RMSEA also shows very strong power, and both CFI and TLI are just above the conventional</w:t>
+      </w:r>
+      <w:r>
+        <w:t xml:space="preserve"> </w:t>
+      </w:r>
+      <m:oMath>
+        <m:r>
+          <m:t>0.80</m:t>
+        </m:r>
+      </m:oMath>
+      <w:r>
+        <w:t xml:space="preserve"> </w:t>
+      </w:r>
+      <w:r>
+        <w:t xml:space="preserve">threshold.</w:t>
+      </w:r>
+    </w:p>
+    <w:p>
+      <w:pPr>
+        <w:pStyle w:val="BodyText"/>
+      </w:pPr>
+      <w:r>
+        <w:t xml:space="preserve">This means that, at</w:t>
+      </w:r>
+      <w:r>
+        <w:t xml:space="preserve"> </w:t>
+      </w:r>
+      <m:oMath>
+        <m:r>
+          <m:t>N</m:t>
+        </m:r>
+        <m:r>
+          <m:rPr>
+            <m:sty m:val="p"/>
+          </m:rPr>
+          <m:t>=</m:t>
+        </m:r>
+        <m:r>
+          <m:t>359</m:t>
+        </m:r>
+      </m:oMath>
+      <w:r>
+        <w:t xml:space="preserve">, the sample size is more than sufficient for SRMR and RMSEA, while for CFI and TLI it is sufficient but still much closer to the minimum acceptable level.</w:t>
+      </w:r>
+    </w:p>
+    <w:p>
+      <w:pPr>
+        <w:pStyle w:val="BodyText"/>
+      </w:pPr>
+      <w:r>
+        <w:t xml:space="preserve">The empirical cutoff values obtained at</w:t>
+      </w:r>
+      <w:r>
+        <w:t xml:space="preserve"> </w:t>
+      </w:r>
+      <m:oMath>
+        <m:r>
+          <m:t>N</m:t>
+        </m:r>
+        <m:r>
+          <m:rPr>
+            <m:sty m:val="p"/>
+          </m:rPr>
+          <m:t>=</m:t>
+        </m:r>
+        <m:r>
+          <m:t>359</m:t>
+        </m:r>
+      </m:oMath>
+      <w:r>
+        <w:t xml:space="preserve"> </w:t>
+      </w:r>
+      <w:r>
+        <w:t xml:space="preserve">are 0.011 for RMSEA, 0.035 for SRMR, 1.008 for CFI, and 1.01 for TLI.</w:t>
+      </w:r>
+    </w:p>
+    <w:p>
+      <w:pPr>
+        <w:pStyle w:val="BodyText"/>
+      </w:pPr>
+      <w:r>
+        <w:t xml:space="preserve">For RMSEA and SRMR, the cutoffs are very low, which is consistent with the strong discrimination shown by their power values.</w:t>
+      </w:r>
+    </w:p>
+    <w:p>
+      <w:pPr>
+        <w:pStyle w:val="BodyText"/>
+      </w:pPr>
+      <w:r>
+        <w:t xml:space="preserve">For CFI and TLI, the cutoffs are slightly above</w:t>
+      </w:r>
+      <w:r>
+        <w:t xml:space="preserve"> </w:t>
+      </w:r>
+      <m:oMath>
+        <m:r>
+          <m:t>1.00</m:t>
+        </m:r>
+      </m:oMath>
+      <w:r>
+        <w:t xml:space="preserve">. In practical terms, this indicates that the classification boundary estimated from the simulation lies at the upper edge of the index scale, which helps explain why their power is only marginally above</w:t>
+      </w:r>
+      <w:r>
+        <w:t xml:space="preserve"> </w:t>
+      </w:r>
+      <m:oMath>
+        <m:r>
+          <m:t>0.80</m:t>
+        </m:r>
+      </m:oMath>
+      <w:r>
+        <w:t xml:space="preserve"> </w:t>
+      </w:r>
+      <w:r>
+        <w:t xml:space="preserve">even at this sample size.</w:t>
+      </w:r>
+    </w:p>
+    <w:p>
+      <w:pPr>
+        <w:pStyle w:val="BodyText"/>
+      </w:pPr>
+      <w:r>
+        <w:t xml:space="preserve">Taken together, the outputs indicate that the design performs very well for RMSEA and SRMR and only minimally adequately for CFI and TLI.</w:t>
+      </w:r>
+    </w:p>
+    <w:p>
+      <w:pPr>
+        <w:pStyle w:val="BodyText"/>
+      </w:pPr>
+      <w:r>
+        <w:t xml:space="preserve">So, at</w:t>
+      </w:r>
+      <w:r>
+        <w:t xml:space="preserve"> </w:t>
+      </w:r>
+      <m:oMath>
+        <m:r>
+          <m:t>N</m:t>
+        </m:r>
+        <m:r>
+          <m:rPr>
+            <m:sty m:val="p"/>
+          </m:rPr>
+          <m:t>=</m:t>
+        </m:r>
+        <m:r>
+          <m:t>359</m:t>
+        </m:r>
+      </m:oMath>
+      <w:r>
+        <w:t xml:space="preserve">, the results support a stronger conclusion for RMSEA and SRMR, whereas for CFI and TLI the conclusion is more cautious because their power values are only slightly above the target level.</w:t>
+      </w:r>
+    </w:p>
+    <w:bookmarkEnd w:id="159"/>
+    <w:bookmarkStart w:id="172" w:name="sec-nonnormal"/>
+    <w:p>
+      <w:pPr>
+        <w:pStyle w:val="Heading3"/>
+      </w:pPr>
+      <w:r>
+        <w:t xml:space="preserve">6.2 Non-Normality</w:t>
+      </w:r>
+    </w:p>
+    <w:p>
+      <w:pPr>
+        <w:pStyle w:val="FirstParagraph"/>
+      </w:pPr>
+      <w:r>
+        <w:t xml:space="preserve">This section focuses on the condition with</w:t>
+      </w:r>
+      <w:r>
+        <w:t xml:space="preserve"> </w:t>
+      </w:r>
+      <w:r>
+        <w:rPr>
+          <w:b/>
+          <w:bCs/>
+        </w:rPr>
+        <w:t xml:space="preserve">mild non-normality</w:t>
+      </w:r>
+      <w:r>
+        <w:t xml:space="preserve">, so power should be evaluated using robust fit indices rather than relying on normal-theory fit behavior. When available, the newer robust fit measures should be preferred over older scaled versions because they have better theoretical properties under non-normal data. However, for comparability with the ideal condition, the same set of indices is evaluated here.</w:t>
+      </w:r>
+    </w:p>
+    <w:p>
+      <w:pPr>
+        <w:pStyle w:val="BodyText"/>
+      </w:pPr>
+      <w:r>
+        <w:t xml:space="preserve">The power curves show how often the misspecified model would be rejected as</w:t>
+      </w:r>
+      <w:r>
+        <w:t xml:space="preserve"> </w:t>
+      </w:r>
+      <m:oMath>
+        <m:r>
+          <m:t>N</m:t>
+        </m:r>
+      </m:oMath>
+      <w:r>
+        <w:t xml:space="preserve"> </w:t>
+      </w:r>
+      <w:r>
+        <w:t xml:space="preserve">changes under this mildly non-normal condition. Here, the rejection rule is not based on generic cutoffs, but on empirical cutoffs obtained from the null-model sampling distribution at the chosen</w:t>
+      </w:r>
+      <w:r>
+        <w:t xml:space="preserve"> </w:t>
+      </w:r>
+      <m:oMath>
+        <m:r>
+          <m:t>α</m:t>
+        </m:r>
+      </m:oMath>
+      <w:r>
+        <w:t xml:space="preserve"> </w:t>
+      </w:r>
+      <w:r>
+        <w:t xml:space="preserve">level</w:t>
+      </w:r>
+      <w:r>
+        <w:t xml:space="preserve"> </w:t>
+      </w:r>
+      <w:r>
+        <w:t xml:space="preserve">(Pornprasertmanit et al., 2021)</w:t>
+      </w:r>
+      <w:r>
+        <w:t xml:space="preserve">.</w:t>
+      </w:r>
+    </w:p>
+    <w:p>
+      <w:pPr>
+        <w:pStyle w:val="BodyText"/>
+      </w:pPr>
+      <w:r>
+        <w:t xml:space="preserve">The version with logistic smoothing emphasizes the general trend of power across sample sizes, whereas the version without smoothing shows the simulated fit-index values more directly</w:t>
+      </w:r>
+      <w:r>
+        <w:t xml:space="preserve"> </w:t>
+      </w:r>
+      <w:r>
+        <w:t xml:space="preserve">(Pornprasertmanit et al., 2021)</w:t>
+      </w:r>
+      <w:r>
+        <w:t xml:space="preserve">. This is useful for checking how clearly the misspecified-model distribution separates from the null-based cutoff as</w:t>
+      </w:r>
+      <w:r>
+        <w:t xml:space="preserve"> </w:t>
+      </w:r>
+      <m:oMath>
+        <m:r>
+          <m:t>N</m:t>
+        </m:r>
+      </m:oMath>
+      <w:r>
+        <w:t xml:space="preserve"> </w:t>
+      </w:r>
+      <w:r>
+        <w:t xml:space="preserve">increases</w:t>
+      </w:r>
+      <w:r>
+        <w:t xml:space="preserve"> </w:t>
+      </w:r>
+      <w:r>
+        <w:t xml:space="preserve">(Pornprasertmanit et al., 2021)</w:t>
+      </w:r>
+      <w:r>
+        <w:t xml:space="preserve">.</w:t>
+      </w:r>
+    </w:p>
+    <w:tbl>
+      <w:tblPr>
+        <w:tblStyle w:val="Table"/>
+        <w:tblW w:type="pct" w:w="5000"/>
+        <w:tblLayout w:type="fixed"/>
+        <w:tblLook w:firstRow="0" w:lastRow="0" w:firstColumn="0" w:lastColumn="0" w:noHBand="0" w:noVBand="0" w:val="0000"/>
+      </w:tblPr>
+      <w:tblGrid>
+        <w:gridCol w:w="7920"/>
+      </w:tblGrid>
+      <w:tr>
+        <w:tc>
+          <w:tcPr/>
+          <w:bookmarkStart w:id="163" w:name="fig-power-curve-nnorm"/>
           <w:p>
             <w:pPr>
               <w:pStyle w:val="Compact"/>
-              <w:jc w:val="left"/>
+              <w:jc w:val="center"/>
             </w:pPr>
             <w:r>
-              <w:t xml:space="preserve">Simulation (</w:t>
-            </w:r>
-            <w:r>
-              <w:rPr>
-                <w:rStyle w:val="VerbatimChar"/>
-              </w:rPr>
-              <w:t xml:space="preserve">simsem</w:t>
-            </w:r>
-            <w:r>
-              <w:t xml:space="preserve">)</w:t>
+              <w:drawing>
+                <wp:inline>
+                  <wp:extent cx="5334000" cy="3333749"/>
+                  <wp:effectExtent b="0" l="0" r="0" t="0"/>
+                  <wp:docPr descr="" title="" id="161" name="Picture"/>
+                  <a:graphic>
+                    <a:graphicData uri="http://schemas.openxmlformats.org/drawingml/2006/picture">
+                      <pic:pic>
+                        <pic:nvPicPr>
+                          <pic:cNvPr descr="index_files/figure-docx/Scripts-AnalysisScripts-04_simulation_robust-fig-power-curve-nnorm-output-1.png" id="162" name="Picture"/>
+                          <pic:cNvPicPr>
+                            <a:picLocks noChangeArrowheads="1" noChangeAspect="1"/>
+                          </pic:cNvPicPr>
+                        </pic:nvPicPr>
+                        <pic:blipFill>
+                          <a:blip r:embed="rId160"/>
+                          <a:stretch>
+                            <a:fillRect/>
+                          </a:stretch>
+                        </pic:blipFill>
+                        <pic:spPr bwMode="auto">
+                          <a:xfrm>
+                            <a:off x="0" y="0"/>
+                            <a:ext cx="5334000" cy="3333749"/>
+                          </a:xfrm>
+                          <a:prstGeom prst="rect">
+                            <a:avLst/>
+                          </a:prstGeom>
+                          <a:noFill/>
+                          <a:ln w="9525">
+                            <a:noFill/>
+                            <a:headEnd/>
+                            <a:tailEnd/>
+                          </a:ln>
+                        </pic:spPr>
+                      </pic:pic>
+                    </a:graphicData>
+                  </a:graphic>
+                </wp:inline>
+              </w:drawing>
             </w:r>
           </w:p>
+          <w:p>
+            <w:pPr>
+              <w:jc w:val="center"/>
+            </w:pPr>
+            <w:pPr>
+              <w:jc w:val="left"/>
+              <w:spacing w:before="200"/>
+              <w:pStyle w:val="ImageCaption"/>
+            </w:pPr>
+            <w:r>
+              <w:t xml:space="preserve">Figure 17: Power curves for fit indices under non-normal conditions.</w:t>
+            </w:r>
+          </w:p>
+          <w:bookmarkEnd w:id="163"/>
         </w:tc>
       </w:tr>
+    </w:tbl>
+    <w:p>
+      <w:pPr>
+        <w:pStyle w:val="BodyText"/>
+      </w:pPr>
+      <w:r>
+        <w:rPr>
+          <w:vertAlign w:val="subscript"/>
+        </w:rPr>
+        <w:t xml:space="preserve">Source:</w:t>
+      </w:r>
+      <w:r>
+        <w:rPr>
+          <w:vertAlign w:val="subscript"/>
+        </w:rPr>
+        <w:t xml:space="preserve"> </w:t>
+      </w:r>
+      <w:hyperlink r:id="rId164">
+        <w:r>
+          <w:rPr>
+            <w:rStyle w:val="Hyperlink"/>
+            <w:vertAlign w:val="subscript"/>
+          </w:rPr>
+          <w:t xml:space="preserve">Simulation — Realistic Scenarios</w:t>
+        </w:r>
+      </w:hyperlink>
+    </w:p>
+    <w:p>
+      <w:pPr>
+        <w:pStyle w:val="BodyText"/>
+      </w:pPr>
+      <w:r>
+        <w:t xml:space="preserve">Figure</w:t>
+      </w:r>
+      <w:r>
+        <w:t xml:space="preserve"> </w:t>
+      </w:r>
+      <w:hyperlink w:anchor="fig-power-curve-nnorm">
+        <w:r>
+          <w:rPr>
+            <w:rStyle w:val="Hyperlink"/>
+          </w:rPr>
+          <w:t xml:space="preserve">Figure 17</w:t>
+        </w:r>
+      </w:hyperlink>
+      <w:r>
+        <w:t xml:space="preserve"> </w:t>
+      </w:r>
+      <w:r>
+        <w:t xml:space="preserve">shows a clear increase in power as</w:t>
+      </w:r>
+      <w:r>
+        <w:t xml:space="preserve"> </w:t>
+      </w:r>
+      <m:oMath>
+        <m:r>
+          <m:t>N</m:t>
+        </m:r>
+      </m:oMath>
+      <w:r>
+        <w:t xml:space="preserve"> </w:t>
+      </w:r>
+      <w:r>
+        <w:t xml:space="preserve">grows for all fit indices. SRMR is the strongest index across the entire range, starting already high at small samples and approaching</w:t>
+      </w:r>
+      <w:r>
+        <w:t xml:space="preserve"> </w:t>
+      </w:r>
+      <m:oMath>
+        <m:r>
+          <m:t>1.00</m:t>
+        </m:r>
+      </m:oMath>
+      <w:r>
+        <w:t xml:space="preserve"> </w:t>
+      </w:r>
+      <w:r>
+        <w:t xml:space="preserve">quickly. RMSEA also increases steadily and reaches high power earlier than the incremental indices. CFI and TLI follow the same general pattern, but their curves rise more slowly and remain below RMSEA and SRMR over most of the sample-size range.</w:t>
+      </w:r>
+    </w:p>
+    <w:p>
+      <w:pPr>
+        <w:pStyle w:val="BodyText"/>
+      </w:pPr>
+      <w:r>
+        <w:t xml:space="preserve">In practical terms, the ordering of sensitivity is stable throughout the figure:</w:t>
+      </w:r>
+      <w:r>
+        <w:t xml:space="preserve"> </w:t>
+      </w:r>
+      <m:oMath>
+        <m:r>
+          <m:rPr>
+            <m:nor/>
+            <m:sty m:val="p"/>
+          </m:rPr>
+          <m:t>SRMR</m:t>
+        </m:r>
+        <m:r>
+          <m:rPr>
+            <m:sty m:val="p"/>
+          </m:rPr>
+          <m:t>&gt;</m:t>
+        </m:r>
+        <m:r>
+          <m:rPr>
+            <m:nor/>
+            <m:sty m:val="p"/>
+          </m:rPr>
+          <m:t>RMSEA</m:t>
+        </m:r>
+        <m:r>
+          <m:rPr>
+            <m:sty m:val="p"/>
+          </m:rPr>
+          <m:t>&gt;</m:t>
+        </m:r>
+        <m:r>
+          <m:rPr>
+            <m:nor/>
+            <m:sty m:val="p"/>
+          </m:rPr>
+          <m:t>CFI</m:t>
+        </m:r>
+        <m:r>
+          <m:rPr>
+            <m:sty m:val="p"/>
+          </m:rPr>
+          <m:t>≈</m:t>
+        </m:r>
+        <m:r>
+          <m:rPr>
+            <m:nor/>
+            <m:sty m:val="p"/>
+          </m:rPr>
+          <m:t>TLI</m:t>
+        </m:r>
+      </m:oMath>
+      <w:r>
+        <w:t xml:space="preserve">. Around the mid-range of</w:t>
+      </w:r>
+      <w:r>
+        <w:t xml:space="preserve"> </w:t>
+      </w:r>
+      <m:oMath>
+        <m:r>
+          <m:t>N</m:t>
+        </m:r>
+      </m:oMath>
+      <w:r>
+        <w:t xml:space="preserve">, SRMR is already near ceiling, RMSEA is in a clearly high-power region, and CFI/TLI are still catching up. By the largest sample sizes, all four indices show strong power, although SRMR and RMSEA remain visibly ahead.</w:t>
+      </w:r>
+    </w:p>
+    <w:tbl>
+      <w:tblPr>
+        <w:tblStyle w:val="Table"/>
+        <w:tblW w:type="pct" w:w="5000"/>
+        <w:tblLayout w:type="fixed"/>
+        <w:tblLook w:firstRow="0" w:lastRow="0" w:firstColumn="0" w:lastColumn="0" w:noHBand="0" w:noVBand="0" w:val="0000"/>
+      </w:tblPr>
+      <w:tblGrid>
+        <w:gridCol w:w="7920"/>
+      </w:tblGrid>
       <w:tr>
         <w:tc>
           <w:tcPr/>
+          <w:bookmarkStart w:id="168" w:name="fig-fit-curve-nnorm"/>
           <w:p>
             <w:pPr>
               <w:pStyle w:val="Compact"/>
-              <w:jc w:val="left"/>
+              <w:jc w:val="center"/>
             </w:pPr>
             <w:r>
-              <w:rPr>
-                <w:b/>
-                <w:bCs/>
-              </w:rPr>
-              <w:t xml:space="preserve">Speed</w:t>
+              <w:drawing>
+                <wp:inline>
+                  <wp:extent cx="5334000" cy="3333749"/>
+                  <wp:effectExtent b="0" l="0" r="0" t="0"/>
+                  <wp:docPr descr="" title="" id="166" name="Picture"/>
+                  <a:graphic>
+                    <a:graphicData uri="http://schemas.openxmlformats.org/drawingml/2006/picture">
+                      <pic:pic>
+                        <pic:nvPicPr>
+                          <pic:cNvPr descr="index_files/figure-docx/Scripts-AnalysisScripts-04_simulation_robust-fig-fit-curve-nnorm-output-1.png" id="167" name="Picture"/>
+                          <pic:cNvPicPr>
+                            <a:picLocks noChangeArrowheads="1" noChangeAspect="1"/>
+                          </pic:cNvPicPr>
+                        </pic:nvPicPr>
+                        <pic:blipFill>
+                          <a:blip r:embed="rId165"/>
+                          <a:stretch>
+                            <a:fillRect/>
+                          </a:stretch>
+                        </pic:blipFill>
+                        <pic:spPr bwMode="auto">
+                          <a:xfrm>
+                            <a:off x="0" y="0"/>
+                            <a:ext cx="5334000" cy="3333749"/>
+                          </a:xfrm>
+                          <a:prstGeom prst="rect">
+                            <a:avLst/>
+                          </a:prstGeom>
+                          <a:noFill/>
+                          <a:ln w="9525">
+                            <a:noFill/>
+                            <a:headEnd/>
+                            <a:tailEnd/>
+                          </a:ln>
+                        </pic:spPr>
+                      </pic:pic>
+                    </a:graphicData>
+                  </a:graphic>
+                </wp:inline>
+              </w:drawing>
             </w:r>
           </w:p>
-        </w:tc>
-        <w:tc>
-          <w:tcPr/>
           <w:p>
             <w:pPr>
-              <w:pStyle w:val="Compact"/>
+              <w:jc w:val="center"/>
+            </w:pPr>
+            <w:pPr>
               <w:jc w:val="left"/>
+              <w:spacing w:before="200"/>
+              <w:pStyle w:val="ImageCaption"/>
             </w:pPr>
             <w:r>
-              <w:t xml:space="preserve">Instantaneous</w:t>
+              <w:t xml:space="preserve">Figure 18: Power curves for fit indices under non-normal conditions without logistic smoothing.</w:t>
             </w:r>
           </w:p>
-        </w:tc>
-        <w:tc>
-          <w:tcPr/>
-          <w:p>
-            <w:pPr>
-              <w:pStyle w:val="Compact"/>
-              <w:jc w:val="left"/>
-            </w:pPr>
-            <w:r>
-              <w:t xml:space="preserve">Minutes to hours</w:t>
-            </w:r>
-          </w:p>
+          <w:bookmarkEnd w:id="168"/>
         </w:tc>
       </w:tr>
+    </w:tbl>
+    <w:p>
+      <w:pPr>
+        <w:pStyle w:val="BodyText"/>
+      </w:pPr>
+      <w:r>
+        <w:rPr>
+          <w:vertAlign w:val="subscript"/>
+        </w:rPr>
+        <w:t xml:space="preserve">Source:</w:t>
+      </w:r>
+      <w:r>
+        <w:rPr>
+          <w:vertAlign w:val="subscript"/>
+        </w:rPr>
+        <w:t xml:space="preserve"> </w:t>
+      </w:r>
+      <w:hyperlink r:id="rId169">
+        <w:r>
+          <w:rPr>
+            <w:rStyle w:val="Hyperlink"/>
+            <w:vertAlign w:val="subscript"/>
+          </w:rPr>
+          <w:t xml:space="preserve">Simulation — Realistic Scenarios</w:t>
+        </w:r>
+      </w:hyperlink>
+    </w:p>
+    <w:p>
+      <w:pPr>
+        <w:pStyle w:val="BodyText"/>
+      </w:pPr>
+      <w:r>
+        <w:t xml:space="preserve">Figure</w:t>
+      </w:r>
+      <w:r>
+        <w:t xml:space="preserve"> </w:t>
+      </w:r>
+      <w:hyperlink w:anchor="fig-fit-curve-nnorm">
+        <w:r>
+          <w:rPr>
+            <w:rStyle w:val="Hyperlink"/>
+          </w:rPr>
+          <w:t xml:space="preserve">Figure 18</w:t>
+        </w:r>
+      </w:hyperlink>
+      <w:r>
+        <w:t xml:space="preserve"> </w:t>
+      </w:r>
+      <w:r>
+        <w:t xml:space="preserve">shows the same pattern without logistic smoothing and makes the separation between the simulated values more explicit. For RMSEA and SRMR, the distributions become increasingly distinct as</w:t>
+      </w:r>
+      <w:r>
+        <w:t xml:space="preserve"> </w:t>
+      </w:r>
+      <m:oMath>
+        <m:r>
+          <m:t>N</m:t>
+        </m:r>
+      </m:oMath>
+      <w:r>
+        <w:t xml:space="preserve"> </w:t>
+      </w:r>
+      <w:r>
+        <w:t xml:space="preserve">increases, with less overlap and a clearer gap between the two sets of points. For CFI and TLI, the separation also improves with larger</w:t>
+      </w:r>
+      <w:r>
+        <w:t xml:space="preserve"> </w:t>
+      </w:r>
+      <m:oMath>
+        <m:r>
+          <m:t>N</m:t>
+        </m:r>
+      </m:oMath>
+      <w:r>
+        <w:t xml:space="preserve">, but the overlap is more evident at lower and moderate sample sizes, which is consistent with their slower increase in power.</w:t>
+      </w:r>
+    </w:p>
+    <w:tbl>
+      <w:tblPr>
+        <w:tblStyle w:val="Table"/>
+        <w:tblW w:type="pct" w:w="5000"/>
+        <w:tblLayout w:type="fixed"/>
+        <w:tblLook w:firstRow="0" w:lastRow="0" w:firstColumn="0" w:lastColumn="0" w:noHBand="0" w:noVBand="0" w:val="0000"/>
+      </w:tblPr>
+      <w:tblGrid>
+        <w:gridCol w:w="7920"/>
+      </w:tblGrid>
       <w:tr>
         <w:tc>
           <w:tcPr/>
+          <w:bookmarkStart w:id="170" w:name="tbl-power-cutoff-nnorm"/>
           <w:p>
             <w:pPr>
-              <w:pStyle w:val="Compact"/>
+              <w:jc w:val="center"/>
+            </w:pPr>
+            <w:pPr>
               <w:jc w:val="left"/>
+              <w:spacing w:before="200"/>
+              <w:pStyle w:val="ImageCaption"/>
             </w:pPr>
             <w:r>
-              <w:rPr>
-                <w:b/>
-                <w:bCs/>
-              </w:rPr>
-              <w:t xml:space="preserve">Handles non-normality effectively</w:t>
+              <w:t xml:space="preserve">Table 13: Power and fit index cutoff values under non-normal conditions at N = 228.</w:t>
             </w:r>
           </w:p>
-        </w:tc>
-        <w:tc>
-          <w:tcPr/>
-          <w:p>
-            <w:pPr>
-              <w:pStyle w:val="Compact"/>
-              <w:jc w:val="left"/>
-            </w:pPr>
-            <w:r>
-              <w:t xml:space="preserve">No</w:t>
-            </w:r>
-          </w:p>
-        </w:tc>
-        <w:tc>
-          <w:tcPr/>
-          <w:p>
-            <w:pPr>
-              <w:pStyle w:val="Compact"/>
-              <w:jc w:val="left"/>
-            </w:pPr>
-            <w:r>
-              <w:t xml:space="preserve">Yes</w:t>
-            </w:r>
-          </w:p>
-        </w:tc>
-      </w:tr>
-      <w:tr>
-        <w:tc>
-          <w:tcPr/>
-          <w:p>
-            <w:pPr>
-              <w:pStyle w:val="Compact"/>
-              <w:jc w:val="left"/>
-            </w:pPr>
-            <w:r>
-              <w:rPr>
-                <w:b/>
-                <w:bCs/>
-              </w:rPr>
-              <w:t xml:space="preserve">Handles missing data mechanism</w:t>
-            </w:r>
-          </w:p>
-        </w:tc>
-        <w:tc>
-          <w:tcPr/>
-          <w:p>
-            <w:pPr>
-              <w:pStyle w:val="Compact"/>
-              <w:jc w:val="left"/>
-            </w:pPr>
-            <w:r>
-              <w:t xml:space="preserve">No</w:t>
-            </w:r>
-          </w:p>
-        </w:tc>
-        <w:tc>
-          <w:tcPr/>
-          <w:p>
-            <w:pPr>
-              <w:pStyle w:val="Compact"/>
-              <w:jc w:val="left"/>
-            </w:pPr>
-            <w:r>
-              <w:t xml:space="preserve">Yes</w:t>
-            </w:r>
-          </w:p>
-        </w:tc>
-      </w:tr>
-      <w:tr>
-        <w:tc>
-          <w:tcPr/>
-          <w:p>
-            <w:pPr>
-              <w:pStyle w:val="Compact"/>
-              <w:jc w:val="left"/>
-            </w:pPr>
-            <w:r>
-              <w:rPr>
-                <w:b/>
-                <w:bCs/>
-              </w:rPr>
-              <w:t xml:space="preserve">Parameter-level power targeting</w:t>
-            </w:r>
-          </w:p>
-        </w:tc>
-        <w:tc>
-          <w:tcPr/>
-          <w:p>
-            <w:pPr>
-              <w:pStyle w:val="Compact"/>
-              <w:jc w:val="left"/>
-            </w:pPr>
-            <w:r>
-              <w:t xml:space="preserve">Very Limited</w:t>
-            </w:r>
-          </w:p>
-        </w:tc>
-        <w:tc>
-          <w:tcPr/>
-          <w:p>
-            <w:pPr>
-              <w:pStyle w:val="Compact"/>
-              <w:jc w:val="left"/>
-            </w:pPr>
-            <w:r>
-              <w:t xml:space="preserve">Comprehensive</w:t>
-            </w:r>
-          </w:p>
-        </w:tc>
-      </w:tr>
-      <w:tr>
-        <w:tc>
-          <w:tcPr/>
-          <w:p>
-            <w:pPr>
-              <w:pStyle w:val="Compact"/>
-              <w:jc w:val="left"/>
-            </w:pPr>
-            <w:r>
-              <w:rPr>
-                <w:b/>
-                <w:bCs/>
-              </w:rPr>
-              <w:t xml:space="preserve">Coverage / relative bias diagnostics</w:t>
-            </w:r>
-          </w:p>
-        </w:tc>
-        <w:tc>
-          <w:tcPr/>
-          <w:p>
-            <w:pPr>
-              <w:pStyle w:val="Compact"/>
-              <w:jc w:val="left"/>
-            </w:pPr>
-            <w:r>
-              <w:t xml:space="preserve">No</w:t>
-            </w:r>
-          </w:p>
-        </w:tc>
-        <w:tc>
-          <w:tcPr/>
-          <w:p>
-            <w:pPr>
-              <w:pStyle w:val="Compact"/>
-              <w:jc w:val="left"/>
-            </w:pPr>
-            <w:r>
-              <w:t xml:space="preserve">Yes</w:t>
-            </w:r>
-          </w:p>
-        </w:tc>
-      </w:tr>
-      <w:tr>
-        <w:tc>
-          <w:tcPr/>
-          <w:p>
-            <w:pPr>
-              <w:pStyle w:val="Compact"/>
-              <w:jc w:val="left"/>
-            </w:pPr>
-            <w:r>
-              <w:rPr>
-                <w:b/>
-                <w:bCs/>
-              </w:rPr>
-              <w:t xml:space="preserve">Primary Use-Case</w:t>
-            </w:r>
-          </w:p>
-        </w:tc>
-        <w:tc>
-          <w:tcPr/>
-          <w:p>
-            <w:pPr>
-              <w:pStyle w:val="Compact"/>
-              <w:jc w:val="left"/>
-            </w:pPr>
-            <w:r>
-              <w:t xml:space="preserve">Grant planning, quick rough parameterization bounds</w:t>
-            </w:r>
-          </w:p>
-        </w:tc>
-        <w:tc>
-          <w:tcPr/>
-          <w:p>
-            <w:pPr>
-              <w:pStyle w:val="Compact"/>
-              <w:jc w:val="left"/>
-            </w:pPr>
-            <w:r>
-              <w:t xml:space="preserve">Pre-registration confirmation, sensitivity checks, final reporting</w:t>
-            </w:r>
-          </w:p>
+          <w:tbl>
+            <w:tblPr>
+              <w:tblStyle w:val="Table"/>
+              <w:tblW w:type="auto" w:w="0"/>
+              <w:tblLook w:firstRow="1" w:lastRow="0" w:firstColumn="0" w:lastColumn="0" w:noHBand="0" w:noVBand="0" w:val="0020"/>
+            </w:tblPr>
+            <w:tblGrid>
+              <w:gridCol w:w="1584"/>
+              <w:gridCol w:w="1584"/>
+              <w:gridCol w:w="1584"/>
+              <w:gridCol w:w="1584"/>
+              <w:gridCol w:w="1584"/>
+            </w:tblGrid>
+            <w:tr>
+              <w:trPr>
+                <w:tblHeader w:val="on"/>
+              </w:trPr>
+              <w:tc>
+                <w:tcPr/>
+                <w:p>
+                  <w:pPr>
+                    <w:pStyle w:val="Compact"/>
+                  </w:pPr>
+                </w:p>
+              </w:tc>
+              <w:tc>
+                <w:tcPr/>
+                <w:p>
+                  <w:pPr>
+                    <w:pStyle w:val="Compact"/>
+                    <w:jc w:val="center"/>
+                    <w:jc w:val="center"/>
+                  </w:pPr>
+                  <w:r>
+                    <w:t xml:space="preserve">RMSEA</w:t>
+                  </w:r>
+                </w:p>
+              </w:tc>
+              <w:tc>
+                <w:tcPr/>
+                <w:p>
+                  <w:pPr>
+                    <w:pStyle w:val="Compact"/>
+                    <w:jc w:val="center"/>
+                    <w:jc w:val="center"/>
+                  </w:pPr>
+                  <w:r>
+                    <w:t xml:space="preserve">SRMR</w:t>
+                  </w:r>
+                </w:p>
+              </w:tc>
+              <w:tc>
+                <w:tcPr/>
+                <w:p>
+                  <w:pPr>
+                    <w:pStyle w:val="Compact"/>
+                    <w:jc w:val="center"/>
+                    <w:jc w:val="center"/>
+                  </w:pPr>
+                  <w:r>
+                    <w:t xml:space="preserve">CFI</w:t>
+                  </w:r>
+                </w:p>
+              </w:tc>
+              <w:tc>
+                <w:tcPr/>
+                <w:p>
+                  <w:pPr>
+                    <w:pStyle w:val="Compact"/>
+                    <w:jc w:val="center"/>
+                    <w:jc w:val="center"/>
+                  </w:pPr>
+                  <w:r>
+                    <w:t xml:space="preserve">TLI</w:t>
+                  </w:r>
+                </w:p>
+              </w:tc>
+            </w:tr>
+            <w:tr>
+              <w:tc>
+                <w:tcPr/>
+                <w:p>
+                  <w:pPr>
+                    <w:pStyle w:val="Compact"/>
+                    <w:jc w:val="center"/>
+                  </w:pPr>
+                  <w:r>
+                    <w:t xml:space="preserve">Power</w:t>
+                  </w:r>
+                </w:p>
+              </w:tc>
+              <w:tc>
+                <w:tcPr/>
+                <w:p>
+                  <w:pPr>
+                    <w:pStyle w:val="Compact"/>
+                    <w:jc w:val="center"/>
+                    <w:jc w:val="center"/>
+                  </w:pPr>
+                  <w:r>
+                    <w:t xml:space="preserve">0.91</w:t>
+                  </w:r>
+                </w:p>
+              </w:tc>
+              <w:tc>
+                <w:tcPr/>
+                <w:p>
+                  <w:pPr>
+                    <w:pStyle w:val="Compact"/>
+                    <w:jc w:val="center"/>
+                    <w:jc w:val="center"/>
+                  </w:pPr>
+                  <w:r>
+                    <w:t xml:space="preserve">0.994</w:t>
+                  </w:r>
+                </w:p>
+              </w:tc>
+              <w:tc>
+                <w:tcPr/>
+                <w:p>
+                  <w:pPr>
+                    <w:pStyle w:val="Compact"/>
+                    <w:jc w:val="center"/>
+                    <w:jc w:val="center"/>
+                  </w:pPr>
+                  <w:r>
+                    <w:t xml:space="preserve">0.800</w:t>
+                  </w:r>
+                </w:p>
+              </w:tc>
+              <w:tc>
+                <w:tcPr/>
+                <w:p>
+                  <w:pPr>
+                    <w:pStyle w:val="Compact"/>
+                    <w:jc w:val="center"/>
+                    <w:jc w:val="center"/>
+                  </w:pPr>
+                  <w:r>
+                    <w:t xml:space="preserve">0.80</w:t>
+                  </w:r>
+                </w:p>
+              </w:tc>
+            </w:tr>
+            <w:tr>
+              <w:tc>
+                <w:tcPr/>
+                <w:p>
+                  <w:pPr>
+                    <w:pStyle w:val="Compact"/>
+                    <w:jc w:val="center"/>
+                  </w:pPr>
+                  <w:r>
+                    <w:t xml:space="preserve">Cutoff</w:t>
+                  </w:r>
+                </w:p>
+              </w:tc>
+              <w:tc>
+                <w:tcPr/>
+                <w:p>
+                  <w:pPr>
+                    <w:pStyle w:val="Compact"/>
+                    <w:jc w:val="center"/>
+                    <w:jc w:val="center"/>
+                  </w:pPr>
+                  <w:r>
+                    <w:t xml:space="preserve">0.04</w:t>
+                  </w:r>
+                </w:p>
+              </w:tc>
+              <w:tc>
+                <w:tcPr/>
+                <w:p>
+                  <w:pPr>
+                    <w:pStyle w:val="Compact"/>
+                    <w:jc w:val="center"/>
+                    <w:jc w:val="center"/>
+                  </w:pPr>
+                  <w:r>
+                    <w:t xml:space="preserve">0.059</w:t>
+                  </w:r>
+                </w:p>
+              </w:tc>
+              <w:tc>
+                <w:tcPr/>
+                <w:p>
+                  <w:pPr>
+                    <w:pStyle w:val="Compact"/>
+                    <w:jc w:val="center"/>
+                    <w:jc w:val="center"/>
+                  </w:pPr>
+                  <w:r>
+                    <w:t xml:space="preserve">0.964</w:t>
+                  </w:r>
+                </w:p>
+              </w:tc>
+              <w:tc>
+                <w:tcPr/>
+                <w:p>
+                  <w:pPr>
+                    <w:pStyle w:val="Compact"/>
+                    <w:jc w:val="center"/>
+                    <w:jc w:val="center"/>
+                  </w:pPr>
+                  <w:r>
+                    <w:t xml:space="preserve">0.96</w:t>
+                  </w:r>
+                </w:p>
+              </w:tc>
+            </w:tr>
+          </w:tbl>
+          <w:bookmarkEnd w:id="170"/>
+          <w:p/>
         </w:tc>
       </w:tr>
     </w:tbl>
     <w:p>
       <w:pPr>
-        <w:pStyle w:val="BlockText"/>
-      </w:pPr>
-      <w:r>
-        <w:rPr>
-          <w:b/>
-          <w:bCs/>
-        </w:rPr>
-        <w:t xml:space="preserve">Best Practice Recommendation:</w:t>
-      </w:r>
-      <w:r>
-        <w:t xml:space="preserve"> </w:t>
-      </w:r>
-      <w:r>
-        <w:t xml:space="preserve">Define theoretical bounds mapping an expected scenario utilizing fast analytical approximations. Validate robust tolerance to observed/anticipated data flaws (e.g., missingness, skew, differing distributions) iteratively through explicit simulation runs before finalizing sample specifications.</w:t>
-      </w:r>
-    </w:p>
-    <w:bookmarkEnd w:id="155"/>
-    <w:bookmarkStart w:id="172" w:name="references"/>
+        <w:pStyle w:val="BodyText"/>
+      </w:pPr>
+      <w:r>
+        <w:rPr>
+          <w:vertAlign w:val="subscript"/>
+        </w:rPr>
+        <w:t xml:space="preserve">Source:</w:t>
+      </w:r>
+      <w:r>
+        <w:rPr>
+          <w:vertAlign w:val="subscript"/>
+        </w:rPr>
+        <w:t xml:space="preserve"> </w:t>
+      </w:r>
+      <w:hyperlink r:id="rId171">
+        <w:r>
+          <w:rPr>
+            <w:rStyle w:val="Hyperlink"/>
+            <w:vertAlign w:val="subscript"/>
+          </w:rPr>
+          <w:t xml:space="preserve">Simulation — Realistic Scenarios</w:t>
+        </w:r>
+      </w:hyperlink>
+    </w:p>
+    <w:p>
+      <w:pPr>
+        <w:pStyle w:val="BodyText"/>
+      </w:pPr>
+      <w:r>
+        <w:t xml:space="preserve">Table</w:t>
+      </w:r>
+      <w:r>
+        <w:t xml:space="preserve"> </w:t>
+      </w:r>
+      <w:hyperlink w:anchor="tbl-power-cutoff-nnorm">
+        <w:r>
+          <w:rPr>
+            <w:rStyle w:val="Hyperlink"/>
+          </w:rPr>
+          <w:t xml:space="preserve">Table 13</w:t>
+        </w:r>
+      </w:hyperlink>
+      <w:r>
+        <w:t xml:space="preserve"> </w:t>
+      </w:r>
+      <w:r>
+        <w:t xml:space="preserve">summarizes the results at</w:t>
+      </w:r>
+      <w:r>
+        <w:t xml:space="preserve"> </w:t>
+      </w:r>
+      <m:oMath>
+        <m:r>
+          <m:t>N</m:t>
+        </m:r>
+        <m:r>
+          <m:rPr>
+            <m:sty m:val="p"/>
+          </m:rPr>
+          <m:t>=</m:t>
+        </m:r>
+        <m:r>
+          <m:t>228</m:t>
+        </m:r>
+      </m:oMath>
+      <w:r>
+        <w:t xml:space="preserve">. At this sample size, SRMR has the highest power 0.91, followed by RMSEA 0.994, followed by CFI 0.8. CFI and TLI both reach</w:t>
+      </w:r>
+      <w:r>
+        <w:t xml:space="preserve"> </w:t>
+      </w:r>
+      <m:oMath>
+        <m:r>
+          <m:t>0.800</m:t>
+        </m:r>
+      </m:oMath>
+      <w:r>
+        <w:t xml:space="preserve">, making them the least sensitive indices in this condition at the selected sample size.</w:t>
+      </w:r>
+    </w:p>
+    <w:p>
+      <w:pPr>
+        <w:pStyle w:val="BodyText"/>
+      </w:pPr>
+      <w:r>
+        <w:t xml:space="preserve">The cutoff values at</w:t>
+      </w:r>
+      <w:r>
+        <w:t xml:space="preserve"> </w:t>
+      </w:r>
+      <m:oMath>
+        <m:r>
+          <m:t>N</m:t>
+        </m:r>
+        <m:r>
+          <m:rPr>
+            <m:sty m:val="p"/>
+          </m:rPr>
+          <m:t>=</m:t>
+        </m:r>
+        <m:r>
+          <m:t>228</m:t>
+        </m:r>
+      </m:oMath>
+      <w:r>
+        <w:t xml:space="preserve"> </w:t>
+      </w:r>
+      <w:r>
+        <w:t xml:space="preserve">are 0.04 for RMSEA, 0.059 for SRMR, 0.964 for CFI, and 0.96 for TLI. These values are consistent with the pattern in the figures: SRMR and RMSEA show stronger discrimination at this sample size, whereas CFI and TLI require more favorable values to classify fit as acceptable. Overall, the results at</w:t>
+      </w:r>
+      <w:r>
+        <w:t xml:space="preserve"> </w:t>
+      </w:r>
+      <m:oMath>
+        <m:r>
+          <m:t>N</m:t>
+        </m:r>
+        <m:r>
+          <m:rPr>
+            <m:sty m:val="p"/>
+          </m:rPr>
+          <m:t>=</m:t>
+        </m:r>
+        <m:r>
+          <m:t>228</m:t>
+        </m:r>
+      </m:oMath>
+      <w:r>
+        <w:t xml:space="preserve"> </w:t>
+      </w:r>
+      <w:r>
+        <w:t xml:space="preserve">show very strong rejection performance for SRMR, strong performance for RMSEA, and adequate performance for CFI and TLI.</w:t>
+      </w:r>
+    </w:p>
+    <w:p>
+      <w:pPr>
+        <w:pStyle w:val="BodyText"/>
+      </w:pPr>
+      <w:r>
+        <w:t xml:space="preserve">The cutoff step at</w:t>
+      </w:r>
+      <w:r>
+        <w:t xml:space="preserve"> </w:t>
+      </w:r>
+      <m:oMath>
+        <m:r>
+          <m:t>N</m:t>
+        </m:r>
+        <m:r>
+          <m:rPr>
+            <m:sty m:val="p"/>
+          </m:rPr>
+          <m:t>=</m:t>
+        </m:r>
+        <m:r>
+          <m:t>228</m:t>
+        </m:r>
+      </m:oMath>
+      <w:r>
+        <w:t xml:space="preserve"> </w:t>
+      </w:r>
+      <w:r>
+        <w:t xml:space="preserve">complements the curves by fixing the decision rule at a specific sample size under the same mildly non-normal setup</w:t>
+      </w:r>
+      <w:r>
+        <w:t xml:space="preserve"> </w:t>
+      </w:r>
+      <w:r>
+        <w:t xml:space="preserve">(Pornprasertmanit et al., 2021)</w:t>
+      </w:r>
+      <w:r>
+        <w:t xml:space="preserve">. In this setting, power and cutoff values should be read together: the cutoff defines how strict the robust fit criterion is, and power indicates how often that criterion rejects the misspecified model</w:t>
+      </w:r>
+      <w:r>
+        <w:t xml:space="preserve"> </w:t>
+      </w:r>
+      <w:r>
+        <w:t xml:space="preserve">(Pornprasertmanit et al., 2021)</w:t>
+      </w:r>
+      <w:r>
+        <w:t xml:space="preserve">.</w:t>
+      </w:r>
+    </w:p>
+    <w:bookmarkEnd w:id="172"/>
+    <w:bookmarkStart w:id="173" w:name="sec-scenarios-fixed"/>
+    <w:p>
+      <w:pPr>
+        <w:pStyle w:val="Heading3"/>
+      </w:pPr>
+      <w:r>
+        <w:t xml:space="preserve">6.3 Simulation with fixed N</w:t>
+      </w:r>
+    </w:p>
+    <w:bookmarkEnd w:id="173"/>
+    <w:bookmarkEnd w:id="174"/>
+    <w:bookmarkStart w:id="195" w:name="references"/>
     <w:p>
       <w:pPr>
         <w:pStyle w:val="Heading2"/>
@@ -25047,8 +26555,8 @@
         <w:t xml:space="preserve">References</w:t>
       </w:r>
     </w:p>
-    <w:bookmarkStart w:id="171" w:name="refs"/>
-    <w:bookmarkStart w:id="156" w:name="ref-feng2023"/>
+    <w:bookmarkStart w:id="194" w:name="refs"/>
+    <w:bookmarkStart w:id="175" w:name="ref-feng2023"/>
     <w:p>
       <w:pPr>
         <w:pStyle w:val="Bibliography"/>
@@ -25105,8 +26613,8 @@
         <w:t xml:space="preserve">. The Guilford Press.</w:t>
       </w:r>
     </w:p>
-    <w:bookmarkEnd w:id="156"/>
-    <w:bookmarkStart w:id="158" w:name="ref-jak2021"/>
+    <w:bookmarkEnd w:id="175"/>
+    <w:bookmarkStart w:id="177" w:name="ref-jak2021"/>
     <w:p>
       <w:pPr>
         <w:pStyle w:val="Bibliography"/>
@@ -25167,7 +26675,7 @@
       <w:r>
         <w:t xml:space="preserve"> </w:t>
       </w:r>
-      <w:hyperlink r:id="rId157">
+      <w:hyperlink r:id="rId176">
         <w:r>
           <w:rPr>
             <w:rStyle w:val="Hyperlink"/>
@@ -25176,8 +26684,8 @@
         </w:r>
       </w:hyperlink>
     </w:p>
-    <w:bookmarkEnd w:id="158"/>
-    <w:bookmarkStart w:id="160" w:name="ref-jobst2023"/>
+    <w:bookmarkEnd w:id="177"/>
+    <w:bookmarkStart w:id="179" w:name="ref-jobst2023"/>
     <w:p>
       <w:pPr>
         <w:pStyle w:val="Bibliography"/>
@@ -25214,7 +26722,7 @@
       <w:r>
         <w:t xml:space="preserve"> </w:t>
       </w:r>
-      <w:hyperlink r:id="rId159">
+      <w:hyperlink r:id="rId178">
         <w:r>
           <w:rPr>
             <w:rStyle w:val="Hyperlink"/>
@@ -25223,26 +26731,95 @@
         </w:r>
       </w:hyperlink>
     </w:p>
-    <w:bookmarkEnd w:id="160"/>
-    <w:bookmarkStart w:id="162" w:name="ref-lin2022"/>
+    <w:bookmarkEnd w:id="179"/>
+    <w:bookmarkStart w:id="181" w:name="ref-kyriazos2018"/>
     <w:p>
       <w:pPr>
         <w:pStyle w:val="Bibliography"/>
       </w:pPr>
       <w:r>
-        <w:t xml:space="preserve">Lin, L.-C., &amp; Yao, G. (2022). Validation of the factor structure of the</w:t>
-      </w:r>
-      <w:r>
-        <w:t xml:space="preserve"> </w:t>
-      </w:r>
-      <w:r>
-        <w:t xml:space="preserve">WHOQOL-BREF</w:t>
-      </w:r>
-      <w:r>
-        <w:t xml:space="preserve"> </w:t>
-      </w:r>
-      <w:r>
-        <w:t xml:space="preserve">using meta-analysis of exploratory factor analysis and social network analysis.</w:t>
+        <w:t xml:space="preserve">Kyriazos, T. A. (2018). Applied</w:t>
+      </w:r>
+      <w:r>
+        <w:t xml:space="preserve"> </w:t>
+      </w:r>
+      <w:r>
+        <w:t xml:space="preserve">Psychometrics</w:t>
+      </w:r>
+      <w:r>
+        <w:t xml:space="preserve">:</w:t>
+      </w:r>
+      <w:r>
+        <w:t xml:space="preserve"> </w:t>
+      </w:r>
+      <w:r>
+        <w:t xml:space="preserve">Sample Size</w:t>
+      </w:r>
+      <w:r>
+        <w:t xml:space="preserve"> </w:t>
+      </w:r>
+      <w:r>
+        <w:t xml:space="preserve">and</w:t>
+      </w:r>
+      <w:r>
+        <w:t xml:space="preserve"> </w:t>
+      </w:r>
+      <w:r>
+        <w:t xml:space="preserve">Sample Power Considerations</w:t>
+      </w:r>
+      <w:r>
+        <w:t xml:space="preserve"> </w:t>
+      </w:r>
+      <w:r>
+        <w:t xml:space="preserve">in</w:t>
+      </w:r>
+      <w:r>
+        <w:t xml:space="preserve"> </w:t>
+      </w:r>
+      <w:r>
+        <w:t xml:space="preserve">Factor Analysis</w:t>
+      </w:r>
+      <w:r>
+        <w:t xml:space="preserve"> </w:t>
+      </w:r>
+      <w:r>
+        <w:t xml:space="preserve">(</w:t>
+      </w:r>
+      <w:r>
+        <w:t xml:space="preserve">EFA</w:t>
+      </w:r>
+      <w:r>
+        <w:t xml:space="preserve">,</w:t>
+      </w:r>
+      <w:r>
+        <w:t xml:space="preserve"> </w:t>
+      </w:r>
+      <w:r>
+        <w:t xml:space="preserve">CFA</w:t>
+      </w:r>
+      <w:r>
+        <w:t xml:space="preserve">) and</w:t>
+      </w:r>
+      <w:r>
+        <w:t xml:space="preserve"> </w:t>
+      </w:r>
+      <w:r>
+        <w:t xml:space="preserve">SEM</w:t>
+      </w:r>
+      <w:r>
+        <w:t xml:space="preserve"> </w:t>
+      </w:r>
+      <w:r>
+        <w:t xml:space="preserve">in</w:t>
+      </w:r>
+      <w:r>
+        <w:t xml:space="preserve"> </w:t>
+      </w:r>
+      <w:r>
+        <w:t xml:space="preserve">General</w:t>
+      </w:r>
+      <w:r>
+        <w:t xml:space="preserve">.</w:t>
       </w:r>
       <w:r>
         <w:t xml:space="preserve"> </w:t>
@@ -25252,7 +26829,7 @@
           <w:i/>
           <w:iCs/>
         </w:rPr>
-        <w:t xml:space="preserve">Psychological Assessment</w:t>
+        <w:t xml:space="preserve">Psychology</w:t>
       </w:r>
       <w:r>
         <w:t xml:space="preserve">,</w:t>
@@ -25265,6 +26842,65 @@
           <w:i/>
           <w:iCs/>
         </w:rPr>
+        <w:t xml:space="preserve">09</w:t>
+      </w:r>
+      <w:r>
+        <w:t xml:space="preserve">(08), 2207–2230.</w:t>
+      </w:r>
+      <w:r>
+        <w:t xml:space="preserve"> </w:t>
+      </w:r>
+      <w:hyperlink r:id="rId180">
+        <w:r>
+          <w:rPr>
+            <w:rStyle w:val="Hyperlink"/>
+          </w:rPr>
+          <w:t xml:space="preserve">https://doi.org/10.4236/psych.2018.98126</w:t>
+        </w:r>
+      </w:hyperlink>
+    </w:p>
+    <w:bookmarkEnd w:id="181"/>
+    <w:bookmarkStart w:id="183" w:name="ref-lin2022"/>
+    <w:p>
+      <w:pPr>
+        <w:pStyle w:val="Bibliography"/>
+      </w:pPr>
+      <w:r>
+        <w:t xml:space="preserve">Lin, L.-C., &amp; Yao, G. (2022). Validation of the factor structure of the</w:t>
+      </w:r>
+      <w:r>
+        <w:t xml:space="preserve"> </w:t>
+      </w:r>
+      <w:r>
+        <w:t xml:space="preserve">WHOQOL-BREF</w:t>
+      </w:r>
+      <w:r>
+        <w:t xml:space="preserve"> </w:t>
+      </w:r>
+      <w:r>
+        <w:t xml:space="preserve">using meta-analysis of exploratory factor analysis and social network analysis.</w:t>
+      </w:r>
+      <w:r>
+        <w:t xml:space="preserve"> </w:t>
+      </w:r>
+      <w:r>
+        <w:rPr>
+          <w:i/>
+          <w:iCs/>
+        </w:rPr>
+        <w:t xml:space="preserve">Psychological Assessment</w:t>
+      </w:r>
+      <w:r>
+        <w:t xml:space="preserve">,</w:t>
+      </w:r>
+      <w:r>
+        <w:t xml:space="preserve"> </w:t>
+      </w:r>
+      <w:r>
+        <w:rPr>
+          <w:i/>
+          <w:iCs/>
+        </w:rPr>
         <w:t xml:space="preserve">34</w:t>
       </w:r>
       <w:r>
@@ -25273,7 +26909,7 @@
       <w:r>
         <w:t xml:space="preserve"> </w:t>
       </w:r>
-      <w:hyperlink r:id="rId161">
+      <w:hyperlink r:id="rId182">
         <w:r>
           <w:rPr>
             <w:rStyle w:val="Hyperlink"/>
@@ -25282,8 +26918,8 @@
         </w:r>
       </w:hyperlink>
     </w:p>
-    <w:bookmarkEnd w:id="162"/>
-    <w:bookmarkStart w:id="164" w:name="ref-maccallum1996"/>
+    <w:bookmarkEnd w:id="183"/>
+    <w:bookmarkStart w:id="185" w:name="ref-maccallum1996"/>
     <w:p>
       <w:pPr>
         <w:pStyle w:val="Bibliography"/>
@@ -25320,7 +26956,7 @@
       <w:r>
         <w:t xml:space="preserve"> </w:t>
       </w:r>
-      <w:hyperlink r:id="rId163">
+      <w:hyperlink r:id="rId184">
         <w:r>
           <w:rPr>
             <w:rStyle w:val="Hyperlink"/>
@@ -25329,8 +26965,8 @@
         </w:r>
       </w:hyperlink>
     </w:p>
-    <w:bookmarkEnd w:id="164"/>
-    <w:bookmarkStart w:id="166" w:name="ref-moshagen2024"/>
+    <w:bookmarkEnd w:id="185"/>
+    <w:bookmarkStart w:id="187" w:name="ref-moshagen2024"/>
     <w:p>
       <w:pPr>
         <w:pStyle w:val="Bibliography"/>
@@ -25388,7 +27024,7 @@
       <w:r>
         <w:t xml:space="preserve"> </w:t>
       </w:r>
-      <w:hyperlink r:id="rId165">
+      <w:hyperlink r:id="rId186">
         <w:r>
           <w:rPr>
             <w:rStyle w:val="Hyperlink"/>
@@ -25397,8 +27033,8 @@
         </w:r>
       </w:hyperlink>
     </w:p>
-    <w:bookmarkEnd w:id="166"/>
-    <w:bookmarkStart w:id="168" w:name="ref-mosqueirataipe2026"/>
+    <w:bookmarkEnd w:id="187"/>
+    <w:bookmarkStart w:id="189" w:name="ref-mosqueirataipe2026"/>
     <w:p>
       <w:pPr>
         <w:pStyle w:val="Bibliography"/>
@@ -25450,7 +27086,7 @@
       <w:r>
         <w:t xml:space="preserve"> </w:t>
       </w:r>
-      <w:hyperlink r:id="rId167">
+      <w:hyperlink r:id="rId188">
         <w:r>
           <w:rPr>
             <w:rStyle w:val="Hyperlink"/>
@@ -25459,8 +27095,8 @@
         </w:r>
       </w:hyperlink>
     </w:p>
-    <w:bookmarkEnd w:id="168"/>
-    <w:bookmarkStart w:id="170" w:name="ref-simsem2021"/>
+    <w:bookmarkEnd w:id="189"/>
+    <w:bookmarkStart w:id="191" w:name="ref-simsem2021"/>
     <w:p>
       <w:pPr>
         <w:pStyle w:val="Bibliography"/>
@@ -25498,7 +27134,7 @@
       <w:r>
         <w:t xml:space="preserve"> </w:t>
       </w:r>
-      <w:hyperlink r:id="rId169">
+      <w:hyperlink r:id="rId190">
         <w:r>
           <w:rPr>
             <w:rStyle w:val="Hyperlink"/>
@@ -25507,9 +27143,109 @@
         </w:r>
       </w:hyperlink>
     </w:p>
-    <w:bookmarkEnd w:id="170"/>
-    <w:bookmarkEnd w:id="171"/>
-    <w:bookmarkEnd w:id="172"/>
+    <w:bookmarkEnd w:id="191"/>
+    <w:bookmarkStart w:id="193" w:name="ref-wang2023"/>
+    <w:p>
+      <w:pPr>
+        <w:pStyle w:val="Bibliography"/>
+      </w:pPr>
+      <w:r>
+        <w:t xml:space="preserve">Wang, Y. A. (2023).</w:t>
+      </w:r>
+      <w:r>
+        <w:t xml:space="preserve"> </w:t>
+      </w:r>
+      <w:r>
+        <w:rPr>
+          <w:i/>
+          <w:iCs/>
+        </w:rPr>
+        <w:t xml:space="preserve">How to</w:t>
+      </w:r>
+      <w:r>
+        <w:rPr>
+          <w:i/>
+          <w:iCs/>
+        </w:rPr>
+        <w:t xml:space="preserve"> </w:t>
+      </w:r>
+      <w:r>
+        <w:rPr>
+          <w:i/>
+          <w:iCs/>
+        </w:rPr>
+        <w:t xml:space="preserve">Conduct Power Analysis</w:t>
+      </w:r>
+      <w:r>
+        <w:rPr>
+          <w:i/>
+          <w:iCs/>
+        </w:rPr>
+        <w:t xml:space="preserve"> </w:t>
+      </w:r>
+      <w:r>
+        <w:rPr>
+          <w:i/>
+          <w:iCs/>
+        </w:rPr>
+        <w:t xml:space="preserve">for</w:t>
+      </w:r>
+      <w:r>
+        <w:rPr>
+          <w:i/>
+          <w:iCs/>
+        </w:rPr>
+        <w:t xml:space="preserve"> </w:t>
+      </w:r>
+      <w:r>
+        <w:rPr>
+          <w:i/>
+          <w:iCs/>
+        </w:rPr>
+        <w:t xml:space="preserve">Structural Equation Models</w:t>
+      </w:r>
+      <w:r>
+        <w:rPr>
+          <w:i/>
+          <w:iCs/>
+        </w:rPr>
+        <w:t xml:space="preserve">:</w:t>
+      </w:r>
+      <w:r>
+        <w:rPr>
+          <w:i/>
+          <w:iCs/>
+        </w:rPr>
+        <w:t xml:space="preserve"> </w:t>
+      </w:r>
+      <w:r>
+        <w:rPr>
+          <w:i/>
+          <w:iCs/>
+        </w:rPr>
+        <w:t xml:space="preserve">A Practical Primer</w:t>
+      </w:r>
+      <w:r>
+        <w:t xml:space="preserve"> </w:t>
+      </w:r>
+      <w:r>
+        <w:t xml:space="preserve">[Preprint]. PsyArXiv.</w:t>
+      </w:r>
+      <w:r>
+        <w:t xml:space="preserve"> </w:t>
+      </w:r>
+      <w:hyperlink r:id="rId192">
+        <w:r>
+          <w:rPr>
+            <w:rStyle w:val="Hyperlink"/>
+          </w:rPr>
+          <w:t xml:space="preserve">https://doi.org/10.31234/osf.io/4n3uk</w:t>
+        </w:r>
+      </w:hyperlink>
+    </w:p>
+    <w:bookmarkEnd w:id="193"/>
+    <w:bookmarkEnd w:id="194"/>
+    <w:bookmarkEnd w:id="195"/>
     <w:sectPr>
       <w:footnotePr>
         <w:numRestart w:val="eachSect"/>

</xml_diff>

<commit_message>
feat: fixed N and posthoc narrative added
</commit_message>
<xml_diff>
--- a/docs/index.docx
+++ b/docs/index.docx
@@ -31,7 +31,7 @@
         <w:pStyle w:val="Date"/>
       </w:pPr>
       <w:r>
-        <w:t xml:space="preserve">2026-04-20</w:t>
+        <w:t xml:space="preserve">2026-04-21</w:t>
       </w:r>
     </w:p>
     <w:p>
@@ -24625,7 +24625,7 @@
     <w:bookmarkEnd w:id="144"/>
     <w:bookmarkEnd w:id="145"/>
     <w:bookmarkEnd w:id="146"/>
-    <w:bookmarkStart w:id="174" w:name="sec-sim-robust"/>
+    <w:bookmarkStart w:id="189" w:name="sec-sim-robust"/>
     <w:p>
       <w:pPr>
         <w:pStyle w:val="Heading2"/>
@@ -26535,7 +26535,7 @@
       </w:r>
     </w:p>
     <w:bookmarkEnd w:id="172"/>
-    <w:bookmarkStart w:id="173" w:name="sec-scenarios-fixed"/>
+    <w:bookmarkStart w:id="188" w:name="sec-scenarios-fixed"/>
     <w:p>
       <w:pPr>
         <w:pStyle w:val="Heading3"/>
@@ -26544,19 +26544,3270 @@
         <w:t xml:space="preserve">6.3 Simulation with fixed N</w:t>
       </w:r>
     </w:p>
-    <w:bookmarkEnd w:id="173"/>
-    <w:bookmarkEnd w:id="174"/>
-    <w:bookmarkStart w:id="195" w:name="references"/>
+    <w:p>
+      <w:pPr>
+        <w:pStyle w:val="FirstParagraph"/>
+      </w:pPr>
+      <w:r>
+        <w:t xml:space="preserve">Earlier sections used a priori Monte Carlo simulation to determine the minimum sample size needed for adequate power. Here, the goal is different: we hold</w:t>
+      </w:r>
+      <w:r>
+        <w:t xml:space="preserve"> </w:t>
+      </w:r>
+      <m:oMath>
+        <m:r>
+          <m:t>N</m:t>
+        </m:r>
+      </m:oMath>
+      <w:r>
+        <w:t xml:space="preserve"> </w:t>
+      </w:r>
+      <w:r>
+        <w:t xml:space="preserve">fixed at a conservative value and examine whether that choice yields stable model discrimination across many replications.</w:t>
+      </w:r>
+    </w:p>
+    <w:p>
+      <w:pPr>
+        <w:pStyle w:val="BodyText"/>
+      </w:pPr>
+      <w:r>
+        <w:t xml:space="preserve">This step is important because power analysis in SEM is not only about finding the smallest workable sample. It is also about understanding how reliably a chosen design can separate a defensible measurement model from a substantively relevant misspecified alternative when the data are repeatedly sampled from the assumed population model</w:t>
+      </w:r>
+      <w:r>
+        <w:t xml:space="preserve"> </w:t>
+      </w:r>
+      <w:r>
+        <w:t xml:space="preserve">(Feng &amp; Hancock, 2023; Moshagen &amp; Bader, 2024)</w:t>
+      </w:r>
+      <w:r>
+        <w:t xml:space="preserve">.</w:t>
+      </w:r>
+    </w:p>
+    <w:p>
+      <w:pPr>
+        <w:pStyle w:val="BodyText"/>
+      </w:pPr>
+      <w:r>
+        <w:t xml:space="preserve">In this tutorial, the focus remains on</w:t>
+      </w:r>
+      <w:r>
+        <w:t xml:space="preserve"> </w:t>
+      </w:r>
+      <w:r>
+        <w:rPr>
+          <w:b/>
+          <w:bCs/>
+        </w:rPr>
+        <w:t xml:space="preserve">global model fit</w:t>
+      </w:r>
+      <w:r>
+        <w:t xml:space="preserve"> </w:t>
+      </w:r>
+      <w:r>
+        <w:t xml:space="preserve">rather than on isolated parameters. That choice is theoretically appropriate because the CFA is being used here as one measurement component within a broader research program, so the practical question is whether the instrument as a whole can rule out a meaningful misspecification pattern, not merely whether one parameter at a time is detected</w:t>
+      </w:r>
+      <w:r>
+        <w:t xml:space="preserve"> </w:t>
+      </w:r>
+      <w:r>
+        <w:t xml:space="preserve">(Jobst et al., 2023; Wang, 2023)</w:t>
+      </w:r>
+      <w:r>
+        <w:t xml:space="preserve">.</w:t>
+      </w:r>
+    </w:p>
+    <w:p>
+      <w:pPr>
+        <w:pStyle w:val="BodyText"/>
+      </w:pPr>
+      <w:r>
+        <w:t xml:space="preserve">The section also highlights an important distinction between empirical and traditional fit criteria. Empirical cutoffs are derived from the simulated sampling behavior of the fitted model under the design at hand, whereas traditional thresholds are generic conventions; as a result, the two approaches need not lead to the same conclusion about power or model rejection</w:t>
+      </w:r>
+      <w:r>
+        <w:t xml:space="preserve"> </w:t>
+      </w:r>
+      <w:r>
+        <w:t xml:space="preserve">(Jak et al., 2021; Pornprasertmanit et al., 2021)</w:t>
+      </w:r>
+      <w:r>
+        <w:t xml:space="preserve">.</w:t>
+      </w:r>
+    </w:p>
+    <w:tbl>
+      <w:tblPr>
+        <w:tblStyle w:val="Table"/>
+        <w:tblW w:type="pct" w:w="5000"/>
+        <w:tblLayout w:type="fixed"/>
+        <w:tblLook w:firstRow="0" w:lastRow="0" w:firstColumn="0" w:lastColumn="0" w:noHBand="0" w:noVBand="0" w:val="0000"/>
+      </w:tblPr>
+      <w:tblGrid>
+        <w:gridCol w:w="7920"/>
+      </w:tblGrid>
+      <w:tr>
+        <w:tc>
+          <w:tcPr/>
+          <w:bookmarkStart w:id="176" w:name="fig-power-curve-fixed"/>
+          <w:p>
+            <w:pPr>
+              <w:pStyle w:val="Compact"/>
+              <w:jc w:val="center"/>
+            </w:pPr>
+            <w:r>
+              <w:drawing>
+                <wp:inline>
+                  <wp:extent cx="5334000" cy="3333749"/>
+                  <wp:effectExtent b="0" l="0" r="0" t="0"/>
+                  <wp:docPr descr="" title="" id="174" name="Picture"/>
+                  <a:graphic>
+                    <a:graphicData uri="http://schemas.openxmlformats.org/drawingml/2006/picture">
+                      <pic:pic>
+                        <pic:nvPicPr>
+                          <pic:cNvPr descr="index_files/figure-docx/Scripts-AnalysisScripts-05_model_comparison-fig-power-curve-fixed-output-1.png" id="175" name="Picture"/>
+                          <pic:cNvPicPr>
+                            <a:picLocks noChangeArrowheads="1" noChangeAspect="1"/>
+                          </pic:cNvPicPr>
+                        </pic:nvPicPr>
+                        <pic:blipFill>
+                          <a:blip r:embed="rId173"/>
+                          <a:stretch>
+                            <a:fillRect/>
+                          </a:stretch>
+                        </pic:blipFill>
+                        <pic:spPr bwMode="auto">
+                          <a:xfrm>
+                            <a:off x="0" y="0"/>
+                            <a:ext cx="5334000" cy="3333749"/>
+                          </a:xfrm>
+                          <a:prstGeom prst="rect">
+                            <a:avLst/>
+                          </a:prstGeom>
+                          <a:noFill/>
+                          <a:ln w="9525">
+                            <a:noFill/>
+                            <a:headEnd/>
+                            <a:tailEnd/>
+                          </a:ln>
+                        </pic:spPr>
+                      </pic:pic>
+                    </a:graphicData>
+                  </a:graphic>
+                </wp:inline>
+              </w:drawing>
+            </w:r>
+          </w:p>
+          <w:p>
+            <w:pPr>
+              <w:jc w:val="center"/>
+            </w:pPr>
+            <w:pPr>
+              <w:jc w:val="left"/>
+              <w:spacing w:before="200"/>
+              <w:pStyle w:val="ImageCaption"/>
+            </w:pPr>
+            <w:r>
+              <w:t xml:space="preserve">Figure 19: Power curves for fit indices with fixed sample size.</w:t>
+            </w:r>
+          </w:p>
+          <w:bookmarkEnd w:id="176"/>
+        </w:tc>
+      </w:tr>
+    </w:tbl>
+    <w:p>
+      <w:pPr>
+        <w:pStyle w:val="BodyText"/>
+      </w:pPr>
+      <w:r>
+        <w:rPr>
+          <w:vertAlign w:val="subscript"/>
+        </w:rPr>
+        <w:t xml:space="preserve">Source:</w:t>
+      </w:r>
+      <w:r>
+        <w:rPr>
+          <w:vertAlign w:val="subscript"/>
+        </w:rPr>
+        <w:t xml:space="preserve"> </w:t>
+      </w:r>
+      <w:hyperlink r:id="rId177">
+        <w:r>
+          <w:rPr>
+            <w:rStyle w:val="Hyperlink"/>
+            <w:vertAlign w:val="subscript"/>
+          </w:rPr>
+          <w:t xml:space="preserve">Simulation with Fixed Sample Size</w:t>
+        </w:r>
+      </w:hyperlink>
+    </w:p>
+    <w:p>
+      <w:pPr>
+        <w:pStyle w:val="BodyText"/>
+      </w:pPr>
+      <w:r>
+        <w:t xml:space="preserve">With</w:t>
+      </w:r>
+      <w:r>
+        <w:t xml:space="preserve"> </w:t>
+      </w:r>
+      <m:oMath>
+        <m:r>
+          <m:t>N</m:t>
+        </m:r>
+        <m:r>
+          <m:rPr>
+            <m:sty m:val="p"/>
+          </m:rPr>
+          <m:t>=</m:t>
+        </m:r>
+        <m:r>
+          <m:t>350</m:t>
+        </m:r>
+      </m:oMath>
+      <w:r>
+        <w:t xml:space="preserve">, the main analysis shows complete discrimination between the reference and misspecified conditions across the four global fit indices considered. Using empirical cutoffs derived from the simulated reference model, RMSEA, SRMR, CFI, and TLI all reached power equal to 1.000, indicating that this sample size separates the target model from the misspecified alternative with essentially perfect consistency in the ideal scenario.</w:t>
+      </w:r>
+    </w:p>
+    <w:p>
+      <w:pPr>
+        <w:pStyle w:val="BodyText"/>
+      </w:pPr>
+      <w:r>
+        <w:t xml:space="preserve">The empirical cutoffs are also informative in their own right (</w:t>
+      </w:r>
+      <w:hyperlink w:anchor="tbl-power-cutoff-fixed">
+        <w:r>
+          <w:rPr>
+            <w:rStyle w:val="Hyperlink"/>
+          </w:rPr>
+          <w:t xml:space="preserve">Table 14</w:t>
+        </w:r>
+      </w:hyperlink>
+      <w:r>
+        <w:t xml:space="preserve">). They indicate the level of fit that is typical of the correctly specified model under this design, and therefore define a data-driven benchmark for deciding when the misspecified model should be rejected. In the</w:t>
+      </w:r>
+      <w:r>
+        <w:t xml:space="preserve"> </w:t>
+      </w:r>
+      <w:hyperlink w:anchor="fig-power-curve-fixed">
+        <w:r>
+          <w:rPr>
+            <w:rStyle w:val="Hyperlink"/>
+          </w:rPr>
+          <w:t xml:space="preserve">Figure 19</w:t>
+        </w:r>
+      </w:hyperlink>
+      <w:r>
+        <w:t xml:space="preserve">, this appears as a clear separation between the null and alternative distributions, with the cutoff placed at a point that produces minimal overlap.</w:t>
+      </w:r>
+    </w:p>
+    <w:p>
+      <w:pPr>
+        <w:pStyle w:val="BodyText"/>
+      </w:pPr>
+      <w:r>
+        <w:t xml:space="preserve">This pattern supports the use of</w:t>
+      </w:r>
+      <w:r>
+        <w:t xml:space="preserve"> </w:t>
+      </w:r>
+      <m:oMath>
+        <m:r>
+          <m:t>N</m:t>
+        </m:r>
+        <m:r>
+          <m:rPr>
+            <m:sty m:val="p"/>
+          </m:rPr>
+          <m:t>=</m:t>
+        </m:r>
+        <m:r>
+          <m:t>350</m:t>
+        </m:r>
+      </m:oMath>
+      <w:r>
+        <w:t xml:space="preserve"> </w:t>
+      </w:r>
+      <w:r>
+        <w:t xml:space="preserve">as a conservative and stable design choice for the main comparison developed throughout the tutorial. At this stage, the aim is no longer to identify the minimum acceptable sample size, but to show that a fixed and defensible</w:t>
+      </w:r>
+      <w:r>
+        <w:t xml:space="preserve"> </w:t>
+      </w:r>
+      <m:oMath>
+        <m:r>
+          <m:t>N</m:t>
+        </m:r>
+      </m:oMath>
+      <w:r>
+        <w:t xml:space="preserve"> </w:t>
+      </w:r>
+      <w:r>
+        <w:t xml:space="preserve">yields highly reliable rejection of the misspecified model when the data are generated from the population model.</w:t>
+      </w:r>
+    </w:p>
+    <w:tbl>
+      <w:tblPr>
+        <w:tblStyle w:val="Table"/>
+        <w:tblW w:type="pct" w:w="5000"/>
+        <w:tblLayout w:type="fixed"/>
+        <w:tblLook w:firstRow="0" w:lastRow="0" w:firstColumn="0" w:lastColumn="0" w:noHBand="0" w:noVBand="0" w:val="0000"/>
+      </w:tblPr>
+      <w:tblGrid>
+        <w:gridCol w:w="7920"/>
+      </w:tblGrid>
+      <w:tr>
+        <w:tc>
+          <w:tcPr/>
+          <w:bookmarkStart w:id="178" w:name="tbl-power-cutoff-fixed"/>
+          <w:p>
+            <w:pPr>
+              <w:jc w:val="center"/>
+            </w:pPr>
+            <w:pPr>
+              <w:jc w:val="left"/>
+              <w:spacing w:before="200"/>
+              <w:pStyle w:val="ImageCaption"/>
+            </w:pPr>
+            <w:r>
+              <w:t xml:space="preserve">Table 14: Power and fit index cutoff values with fixed sample size.</w:t>
+            </w:r>
+          </w:p>
+          <w:tbl>
+            <w:tblPr>
+              <w:tblStyle w:val="Table"/>
+              <w:tblW w:type="auto" w:w="0"/>
+              <w:tblLook w:firstRow="1" w:lastRow="0" w:firstColumn="0" w:lastColumn="0" w:noHBand="0" w:noVBand="0" w:val="0020"/>
+            </w:tblPr>
+            <w:tblGrid>
+              <w:gridCol w:w="1320"/>
+              <w:gridCol w:w="1320"/>
+              <w:gridCol w:w="1320"/>
+              <w:gridCol w:w="1320"/>
+              <w:gridCol w:w="1320"/>
+              <w:gridCol w:w="1320"/>
+            </w:tblGrid>
+            <w:tr>
+              <w:trPr>
+                <w:tblHeader w:val="on"/>
+              </w:trPr>
+              <w:tc>
+                <w:tcPr/>
+                <w:p>
+                  <w:pPr>
+                    <w:pStyle w:val="Compact"/>
+                  </w:pPr>
+                </w:p>
+              </w:tc>
+              <w:tc>
+                <w:tcPr/>
+                <w:p>
+                  <w:pPr>
+                    <w:pStyle w:val="Compact"/>
+                    <w:jc w:val="center"/>
+                    <w:jc w:val="center"/>
+                  </w:pPr>
+                  <w:r>
+                    <w:t xml:space="preserve">TRADITIONALCHI</w:t>
+                  </w:r>
+                </w:p>
+              </w:tc>
+              <w:tc>
+                <w:tcPr/>
+                <w:p>
+                  <w:pPr>
+                    <w:pStyle w:val="Compact"/>
+                    <w:jc w:val="center"/>
+                    <w:jc w:val="center"/>
+                  </w:pPr>
+                  <w:r>
+                    <w:t xml:space="preserve">RMSEA</w:t>
+                  </w:r>
+                </w:p>
+              </w:tc>
+              <w:tc>
+                <w:tcPr/>
+                <w:p>
+                  <w:pPr>
+                    <w:pStyle w:val="Compact"/>
+                    <w:jc w:val="center"/>
+                    <w:jc w:val="center"/>
+                  </w:pPr>
+                  <w:r>
+                    <w:t xml:space="preserve">SRMR</w:t>
+                  </w:r>
+                </w:p>
+              </w:tc>
+              <w:tc>
+                <w:tcPr/>
+                <w:p>
+                  <w:pPr>
+                    <w:pStyle w:val="Compact"/>
+                    <w:jc w:val="center"/>
+                    <w:jc w:val="center"/>
+                  </w:pPr>
+                  <w:r>
+                    <w:t xml:space="preserve">CFI</w:t>
+                  </w:r>
+                </w:p>
+              </w:tc>
+              <w:tc>
+                <w:tcPr/>
+                <w:p>
+                  <w:pPr>
+                    <w:pStyle w:val="Compact"/>
+                    <w:jc w:val="center"/>
+                    <w:jc w:val="center"/>
+                  </w:pPr>
+                  <w:r>
+                    <w:t xml:space="preserve">TLI</w:t>
+                  </w:r>
+                </w:p>
+              </w:tc>
+            </w:tr>
+            <w:tr>
+              <w:tc>
+                <w:tcPr/>
+                <w:p>
+                  <w:pPr>
+                    <w:pStyle w:val="Compact"/>
+                    <w:jc w:val="center"/>
+                  </w:pPr>
+                  <w:r>
+                    <w:t xml:space="preserve">Power</w:t>
+                  </w:r>
+                </w:p>
+              </w:tc>
+              <w:tc>
+                <w:tcPr/>
+                <w:p>
+                  <w:pPr>
+                    <w:pStyle w:val="Compact"/>
+                    <w:jc w:val="center"/>
+                    <w:jc w:val="center"/>
+                  </w:pPr>
+                  <w:r>
+                    <w:t xml:space="preserve">1.000</w:t>
+                  </w:r>
+                </w:p>
+              </w:tc>
+              <w:tc>
+                <w:tcPr/>
+                <w:p>
+                  <w:pPr>
+                    <w:pStyle w:val="Compact"/>
+                    <w:jc w:val="center"/>
+                    <w:jc w:val="center"/>
+                  </w:pPr>
+                  <w:r>
+                    <w:t xml:space="preserve">1.000</w:t>
+                  </w:r>
+                </w:p>
+              </w:tc>
+              <w:tc>
+                <w:tcPr/>
+                <w:p>
+                  <w:pPr>
+                    <w:pStyle w:val="Compact"/>
+                    <w:jc w:val="center"/>
+                    <w:jc w:val="center"/>
+                  </w:pPr>
+                  <w:r>
+                    <w:t xml:space="preserve">1.000</w:t>
+                  </w:r>
+                </w:p>
+              </w:tc>
+              <w:tc>
+                <w:tcPr/>
+                <w:p>
+                  <w:pPr>
+                    <w:pStyle w:val="Compact"/>
+                    <w:jc w:val="center"/>
+                    <w:jc w:val="center"/>
+                  </w:pPr>
+                  <w:r>
+                    <w:t xml:space="preserve">1.000</w:t>
+                  </w:r>
+                </w:p>
+              </w:tc>
+              <w:tc>
+                <w:tcPr/>
+                <w:p>
+                  <w:pPr>
+                    <w:pStyle w:val="Compact"/>
+                    <w:jc w:val="center"/>
+                    <w:jc w:val="center"/>
+                  </w:pPr>
+                  <w:r>
+                    <w:t xml:space="preserve">1.000</w:t>
+                  </w:r>
+                </w:p>
+              </w:tc>
+            </w:tr>
+            <w:tr>
+              <w:tc>
+                <w:tcPr/>
+                <w:p>
+                  <w:pPr>
+                    <w:pStyle w:val="Compact"/>
+                    <w:jc w:val="center"/>
+                  </w:pPr>
+                  <w:r>
+                    <w:t xml:space="preserve">Cutoff</w:t>
+                  </w:r>
+                </w:p>
+              </w:tc>
+              <w:tc>
+                <w:tcPr/>
+                <w:p>
+                  <w:pPr>
+                    <w:pStyle w:val="Compact"/>
+                    <w:jc w:val="center"/>
+                    <w:jc w:val="center"/>
+                  </w:pPr>
+                  <w:r>
+                    <w:t xml:space="preserve">0.025</w:t>
+                  </w:r>
+                </w:p>
+              </w:tc>
+              <w:tc>
+                <w:tcPr/>
+                <w:p>
+                  <w:pPr>
+                    <w:pStyle w:val="Compact"/>
+                    <w:jc w:val="center"/>
+                    <w:jc w:val="center"/>
+                  </w:pPr>
+                  <w:r>
+                    <w:t xml:space="preserve">0.042</w:t>
+                  </w:r>
+                </w:p>
+              </w:tc>
+              <w:tc>
+                <w:tcPr/>
+                <w:p>
+                  <w:pPr>
+                    <w:pStyle w:val="Compact"/>
+                    <w:jc w:val="center"/>
+                    <w:jc w:val="center"/>
+                  </w:pPr>
+                  <w:r>
+                    <w:t xml:space="preserve">0.988</w:t>
+                  </w:r>
+                </w:p>
+              </w:tc>
+              <w:tc>
+                <w:tcPr/>
+                <w:p>
+                  <w:pPr>
+                    <w:pStyle w:val="Compact"/>
+                    <w:jc w:val="center"/>
+                    <w:jc w:val="center"/>
+                  </w:pPr>
+                  <w:r>
+                    <w:t xml:space="preserve">0.986</w:t>
+                  </w:r>
+                </w:p>
+              </w:tc>
+              <w:tc>
+                <w:tcPr/>
+                <w:p>
+                  <w:pPr>
+                    <w:pStyle w:val="Compact"/>
+                    <w:jc w:val="center"/>
+                    <w:jc w:val="center"/>
+                  </w:pPr>
+                  <w:r>
+                    <w:t xml:space="preserve">0.025</w:t>
+                  </w:r>
+                </w:p>
+              </w:tc>
+            </w:tr>
+          </w:tbl>
+          <w:bookmarkEnd w:id="178"/>
+          <w:p/>
+        </w:tc>
+      </w:tr>
+    </w:tbl>
+    <w:p>
+      <w:pPr>
+        <w:pStyle w:val="BodyText"/>
+      </w:pPr>
+      <w:r>
+        <w:rPr>
+          <w:vertAlign w:val="subscript"/>
+        </w:rPr>
+        <w:t xml:space="preserve">Source:</w:t>
+      </w:r>
+      <w:r>
+        <w:rPr>
+          <w:vertAlign w:val="subscript"/>
+        </w:rPr>
+        <w:t xml:space="preserve"> </w:t>
+      </w:r>
+      <w:hyperlink r:id="rId179">
+        <w:r>
+          <w:rPr>
+            <w:rStyle w:val="Hyperlink"/>
+            <w:vertAlign w:val="subscript"/>
+          </w:rPr>
+          <w:t xml:space="preserve">Simulation with Fixed Sample Size</w:t>
+        </w:r>
+      </w:hyperlink>
+    </w:p>
+    <w:bookmarkStart w:id="187" w:name="power-analysis-with-traditional-fits"/>
+    <w:p>
+      <w:pPr>
+        <w:pStyle w:val="Heading4"/>
+      </w:pPr>
+      <w:r>
+        <w:t xml:space="preserve">6.3.1 Power analysis with traditional fits</w:t>
+      </w:r>
+    </w:p>
+    <w:p>
+      <w:pPr>
+        <w:pStyle w:val="FirstParagraph"/>
+      </w:pPr>
+      <w:r>
+        <w:t xml:space="preserve">The illustration based on traditional rule-of-thumb cutoffs leads to a very different picture. Under those generic thresholds, power remains very high for SRMR, but becomes weak for CFI and TLI and drops to zero for RMSEA (</w:t>
+      </w:r>
+      <w:hyperlink w:anchor="fig-curve-fixed-traditional">
+        <w:r>
+          <w:rPr>
+            <w:rStyle w:val="Hyperlink"/>
+          </w:rPr>
+          <w:t xml:space="preserve">Figure 20</w:t>
+        </w:r>
+      </w:hyperlink>
+      <w:r>
+        <w:t xml:space="preserve">). This contrast shows that conventional cutoffs may be poorly aligned with the sampling behavior of a specific model and can therefore understate the discriminating capacity revealed by the empirical simulation-based approach.</w:t>
+      </w:r>
+    </w:p>
+    <w:tbl>
+      <w:tblPr>
+        <w:tblStyle w:val="Table"/>
+        <w:tblW w:type="pct" w:w="5000"/>
+        <w:tblLayout w:type="fixed"/>
+        <w:tblLook w:firstRow="0" w:lastRow="0" w:firstColumn="0" w:lastColumn="0" w:noHBand="0" w:noVBand="0" w:val="0000"/>
+      </w:tblPr>
+      <w:tblGrid>
+        <w:gridCol w:w="7920"/>
+      </w:tblGrid>
+      <w:tr>
+        <w:tc>
+          <w:tcPr/>
+          <w:bookmarkStart w:id="183" w:name="fig-curve-fixed-traditional"/>
+          <w:p>
+            <w:pPr>
+              <w:pStyle w:val="Compact"/>
+              <w:jc w:val="center"/>
+            </w:pPr>
+            <w:r>
+              <w:drawing>
+                <wp:inline>
+                  <wp:extent cx="5334000" cy="3333749"/>
+                  <wp:effectExtent b="0" l="0" r="0" t="0"/>
+                  <wp:docPr descr="" title="" id="181" name="Picture"/>
+                  <a:graphic>
+                    <a:graphicData uri="http://schemas.openxmlformats.org/drawingml/2006/picture">
+                      <pic:pic>
+                        <pic:nvPicPr>
+                          <pic:cNvPr descr="index_files/figure-docx/Scripts-AnalysisScripts-05_model_comparison-fig-curve-fixed-traditional-output-1.png" id="182" name="Picture"/>
+                          <pic:cNvPicPr>
+                            <a:picLocks noChangeArrowheads="1" noChangeAspect="1"/>
+                          </pic:cNvPicPr>
+                        </pic:nvPicPr>
+                        <pic:blipFill>
+                          <a:blip r:embed="rId180"/>
+                          <a:stretch>
+                            <a:fillRect/>
+                          </a:stretch>
+                        </pic:blipFill>
+                        <pic:spPr bwMode="auto">
+                          <a:xfrm>
+                            <a:off x="0" y="0"/>
+                            <a:ext cx="5334000" cy="3333749"/>
+                          </a:xfrm>
+                          <a:prstGeom prst="rect">
+                            <a:avLst/>
+                          </a:prstGeom>
+                          <a:noFill/>
+                          <a:ln w="9525">
+                            <a:noFill/>
+                            <a:headEnd/>
+                            <a:tailEnd/>
+                          </a:ln>
+                        </pic:spPr>
+                      </pic:pic>
+                    </a:graphicData>
+                  </a:graphic>
+                </wp:inline>
+              </w:drawing>
+            </w:r>
+          </w:p>
+          <w:p>
+            <w:pPr>
+              <w:jc w:val="center"/>
+            </w:pPr>
+            <w:pPr>
+              <w:jc w:val="left"/>
+              <w:spacing w:before="200"/>
+              <w:pStyle w:val="ImageCaption"/>
+            </w:pPr>
+            <w:r>
+              <w:t xml:space="preserve">Figure 20: Power curves using traditional fit index cutoffs with fixed sample size.</w:t>
+            </w:r>
+          </w:p>
+          <w:bookmarkEnd w:id="183"/>
+        </w:tc>
+      </w:tr>
+    </w:tbl>
+    <w:p>
+      <w:pPr>
+        <w:pStyle w:val="BodyText"/>
+      </w:pPr>
+      <w:r>
+        <w:rPr>
+          <w:vertAlign w:val="subscript"/>
+        </w:rPr>
+        <w:t xml:space="preserve">Source:</w:t>
+      </w:r>
+      <w:r>
+        <w:rPr>
+          <w:vertAlign w:val="subscript"/>
+        </w:rPr>
+        <w:t xml:space="preserve"> </w:t>
+      </w:r>
+      <w:hyperlink r:id="rId184">
+        <w:r>
+          <w:rPr>
+            <w:rStyle w:val="Hyperlink"/>
+            <w:vertAlign w:val="subscript"/>
+          </w:rPr>
+          <w:t xml:space="preserve">Simulation with Fixed Sample Size</w:t>
+        </w:r>
+      </w:hyperlink>
+    </w:p>
+    <w:p>
+      <w:pPr>
+        <w:pStyle w:val="BodyText"/>
+      </w:pPr>
+      <w:r>
+        <w:t xml:space="preserve">Taken together, these results reinforce the main methodological message of this section: in Monte Carlo power analysis for CFA model fit, the adequacy of a fixed sample size depends not only on</w:t>
+      </w:r>
+      <w:r>
+        <w:t xml:space="preserve"> </w:t>
+      </w:r>
+      <m:oMath>
+        <m:r>
+          <m:t>N</m:t>
+        </m:r>
+      </m:oMath>
+      <w:r>
+        <w:t xml:space="preserve"> </w:t>
+      </w:r>
+      <w:r>
+        <w:t xml:space="preserve">itself, but also on how the rejection criterion is defined. When cutoffs are calibrated to the population model and to the planned analysis, the chosen</w:t>
+      </w:r>
+      <w:r>
+        <w:t xml:space="preserve"> </w:t>
+      </w:r>
+      <m:oMath>
+        <m:r>
+          <m:t>N</m:t>
+        </m:r>
+      </m:oMath>
+      <w:r>
+        <w:t xml:space="preserve"> </w:t>
+      </w:r>
+      <w:r>
+        <w:t xml:space="preserve">performs as a highly stable basis for global fit evaluation in the main comparison of the tutorial</w:t>
+      </w:r>
+      <w:r>
+        <w:t xml:space="preserve"> </w:t>
+      </w:r>
+      <w:r>
+        <w:t xml:space="preserve">(Feng &amp; Hancock, 2023; Jak et al., 2021; Moshagen &amp; Bader, 2024; Pornprasertmanit et al., 2021)</w:t>
+      </w:r>
+      <w:r>
+        <w:t xml:space="preserve">.</w:t>
+      </w:r>
+    </w:p>
+    <w:tbl>
+      <w:tblPr>
+        <w:tblStyle w:val="Table"/>
+        <w:tblW w:type="pct" w:w="5000"/>
+        <w:tblLayout w:type="fixed"/>
+        <w:tblLook w:firstRow="0" w:lastRow="0" w:firstColumn="0" w:lastColumn="0" w:noHBand="0" w:noVBand="0" w:val="0000"/>
+      </w:tblPr>
+      <w:tblGrid>
+        <w:gridCol w:w="7920"/>
+      </w:tblGrid>
+      <w:tr>
+        <w:tc>
+          <w:tcPr/>
+          <w:bookmarkStart w:id="185" w:name="tbl-power-cutoff-traditional"/>
+          <w:p>
+            <w:pPr>
+              <w:jc w:val="center"/>
+            </w:pPr>
+            <w:pPr>
+              <w:jc w:val="left"/>
+              <w:spacing w:before="200"/>
+              <w:pStyle w:val="ImageCaption"/>
+            </w:pPr>
+            <w:r>
+              <w:t xml:space="preserve">Table 15: Power for traditional fit index cutoffs with fixed sample size.</w:t>
+            </w:r>
+          </w:p>
+          <w:tbl>
+            <w:tblPr>
+              <w:tblStyle w:val="Table"/>
+              <w:tblW w:type="auto" w:w="0"/>
+              <w:tblLook w:firstRow="1" w:lastRow="0" w:firstColumn="0" w:lastColumn="0" w:noHBand="0" w:noVBand="0" w:val="0020"/>
+            </w:tblPr>
+            <w:tblGrid>
+              <w:gridCol w:w="1584"/>
+              <w:gridCol w:w="1584"/>
+              <w:gridCol w:w="1584"/>
+              <w:gridCol w:w="1584"/>
+              <w:gridCol w:w="1584"/>
+            </w:tblGrid>
+            <w:tr>
+              <w:trPr>
+                <w:tblHeader w:val="on"/>
+              </w:trPr>
+              <w:tc>
+                <w:tcPr/>
+                <w:p>
+                  <w:pPr>
+                    <w:pStyle w:val="Compact"/>
+                  </w:pPr>
+                </w:p>
+              </w:tc>
+              <w:tc>
+                <w:tcPr/>
+                <w:p>
+                  <w:pPr>
+                    <w:pStyle w:val="Compact"/>
+                    <w:jc w:val="center"/>
+                    <w:jc w:val="center"/>
+                  </w:pPr>
+                  <w:r>
+                    <w:t xml:space="preserve">CFI</w:t>
+                  </w:r>
+                </w:p>
+              </w:tc>
+              <w:tc>
+                <w:tcPr/>
+                <w:p>
+                  <w:pPr>
+                    <w:pStyle w:val="Compact"/>
+                    <w:jc w:val="center"/>
+                    <w:jc w:val="center"/>
+                  </w:pPr>
+                  <w:r>
+                    <w:t xml:space="preserve">TLI</w:t>
+                  </w:r>
+                </w:p>
+              </w:tc>
+              <w:tc>
+                <w:tcPr/>
+                <w:p>
+                  <w:pPr>
+                    <w:pStyle w:val="Compact"/>
+                    <w:jc w:val="center"/>
+                    <w:jc w:val="center"/>
+                  </w:pPr>
+                  <w:r>
+                    <w:t xml:space="preserve">RMSEA</w:t>
+                  </w:r>
+                </w:p>
+              </w:tc>
+              <w:tc>
+                <w:tcPr/>
+                <w:p>
+                  <w:pPr>
+                    <w:pStyle w:val="Compact"/>
+                    <w:jc w:val="center"/>
+                    <w:jc w:val="center"/>
+                  </w:pPr>
+                  <w:r>
+                    <w:t xml:space="preserve">SRMR</w:t>
+                  </w:r>
+                </w:p>
+              </w:tc>
+            </w:tr>
+            <w:tr>
+              <w:tc>
+                <w:tcPr/>
+                <w:p>
+                  <w:pPr>
+                    <w:pStyle w:val="Compact"/>
+                    <w:jc w:val="center"/>
+                  </w:pPr>
+                  <w:r>
+                    <w:t xml:space="preserve">Power</w:t>
+                  </w:r>
+                </w:p>
+              </w:tc>
+              <w:tc>
+                <w:tcPr/>
+                <w:p>
+                  <w:pPr>
+                    <w:pStyle w:val="Compact"/>
+                    <w:jc w:val="center"/>
+                    <w:jc w:val="center"/>
+                  </w:pPr>
+                  <w:r>
+                    <w:t xml:space="preserve">0.222</w:t>
+                  </w:r>
+                </w:p>
+              </w:tc>
+              <w:tc>
+                <w:tcPr/>
+                <w:p>
+                  <w:pPr>
+                    <w:pStyle w:val="Compact"/>
+                    <w:jc w:val="center"/>
+                    <w:jc w:val="center"/>
+                  </w:pPr>
+                  <w:r>
+                    <w:t xml:space="preserve">0.483</w:t>
+                  </w:r>
+                </w:p>
+              </w:tc>
+              <w:tc>
+                <w:tcPr/>
+                <w:p>
+                  <w:pPr>
+                    <w:pStyle w:val="Compact"/>
+                    <w:jc w:val="center"/>
+                    <w:jc w:val="center"/>
+                  </w:pPr>
+                  <w:r>
+                    <w:t xml:space="preserve">0</w:t>
+                  </w:r>
+                </w:p>
+              </w:tc>
+              <w:tc>
+                <w:tcPr/>
+                <w:p>
+                  <w:pPr>
+                    <w:pStyle w:val="Compact"/>
+                    <w:jc w:val="center"/>
+                    <w:jc w:val="center"/>
+                  </w:pPr>
+                  <w:r>
+                    <w:t xml:space="preserve">0.997</w:t>
+                  </w:r>
+                </w:p>
+              </w:tc>
+            </w:tr>
+          </w:tbl>
+          <w:bookmarkEnd w:id="185"/>
+          <w:p/>
+        </w:tc>
+      </w:tr>
+    </w:tbl>
+    <w:p>
+      <w:pPr>
+        <w:pStyle w:val="BodyText"/>
+      </w:pPr>
+      <w:r>
+        <w:rPr>
+          <w:vertAlign w:val="subscript"/>
+        </w:rPr>
+        <w:t xml:space="preserve">Source:</w:t>
+      </w:r>
+      <w:r>
+        <w:rPr>
+          <w:vertAlign w:val="subscript"/>
+        </w:rPr>
+        <w:t xml:space="preserve"> </w:t>
+      </w:r>
+      <w:hyperlink r:id="rId186">
+        <w:r>
+          <w:rPr>
+            <w:rStyle w:val="Hyperlink"/>
+            <w:vertAlign w:val="subscript"/>
+          </w:rPr>
+          <w:t xml:space="preserve">Simulation with Fixed Sample Size</w:t>
+        </w:r>
+      </w:hyperlink>
+    </w:p>
+    <w:bookmarkEnd w:id="187"/>
+    <w:bookmarkEnd w:id="188"/>
+    <w:bookmarkEnd w:id="189"/>
+    <w:bookmarkStart w:id="212" w:name="sec-post-hoc"/>
     <w:p>
       <w:pPr>
         <w:pStyle w:val="Heading2"/>
       </w:pPr>
       <w:r>
+        <w:t xml:space="preserve">7 Post Hoc Power Analysis</w:t>
+      </w:r>
+    </w:p>
+    <w:p>
+      <w:pPr>
+        <w:pStyle w:val="FirstParagraph"/>
+      </w:pPr>
+      <w:r>
+        <w:t xml:space="preserve">Post hoc power analysis is used to evaluate how likely the study design was to reject a false structural model under the conditions actually assumed in the analysis, that is, with the fitted model, the reference model, the selected fit criteria, and the observed sample size already fixed. In SEM, this type of assessment is meaningful only with respect to a clearly defined focal hypothesis, because power is always attached to a specific model comparison rather than to a model in general</w:t>
+      </w:r>
+      <w:r>
+        <w:t xml:space="preserve"> </w:t>
+      </w:r>
+      <w:r>
+        <w:t xml:space="preserve">(Jobst et al., 2023; Moshagen &amp; Bader, 2024)</w:t>
+      </w:r>
+      <w:r>
+        <w:t xml:space="preserve">.</w:t>
+      </w:r>
+    </w:p>
+    <w:p>
+      <w:pPr>
+        <w:pStyle w:val="BodyText"/>
+      </w:pPr>
+      <w:r>
+        <w:t xml:space="preserve">In this section, power is framed as the probability of identifying global misspecification, not as the probability of detecting an individual parameter. More specifically, the focus is on whether the hypothesized model can be rejected when the data-generating process follows an alternative structure, using fit-index thresholds derived from the null-model distribution at level</w:t>
+      </w:r>
+      <w:r>
+        <w:t xml:space="preserve"> </w:t>
+      </w:r>
+      <m:oMath>
+        <m:r>
+          <m:t>α</m:t>
+        </m:r>
+      </m:oMath>
+      <w:r>
+        <w:t xml:space="preserve"> </w:t>
+      </w:r>
+      <w:r>
+        <w:t xml:space="preserve">(Jobst et al., 2023; Pornprasertmanit et al., 2021)</w:t>
+      </w:r>
+      <w:r>
+        <w:t xml:space="preserve">.</w:t>
+      </w:r>
+    </w:p>
+    <w:bookmarkStart w:id="195" w:name="with-simulation"/>
+    <w:p>
+      <w:pPr>
+        <w:pStyle w:val="Heading3"/>
+      </w:pPr>
+      <w:r>
+        <w:t xml:space="preserve">7.1 With Simulation</w:t>
+      </w:r>
+    </w:p>
+    <w:p>
+      <w:pPr>
+        <w:pStyle w:val="FirstParagraph"/>
+      </w:pPr>
+      <w:r>
+        <w:t xml:space="preserve">This simulation-based strategy is especially useful when the effect of interest is defined in model terms, because the discrepancy between</w:t>
+      </w:r>
+      <w:r>
+        <w:t xml:space="preserve"> </w:t>
+      </w:r>
+      <m:oMath>
+        <m:sSub>
+          <m:e>
+            <m:r>
+              <m:t>H</m:t>
+            </m:r>
+          </m:e>
+          <m:sub>
+            <m:r>
+              <m:t>0</m:t>
+            </m:r>
+          </m:sub>
+        </m:sSub>
+      </m:oMath>
+      <w:r>
+        <w:t xml:space="preserve"> </w:t>
+      </w:r>
+      <w:r>
+        <w:t xml:space="preserve">and</w:t>
+      </w:r>
+      <w:r>
+        <w:t xml:space="preserve"> </w:t>
+      </w:r>
+      <m:oMath>
+        <m:sSub>
+          <m:e>
+            <m:r>
+              <m:t>H</m:t>
+            </m:r>
+          </m:e>
+          <m:sub>
+            <m:r>
+              <m:t>1</m:t>
+            </m:r>
+          </m:sub>
+        </m:sSub>
+      </m:oMath>
+      <w:r>
+        <w:t xml:space="preserve"> </w:t>
+      </w:r>
+      <w:r>
+        <w:t xml:space="preserve">depends on the full parameterization of the model, not only on one isolated misspecification. In other words, the same nominal discrepancy may imply different statistical power depending on factor loadings, residual structure, latent correlations, and other features of the population model</w:t>
+      </w:r>
+      <w:r>
+        <w:t xml:space="preserve"> </w:t>
+      </w:r>
+      <w:r>
+        <w:t xml:space="preserve">(Moshagen &amp; Bader, 2024; Wang, 2023)</w:t>
+      </w:r>
+      <w:r>
+        <w:t xml:space="preserve">.</w:t>
+      </w:r>
+    </w:p>
+    <w:tbl>
+      <w:tblPr>
+        <w:tblStyle w:val="Table"/>
+        <w:tblW w:type="pct" w:w="5000"/>
+        <w:tblLayout w:type="fixed"/>
+        <w:tblLook w:firstRow="0" w:lastRow="0" w:firstColumn="0" w:lastColumn="0" w:noHBand="0" w:noVBand="0" w:val="0000"/>
+      </w:tblPr>
+      <w:tblGrid>
+        <w:gridCol w:w="7920"/>
+      </w:tblGrid>
+      <w:tr>
+        <w:tc>
+          <w:tcPr/>
+          <w:bookmarkStart w:id="193" w:name="fig-posthoc-plotpower"/>
+          <w:p>
+            <w:pPr>
+              <w:pStyle w:val="Compact"/>
+              <w:jc w:val="center"/>
+            </w:pPr>
+            <w:r>
+              <w:drawing>
+                <wp:inline>
+                  <wp:extent cx="5334000" cy="3333749"/>
+                  <wp:effectExtent b="0" l="0" r="0" t="0"/>
+                  <wp:docPr descr="" title="" id="191" name="Picture"/>
+                  <a:graphic>
+                    <a:graphicData uri="http://schemas.openxmlformats.org/drawingml/2006/picture">
+                      <pic:pic>
+                        <pic:nvPicPr>
+                          <pic:cNvPr descr="index_files/figure-docx/Scripts-AnalysisScripts-06_posthoc-fig-posthoc-plotpower-output-1.png" id="192" name="Picture"/>
+                          <pic:cNvPicPr>
+                            <a:picLocks noChangeArrowheads="1" noChangeAspect="1"/>
+                          </pic:cNvPicPr>
+                        </pic:nvPicPr>
+                        <pic:blipFill>
+                          <a:blip r:embed="rId190"/>
+                          <a:stretch>
+                            <a:fillRect/>
+                          </a:stretch>
+                        </pic:blipFill>
+                        <pic:spPr bwMode="auto">
+                          <a:xfrm>
+                            <a:off x="0" y="0"/>
+                            <a:ext cx="5334000" cy="3333749"/>
+                          </a:xfrm>
+                          <a:prstGeom prst="rect">
+                            <a:avLst/>
+                          </a:prstGeom>
+                          <a:noFill/>
+                          <a:ln w="9525">
+                            <a:noFill/>
+                            <a:headEnd/>
+                            <a:tailEnd/>
+                          </a:ln>
+                        </pic:spPr>
+                      </pic:pic>
+                    </a:graphicData>
+                  </a:graphic>
+                </wp:inline>
+              </w:drawing>
+            </w:r>
+          </w:p>
+          <w:p>
+            <w:pPr>
+              <w:jc w:val="center"/>
+            </w:pPr>
+            <w:pPr>
+              <w:jc w:val="left"/>
+              <w:spacing w:before="200"/>
+              <w:pStyle w:val="ImageCaption"/>
+            </w:pPr>
+            <w:r>
+              <w:t xml:space="preserve">Figure 21: Power curve for post hoc analysis based on simulation.</w:t>
+            </w:r>
+          </w:p>
+          <w:bookmarkEnd w:id="193"/>
+        </w:tc>
+      </w:tr>
+    </w:tbl>
+    <w:p>
+      <w:pPr>
+        <w:pStyle w:val="BodyText"/>
+      </w:pPr>
+      <w:r>
+        <w:rPr>
+          <w:vertAlign w:val="subscript"/>
+        </w:rPr>
+        <w:t xml:space="preserve">Source:</w:t>
+      </w:r>
+      <w:r>
+        <w:rPr>
+          <w:vertAlign w:val="subscript"/>
+        </w:rPr>
+        <w:t xml:space="preserve"> </w:t>
+      </w:r>
+      <w:hyperlink r:id="rId194">
+        <w:r>
+          <w:rPr>
+            <w:rStyle w:val="Hyperlink"/>
+            <w:vertAlign w:val="subscript"/>
+          </w:rPr>
+          <w:t xml:space="preserve">Post Hoc Power Analysis</w:t>
+        </w:r>
+      </w:hyperlink>
+    </w:p>
+    <w:p>
+      <w:pPr>
+        <w:pStyle w:val="BodyText"/>
+      </w:pPr>
+      <w:r>
+        <w:t xml:space="preserve">All four fit indices reached power equal to</w:t>
+      </w:r>
+      <w:r>
+        <w:t xml:space="preserve"> </w:t>
+      </w:r>
+      <m:oMath>
+        <m:r>
+          <m:t>1.00</m:t>
+        </m:r>
+      </m:oMath>
+      <w:r>
+        <w:t xml:space="preserve">. This means that, in the simulated replications, RMSEA, SRMR, CFI, and TLI all rejected the alternative condition in</w:t>
+      </w:r>
+      <w:r>
+        <w:t xml:space="preserve"> </w:t>
+      </w:r>
+      <m:oMath>
+        <m:r>
+          <m:t>100</m:t>
+        </m:r>
+        <m:r>
+          <m:rPr>
+            <m:sty m:val="p"/>
+          </m:rPr>
+          <m:t>%</m:t>
+        </m:r>
+      </m:oMath>
+      <w:r>
+        <w:t xml:space="preserve"> </w:t>
+      </w:r>
+      <w:r>
+        <w:t xml:space="preserve">of cases according to their respective cutoff rules.</w:t>
+      </w:r>
+    </w:p>
+    <w:p>
+      <w:pPr>
+        <w:pStyle w:val="BodyText"/>
+      </w:pPr>
+      <w:r>
+        <w:t xml:space="preserve">The</w:t>
+      </w:r>
+      <w:r>
+        <w:t xml:space="preserve"> </w:t>
+      </w:r>
+      <w:hyperlink w:anchor="fig-posthoc-plotpower">
+        <w:r>
+          <w:rPr>
+            <w:rStyle w:val="Hyperlink"/>
+          </w:rPr>
+          <w:t xml:space="preserve">Figure 21</w:t>
+        </w:r>
+      </w:hyperlink>
+      <w:r>
+        <w:t xml:space="preserve"> </w:t>
+      </w:r>
+      <w:r>
+        <w:t xml:space="preserve">is fully consistent with these values. In every panel, the null and alternative distributions are clearly separated, and the red cutoff line falls between them with no visible overlap.</w:t>
+      </w:r>
+    </w:p>
+    <w:p>
+      <w:pPr>
+        <w:pStyle w:val="BodyText"/>
+      </w:pPr>
+      <w:r>
+        <w:t xml:space="preserve">For RMSEA, the null distribution is concentrated near zero, whereas the alternative distribution is centered around approximately</w:t>
+      </w:r>
+      <w:r>
+        <w:t xml:space="preserve"> </w:t>
+      </w:r>
+      <m:oMath>
+        <m:r>
+          <m:t>0.05</m:t>
+        </m:r>
+      </m:oMath>
+      <w:r>
+        <w:t xml:space="preserve">. The cutoff is located between these two regions, so all alternative replications fall on the rejection side.</w:t>
+      </w:r>
+    </w:p>
+    <w:p>
+      <w:pPr>
+        <w:pStyle w:val="BodyText"/>
+      </w:pPr>
+      <w:r>
+        <w:t xml:space="preserve">For SRMR, the null distribution is clustered around approximately</w:t>
+      </w:r>
+      <w:r>
+        <w:t xml:space="preserve"> </w:t>
+      </w:r>
+      <m:oMath>
+        <m:r>
+          <m:t>0.01</m:t>
+        </m:r>
+      </m:oMath>
+      <w:r>
+        <w:t xml:space="preserve"> </w:t>
+      </w:r>
+      <w:r>
+        <w:t xml:space="preserve">to</w:t>
+      </w:r>
+      <w:r>
+        <w:t xml:space="preserve"> </w:t>
+      </w:r>
+      <m:oMath>
+        <m:r>
+          <m:t>0.02</m:t>
+        </m:r>
+      </m:oMath>
+      <w:r>
+        <w:t xml:space="preserve">, while the alternative distribution is concentrated around approximately</w:t>
+      </w:r>
+      <w:r>
+        <w:t xml:space="preserve"> </w:t>
+      </w:r>
+      <m:oMath>
+        <m:r>
+          <m:t>0.06</m:t>
+        </m:r>
+      </m:oMath>
+      <w:r>
+        <w:t xml:space="preserve"> </w:t>
+      </w:r>
+      <w:r>
+        <w:t xml:space="preserve">to</w:t>
+      </w:r>
+      <w:r>
+        <w:t xml:space="preserve"> </w:t>
+      </w:r>
+      <m:oMath>
+        <m:r>
+          <m:t>0.08</m:t>
+        </m:r>
+      </m:oMath>
+      <w:r>
+        <w:t xml:space="preserve">. The separation is complete, which explains the power of</w:t>
+      </w:r>
+      <w:r>
+        <w:t xml:space="preserve"> </w:t>
+      </w:r>
+      <m:oMath>
+        <m:r>
+          <m:t>1.00</m:t>
+        </m:r>
+      </m:oMath>
+      <w:r>
+        <w:t xml:space="preserve">.</w:t>
+      </w:r>
+    </w:p>
+    <w:p>
+      <w:pPr>
+        <w:pStyle w:val="BodyText"/>
+      </w:pPr>
+      <w:r>
+        <w:t xml:space="preserve">For CFI/TLI, the null distribution is concentrated very close to</w:t>
+      </w:r>
+      <w:r>
+        <w:t xml:space="preserve"> </w:t>
+      </w:r>
+      <m:oMath>
+        <m:r>
+          <m:t>1.00</m:t>
+        </m:r>
+      </m:oMath>
+      <w:r>
+        <w:t xml:space="preserve">, whereas the alternative distribution is centered around approximately</w:t>
+      </w:r>
+      <w:r>
+        <w:t xml:space="preserve"> </w:t>
+      </w:r>
+      <m:oMath>
+        <m:r>
+          <m:t>0.95</m:t>
+        </m:r>
+      </m:oMath>
+      <w:r>
+        <w:t xml:space="preserve"> </w:t>
+      </w:r>
+      <w:r>
+        <w:t xml:space="preserve">to</w:t>
+      </w:r>
+      <w:r>
+        <w:t xml:space="preserve"> </w:t>
+      </w:r>
+      <m:oMath>
+        <m:r>
+          <m:t>0.97</m:t>
+        </m:r>
+      </m:oMath>
+      <w:r>
+        <w:t xml:space="preserve">. The cutoff line is placed between the two distributions, so every alternative replication is correctly classified.</w:t>
+      </w:r>
+    </w:p>
+    <w:p>
+      <w:pPr>
+        <w:pStyle w:val="BodyText"/>
+      </w:pPr>
+      <w:r>
+        <w:t xml:space="preserve">Overall, the graphical pattern indicates perfect empirical discrimination for all four indices in this post hoc analysis. In practical terms, the results show no ambiguity in classification: the null and alternative conditions are entirely distinct for RMSEA, SRMR, CFI, and TLI. But note that RMSEA, CFI, and TLI are operating at the below the conventional threshold, which is a consequence of the specific cutoff values derived from the null-model distribution in this scenario.</w:t>
+      </w:r>
+    </w:p>
+    <w:bookmarkEnd w:id="195"/>
+    <w:bookmarkStart w:id="211" w:name="with-analytical-solutions"/>
+    <w:p>
+      <w:pPr>
+        <w:pStyle w:val="Heading3"/>
+      </w:pPr>
+      <w:r>
+        <w:t xml:space="preserve">7.2 With Analytical Solutions</w:t>
+      </w:r>
+    </w:p>
+    <w:p>
+      <w:pPr>
+        <w:pStyle w:val="FirstParagraph"/>
+      </w:pPr>
+      <w:r>
+        <w:t xml:space="preserve">In analytical power analysis, the effect is expressed through a noncentrality-based measure such as</w:t>
+      </w:r>
+      <w:r>
+        <w:t xml:space="preserve"> </w:t>
+      </w:r>
+      <m:oMath>
+        <m:sSub>
+          <m:e>
+            <m:r>
+              <m:t>F</m:t>
+            </m:r>
+          </m:e>
+          <m:sub>
+            <m:r>
+              <m:t>0</m:t>
+            </m:r>
+          </m:sub>
+        </m:sSub>
+      </m:oMath>
+      <w:r>
+        <w:t xml:space="preserve"> </w:t>
+      </w:r>
+      <w:r>
+        <w:t xml:space="preserve">or RMSEA, because these quantities map directly onto the noncentrality parameter used in the likelihood-ratio test. For that reason, analytical post hoc power is especially convenient when the goal is to assess sensitivity to global model misfit without relying on simulation-based estimation</w:t>
+      </w:r>
+      <w:r>
+        <w:t xml:space="preserve"> </w:t>
+      </w:r>
+      <w:r>
+        <w:t xml:space="preserve">(Jak et al., 2021; Moshagen &amp; Bader, 2024)</w:t>
+      </w:r>
+      <w:r>
+        <w:t xml:space="preserve">.</w:t>
+      </w:r>
+    </w:p>
+    <w:p>
+      <w:pPr>
+        <w:pStyle w:val="BodyText"/>
+      </w:pPr>
+      <w:r>
+        <w:t xml:space="preserve">The first specification (</w:t>
+      </w:r>
+      <w:hyperlink w:anchor="fig-posthoc-rmsea">
+        <w:r>
+          <w:rPr>
+            <w:rStyle w:val="Hyperlink"/>
+          </w:rPr>
+          <w:t xml:space="preserve">Figure 22</w:t>
+        </w:r>
+      </w:hyperlink>
+      <w:r>
+        <w:t xml:space="preserve">) is model-free in the sense that the focal discrepancy is supplied directly as</w:t>
+      </w:r>
+      <w:r>
+        <w:t xml:space="preserve"> </w:t>
+      </w:r>
+      <m:oMath>
+        <m:r>
+          <m:t>R</m:t>
+        </m:r>
+        <m:r>
+          <m:t>M</m:t>
+        </m:r>
+        <m:r>
+          <m:t>S</m:t>
+        </m:r>
+        <m:r>
+          <m:t>E</m:t>
+        </m:r>
+        <m:r>
+          <m:t>A</m:t>
+        </m:r>
+        <m:r>
+          <m:rPr>
+            <m:sty m:val="p"/>
+          </m:rPr>
+          <m:t>=</m:t>
+        </m:r>
+        <m:r>
+          <m:t>0.05</m:t>
+        </m:r>
+      </m:oMath>
+      <w:r>
+        <w:t xml:space="preserve">, so power is evaluated for a global test of exact fit rather than for a specific substantive parameter. Conceptually, this treats misspecification as an overall degree of lack of fit per degree of freedom, which makes the analysis comparable across different SEM families as long as the same effect metric is used</w:t>
+      </w:r>
+      <w:r>
+        <w:t xml:space="preserve"> </w:t>
+      </w:r>
+      <w:r>
+        <w:t xml:space="preserve">(Jak et al., 2021; Jobst et al., 2023; Moshagen &amp; Bader, 2024)</w:t>
+      </w:r>
+      <w:r>
+        <w:t xml:space="preserve">.</w:t>
+      </w:r>
+    </w:p>
+    <w:p>
+      <w:pPr>
+        <w:pStyle w:val="SourceCode"/>
+      </w:pPr>
+      <w:r>
+        <w:br/>
+      </w:r>
+      <w:r>
+        <w:rPr>
+          <w:rStyle w:val="VerbatimChar"/>
+        </w:rPr>
+        <w:t xml:space="preserve"> semPower: Post hoc power analysis</w:t>
+      </w:r>
+      <w:r>
+        <w:br/>
+      </w:r>
+      <w:r>
+        <w:rPr>
+          <w:rStyle w:val="VerbatimChar"/>
+        </w:rPr>
+        <w:t xml:space="preserve">                                      </w:t>
+      </w:r>
+      <w:r>
+        <w:br/>
+      </w:r>
+      <w:r>
+        <w:rPr>
+          <w:rStyle w:val="VerbatimChar"/>
+        </w:rPr>
+        <w:t xml:space="preserve"> F0                       0.622500    </w:t>
+      </w:r>
+      <w:r>
+        <w:br/>
+      </w:r>
+      <w:r>
+        <w:rPr>
+          <w:rStyle w:val="VerbatimChar"/>
+        </w:rPr>
+        <w:t xml:space="preserve"> RMSEA                    0.050000    </w:t>
+      </w:r>
+      <w:r>
+        <w:br/>
+      </w:r>
+      <w:r>
+        <w:rPr>
+          <w:rStyle w:val="VerbatimChar"/>
+        </w:rPr>
+        <w:t xml:space="preserve"> Mc                       0.732531    </w:t>
+      </w:r>
+      <w:r>
+        <w:br/>
+      </w:r>
+      <w:r>
+        <w:rPr>
+          <w:rStyle w:val="VerbatimChar"/>
+        </w:rPr>
+        <w:t xml:space="preserve"> GFI                      0.950683    </w:t>
+      </w:r>
+      <w:r>
+        <w:br/>
+      </w:r>
+      <w:r>
+        <w:rPr>
+          <w:rStyle w:val="VerbatimChar"/>
+        </w:rPr>
+        <w:t xml:space="preserve"> AGFI                     0.940582    </w:t>
+      </w:r>
+      <w:r>
+        <w:br/>
+      </w:r>
+      <w:r>
+        <w:rPr>
+          <w:rStyle w:val="VerbatimChar"/>
+        </w:rPr>
+        <w:t xml:space="preserve">                                      </w:t>
+      </w:r>
+      <w:r>
+        <w:br/>
+      </w:r>
+      <w:r>
+        <w:rPr>
+          <w:rStyle w:val="VerbatimChar"/>
+        </w:rPr>
+        <w:t xml:space="preserve"> df                       249         </w:t>
+      </w:r>
+      <w:r>
+        <w:br/>
+      </w:r>
+      <w:r>
+        <w:rPr>
+          <w:rStyle w:val="VerbatimChar"/>
+        </w:rPr>
+        <w:t xml:space="preserve"> Num Observations         1047        </w:t>
+      </w:r>
+      <w:r>
+        <w:br/>
+      </w:r>
+      <w:r>
+        <w:rPr>
+          <w:rStyle w:val="VerbatimChar"/>
+        </w:rPr>
+        <w:t xml:space="preserve"> NCP                      651.1350    </w:t>
+      </w:r>
+      <w:r>
+        <w:br/>
+      </w:r>
+      <w:r>
+        <w:rPr>
+          <w:rStyle w:val="VerbatimChar"/>
+        </w:rPr>
+        <w:t xml:space="preserve">                                      </w:t>
+      </w:r>
+      <w:r>
+        <w:br/>
+      </w:r>
+      <w:r>
+        <w:rPr>
+          <w:rStyle w:val="VerbatimChar"/>
+        </w:rPr>
+        <w:t xml:space="preserve"> Critical Chi-Square      286.8077    </w:t>
+      </w:r>
+      <w:r>
+        <w:br/>
+      </w:r>
+      <w:r>
+        <w:rPr>
+          <w:rStyle w:val="VerbatimChar"/>
+        </w:rPr>
+        <w:t xml:space="preserve"> Alpha                    0.050000    </w:t>
+      </w:r>
+      <w:r>
+        <w:br/>
+      </w:r>
+      <w:r>
+        <w:rPr>
+          <w:rStyle w:val="VerbatimChar"/>
+        </w:rPr>
+        <w:t xml:space="preserve"> Beta                     4.771426e-48</w:t>
+      </w:r>
+      <w:r>
+        <w:br/>
+      </w:r>
+      <w:r>
+        <w:rPr>
+          <w:rStyle w:val="VerbatimChar"/>
+        </w:rPr>
+        <w:t xml:space="preserve"> Power (1 - Beta)         &gt; 0.9999    </w:t>
+      </w:r>
+      <w:r>
+        <w:br/>
+      </w:r>
+      <w:r>
+        <w:rPr>
+          <w:rStyle w:val="VerbatimChar"/>
+        </w:rPr>
+        <w:t xml:space="preserve"> Implied Alpha/Beta Ratio 1.047905e+46</w:t>
+      </w:r>
+    </w:p>
+    <w:tbl>
+      <w:tblPr>
+        <w:tblStyle w:val="Table"/>
+        <w:tblW w:type="pct" w:w="5000"/>
+        <w:tblLayout w:type="fixed"/>
+        <w:tblLook w:firstRow="0" w:lastRow="0" w:firstColumn="0" w:lastColumn="0" w:noHBand="0" w:noVBand="0" w:val="0000"/>
+      </w:tblPr>
+      <w:tblGrid>
+        <w:gridCol w:w="7920"/>
+      </w:tblGrid>
+      <w:tr>
+        <w:tc>
+          <w:tcPr/>
+          <w:bookmarkStart w:id="199" w:name="fig-posthoc-rmsea"/>
+          <w:p>
+            <w:pPr>
+              <w:pStyle w:val="Compact"/>
+              <w:jc w:val="center"/>
+            </w:pPr>
+            <w:r>
+              <w:drawing>
+                <wp:inline>
+                  <wp:extent cx="5334000" cy="3333749"/>
+                  <wp:effectExtent b="0" l="0" r="0" t="0"/>
+                  <wp:docPr descr="" title="" id="197" name="Picture"/>
+                  <a:graphic>
+                    <a:graphicData uri="http://schemas.openxmlformats.org/drawingml/2006/picture">
+                      <pic:pic>
+                        <pic:nvPicPr>
+                          <pic:cNvPr descr="index_files/figure-docx/Scripts-AnalysisScripts-06_posthoc-fig-posthoc-rmsea-output-2.png" id="198" name="Picture"/>
+                          <pic:cNvPicPr>
+                            <a:picLocks noChangeArrowheads="1" noChangeAspect="1"/>
+                          </pic:cNvPicPr>
+                        </pic:nvPicPr>
+                        <pic:blipFill>
+                          <a:blip r:embed="rId196"/>
+                          <a:stretch>
+                            <a:fillRect/>
+                          </a:stretch>
+                        </pic:blipFill>
+                        <pic:spPr bwMode="auto">
+                          <a:xfrm>
+                            <a:off x="0" y="0"/>
+                            <a:ext cx="5334000" cy="3333749"/>
+                          </a:xfrm>
+                          <a:prstGeom prst="rect">
+                            <a:avLst/>
+                          </a:prstGeom>
+                          <a:noFill/>
+                          <a:ln w="9525">
+                            <a:noFill/>
+                            <a:headEnd/>
+                            <a:tailEnd/>
+                          </a:ln>
+                        </pic:spPr>
+                      </pic:pic>
+                    </a:graphicData>
+                  </a:graphic>
+                </wp:inline>
+              </w:drawing>
+            </w:r>
+          </w:p>
+          <w:p>
+            <w:pPr>
+              <w:jc w:val="center"/>
+            </w:pPr>
+            <w:pPr>
+              <w:jc w:val="left"/>
+              <w:spacing w:before="200"/>
+              <w:pStyle w:val="ImageCaption"/>
+            </w:pPr>
+            <w:r>
+              <w:t xml:space="preserve">Figure 22: Post hoc power analysis for RMSEA = 0.05.</w:t>
+            </w:r>
+          </w:p>
+          <w:bookmarkEnd w:id="199"/>
+        </w:tc>
+      </w:tr>
+    </w:tbl>
+    <w:p>
+      <w:pPr>
+        <w:pStyle w:val="BodyText"/>
+      </w:pPr>
+      <w:r>
+        <w:rPr>
+          <w:vertAlign w:val="subscript"/>
+        </w:rPr>
+        <w:t xml:space="preserve">Source:</w:t>
+      </w:r>
+      <w:r>
+        <w:rPr>
+          <w:vertAlign w:val="subscript"/>
+        </w:rPr>
+        <w:t xml:space="preserve"> </w:t>
+      </w:r>
+      <w:hyperlink r:id="rId200">
+        <w:r>
+          <w:rPr>
+            <w:rStyle w:val="Hyperlink"/>
+            <w:vertAlign w:val="subscript"/>
+          </w:rPr>
+          <w:t xml:space="preserve">Post Hoc Power Analysis</w:t>
+        </w:r>
+      </w:hyperlink>
+    </w:p>
+    <w:p>
+      <w:pPr>
+        <w:pStyle w:val="BodyText"/>
+      </w:pPr>
+      <w:r>
+        <w:t xml:space="preserve">The</w:t>
+      </w:r>
+      <w:r>
+        <w:t xml:space="preserve"> </w:t>
+      </w:r>
+      <w:hyperlink w:anchor="fig-posthoc-rmsea">
+        <w:r>
+          <w:rPr>
+            <w:rStyle w:val="Hyperlink"/>
+          </w:rPr>
+          <w:t xml:space="preserve">Figure 22</w:t>
+        </w:r>
+      </w:hyperlink>
+      <w:r>
+        <w:t xml:space="preserve"> </w:t>
+      </w:r>
+      <w:r>
+        <w:t xml:space="preserve">shows an extremely high detection capacity for the tested discrepancy. With</w:t>
+      </w:r>
+      <w:r>
+        <w:t xml:space="preserve"> </w:t>
+      </w:r>
+      <m:oMath>
+        <m:sSub>
+          <m:e>
+            <m:r>
+              <m:t>F</m:t>
+            </m:r>
+          </m:e>
+          <m:sub>
+            <m:r>
+              <m:t>0</m:t>
+            </m:r>
+          </m:sub>
+        </m:sSub>
+        <m:r>
+          <m:rPr>
+            <m:sty m:val="p"/>
+          </m:rPr>
+          <m:t>=</m:t>
+        </m:r>
+      </m:oMath>
+      <w:r>
+        <w:t xml:space="preserve"> </w:t>
+      </w:r>
+      <w:r>
+        <w:t xml:space="preserve">0.623,</w:t>
+      </w:r>
+      <w:r>
+        <w:t xml:space="preserve"> </w:t>
+      </w:r>
+      <m:oMath>
+        <m:r>
+          <m:t>R</m:t>
+        </m:r>
+        <m:r>
+          <m:t>M</m:t>
+        </m:r>
+        <m:r>
+          <m:t>S</m:t>
+        </m:r>
+        <m:r>
+          <m:t>E</m:t>
+        </m:r>
+        <m:r>
+          <m:t>A</m:t>
+        </m:r>
+        <m:r>
+          <m:rPr>
+            <m:sty m:val="p"/>
+          </m:rPr>
+          <m:t>=</m:t>
+        </m:r>
+      </m:oMath>
+      <w:r>
+        <w:t xml:space="preserve"> </w:t>
+      </w:r>
+      <w:r>
+        <w:t xml:space="preserve">0.05,</w:t>
+      </w:r>
+      <w:r>
+        <w:t xml:space="preserve"> </w:t>
+      </w:r>
+      <m:oMath>
+        <m:r>
+          <m:t>d</m:t>
+        </m:r>
+        <m:r>
+          <m:t>f</m:t>
+        </m:r>
+        <m:r>
+          <m:rPr>
+            <m:sty m:val="p"/>
+          </m:rPr>
+          <m:t>=</m:t>
+        </m:r>
+      </m:oMath>
+      <w:r>
+        <w:t xml:space="preserve"> </w:t>
+      </w:r>
+      <w:r>
+        <w:t xml:space="preserve">249, and</w:t>
+      </w:r>
+      <w:r>
+        <w:t xml:space="preserve"> </w:t>
+      </w:r>
+      <m:oMath>
+        <m:r>
+          <m:t>N</m:t>
+        </m:r>
+        <m:r>
+          <m:rPr>
+            <m:sty m:val="p"/>
+          </m:rPr>
+          <m:t>=</m:t>
+        </m:r>
+      </m:oMath>
+      <w:r>
+        <w:t xml:space="preserve"> </w:t>
+      </w:r>
+      <w:r>
+        <w:t xml:space="preserve">1047, the noncentrality parameter reached</w:t>
+      </w:r>
+      <w:r>
+        <w:t xml:space="preserve"> </w:t>
+      </w:r>
+      <m:oMath>
+        <m:r>
+          <m:t>N</m:t>
+        </m:r>
+        <m:r>
+          <m:t>C</m:t>
+        </m:r>
+        <m:r>
+          <m:t>P</m:t>
+        </m:r>
+        <m:r>
+          <m:rPr>
+            <m:sty m:val="p"/>
+          </m:rPr>
+          <m:t>=</m:t>
+        </m:r>
+      </m:oMath>
+      <w:r>
+        <w:t xml:space="preserve"> </w:t>
+      </w:r>
+      <w:r>
+        <w:t xml:space="preserve">651.135, while the critical value was only</w:t>
+      </w:r>
+      <w:r>
+        <w:t xml:space="preserve"> </w:t>
+      </w:r>
+      <m:oMath>
+        <m:sSubSup>
+          <m:e>
+            <m:r>
+              <m:t>χ</m:t>
+            </m:r>
+          </m:e>
+          <m:sub>
+            <m:r>
+              <m:t>c</m:t>
+            </m:r>
+            <m:r>
+              <m:t>r</m:t>
+            </m:r>
+            <m:r>
+              <m:t>i</m:t>
+            </m:r>
+            <m:r>
+              <m:t>t</m:t>
+            </m:r>
+          </m:sub>
+          <m:sup>
+            <m:r>
+              <m:t>2</m:t>
+            </m:r>
+          </m:sup>
+        </m:sSubSup>
+        <m:r>
+          <m:rPr>
+            <m:sty m:val="p"/>
+          </m:rPr>
+          <m:t>=</m:t>
+        </m:r>
+      </m:oMath>
+      <w:r>
+        <w:t xml:space="preserve"> </w:t>
+      </w:r>
+      <w:r>
+        <w:t xml:space="preserve">286.808.</w:t>
+      </w:r>
+    </w:p>
+    <w:p>
+      <w:pPr>
+        <w:pStyle w:val="BodyText"/>
+      </w:pPr>
+      <w:r>
+        <w:t xml:space="preserve">As a result, power was effectively 1. In substantive terms, this means that, under this effect specification, the design was more than sufficient to detect the target misspecification.</w:t>
+      </w:r>
+    </w:p>
+    <w:p>
+      <w:pPr>
+        <w:pStyle w:val="BodyText"/>
+      </w:pPr>
+      <w:r>
+        <w:t xml:space="preserve">The graph is fully consistent with this result. The noncentral</w:t>
+      </w:r>
+      <w:r>
+        <w:t xml:space="preserve"> </w:t>
+      </w:r>
+      <m:oMath>
+        <m:sSup>
+          <m:e>
+            <m:r>
+              <m:t>χ</m:t>
+            </m:r>
+          </m:e>
+          <m:sup>
+            <m:r>
+              <m:t>2</m:t>
+            </m:r>
+          </m:sup>
+        </m:sSup>
+      </m:oMath>
+      <w:r>
+        <w:t xml:space="preserve"> </w:t>
+      </w:r>
+      <w:r>
+        <w:t xml:space="preserve">curve is located far to the right of the critical value, and the shaded</w:t>
+      </w:r>
+      <w:r>
+        <w:t xml:space="preserve"> </w:t>
+      </w:r>
+      <m:oMath>
+        <m:r>
+          <m:t>β</m:t>
+        </m:r>
+      </m:oMath>
+      <w:r>
+        <w:t xml:space="preserve"> </w:t>
+      </w:r>
+      <w:r>
+        <w:t xml:space="preserve">region is essentially negligible, while the</w:t>
+      </w:r>
+      <w:r>
+        <w:t xml:space="preserve"> </w:t>
+      </w:r>
+      <m:oMath>
+        <m:r>
+          <m:t>α</m:t>
+        </m:r>
+      </m:oMath>
+      <w:r>
+        <w:t xml:space="preserve"> </w:t>
+      </w:r>
+      <w:r>
+        <w:t xml:space="preserve">region remains fixed at</w:t>
+      </w:r>
+      <w:r>
+        <w:t xml:space="preserve"> </w:t>
+      </w:r>
+      <m:oMath>
+        <m:r>
+          <m:t>0.05</m:t>
+        </m:r>
+      </m:oMath>
+      <w:r>
+        <w:t xml:space="preserve">.</w:t>
+      </w:r>
+    </w:p>
+    <w:p>
+      <w:pPr>
+        <w:pStyle w:val="BodyText"/>
+      </w:pPr>
+      <w:r>
+        <w:t xml:space="preserve">The model-based specifications (</w:t>
+      </w:r>
+      <w:hyperlink w:anchor="fig-posthoc-realmodel">
+        <w:r>
+          <w:rPr>
+            <w:rStyle w:val="Hyperlink"/>
+          </w:rPr>
+          <w:t xml:space="preserve">Figure 23</w:t>
+        </w:r>
+      </w:hyperlink>
+      <w:r>
+        <w:t xml:space="preserve">) move one step closer to substantive hypotheses by deriving the effect from explicitly defined models. In this setup, the population model generates the covariance structure expected under the data-generating process, whereas the analysis model encodes the restrictions to be tested; the discrepancy between them is then translated into the population minimum of the fitting function and, from there, into analytical power</w:t>
+      </w:r>
+      <w:r>
+        <w:t xml:space="preserve"> </w:t>
+      </w:r>
+      <w:r>
+        <w:t xml:space="preserve">(Jobst et al., 2023; Moshagen &amp; Bader, 2024)</w:t>
+      </w:r>
+      <w:r>
+        <w:t xml:space="preserve">.</w:t>
+      </w:r>
+    </w:p>
+    <w:p>
+      <w:pPr>
+        <w:pStyle w:val="BodyText"/>
+      </w:pPr>
+      <w:r>
+        <w:t xml:space="preserve">When only</w:t>
+      </w:r>
+      <w:r>
+        <w:t xml:space="preserve"> </w:t>
+      </w:r>
+      <w:r>
+        <w:rPr>
+          <w:rStyle w:val="VerbatimChar"/>
+        </w:rPr>
+        <w:t xml:space="preserve">modelH0</w:t>
+      </w:r>
+      <w:r>
+        <w:t xml:space="preserve"> </w:t>
+      </w:r>
+      <w:r>
+        <w:t xml:space="preserve">is provided (</w:t>
+      </w:r>
+      <w:hyperlink w:anchor="fig-posthoc-realmodel">
+        <w:r>
+          <w:rPr>
+            <w:rStyle w:val="Hyperlink"/>
+          </w:rPr>
+          <w:t xml:space="preserve">Figure 23</w:t>
+        </w:r>
+      </w:hyperlink>
+      <w:r>
+        <w:t xml:space="preserve">), the comparison is against the saturated model, so the power analysis concerns the ability to detect that the focal model does not reproduce the population moments exactly. This is a global hypothesis about overall fit, not a targeted test of one particular restriction, even though the model itself may embody many substantive assumptions</w:t>
+      </w:r>
+      <w:r>
+        <w:t xml:space="preserve"> </w:t>
+      </w:r>
+      <w:r>
+        <w:t xml:space="preserve">(Jak et al., 2021; Moshagen &amp; Bader, 2024)</w:t>
+      </w:r>
+      <w:r>
+        <w:t xml:space="preserve">.</w:t>
+      </w:r>
+    </w:p>
+    <w:p>
+      <w:pPr>
+        <w:pStyle w:val="SourceCode"/>
+      </w:pPr>
+      <w:r>
+        <w:br/>
+      </w:r>
+      <w:r>
+        <w:rPr>
+          <w:rStyle w:val="VerbatimChar"/>
+        </w:rPr>
+        <w:t xml:space="preserve"> semPower: Post hoc power analysis</w:t>
+      </w:r>
+      <w:r>
+        <w:br/>
+      </w:r>
+      <w:r>
+        <w:rPr>
+          <w:rStyle w:val="VerbatimChar"/>
+        </w:rPr>
+        <w:t xml:space="preserve">                                      </w:t>
+      </w:r>
+      <w:r>
+        <w:br/>
+      </w:r>
+      <w:r>
+        <w:rPr>
+          <w:rStyle w:val="VerbatimChar"/>
+        </w:rPr>
+        <w:t xml:space="preserve"> F0                       0.303870    </w:t>
+      </w:r>
+      <w:r>
+        <w:br/>
+      </w:r>
+      <w:r>
+        <w:rPr>
+          <w:rStyle w:val="VerbatimChar"/>
+        </w:rPr>
+        <w:t xml:space="preserve"> RMSEA                    0.034934    </w:t>
+      </w:r>
+      <w:r>
+        <w:br/>
+      </w:r>
+      <w:r>
+        <w:rPr>
+          <w:rStyle w:val="VerbatimChar"/>
+        </w:rPr>
+        <w:t xml:space="preserve"> SRMR                     0.175600    </w:t>
+      </w:r>
+      <w:r>
+        <w:br/>
+      </w:r>
+      <w:r>
+        <w:rPr>
+          <w:rStyle w:val="VerbatimChar"/>
+        </w:rPr>
+        <w:t xml:space="preserve"> Mc                       0.859044    </w:t>
+      </w:r>
+      <w:r>
+        <w:br/>
+      </w:r>
+      <w:r>
+        <w:rPr>
+          <w:rStyle w:val="VerbatimChar"/>
+        </w:rPr>
+        <w:t xml:space="preserve"> GFI                      0.975303    </w:t>
+      </w:r>
+      <w:r>
+        <w:br/>
+      </w:r>
+      <w:r>
+        <w:rPr>
+          <w:rStyle w:val="VerbatimChar"/>
+        </w:rPr>
+        <w:t xml:space="preserve"> AGFI                     0.970244    </w:t>
+      </w:r>
+      <w:r>
+        <w:br/>
+      </w:r>
+      <w:r>
+        <w:rPr>
+          <w:rStyle w:val="VerbatimChar"/>
+        </w:rPr>
+        <w:t xml:space="preserve"> CFI                      0.977582    </w:t>
+      </w:r>
+      <w:r>
+        <w:br/>
+      </w:r>
+      <w:r>
+        <w:rPr>
+          <w:rStyle w:val="VerbatimChar"/>
+        </w:rPr>
+        <w:t xml:space="preserve">                                      </w:t>
+      </w:r>
+      <w:r>
+        <w:br/>
+      </w:r>
+      <w:r>
+        <w:rPr>
+          <w:rStyle w:val="VerbatimChar"/>
+        </w:rPr>
+        <w:t xml:space="preserve"> df                       249         </w:t>
+      </w:r>
+      <w:r>
+        <w:br/>
+      </w:r>
+      <w:r>
+        <w:rPr>
+          <w:rStyle w:val="VerbatimChar"/>
+        </w:rPr>
+        <w:t xml:space="preserve"> Num Observations         1047        </w:t>
+      </w:r>
+      <w:r>
+        <w:br/>
+      </w:r>
+      <w:r>
+        <w:rPr>
+          <w:rStyle w:val="VerbatimChar"/>
+        </w:rPr>
+        <w:t xml:space="preserve"> NCP                      317.8482    </w:t>
+      </w:r>
+      <w:r>
+        <w:br/>
+      </w:r>
+      <w:r>
+        <w:rPr>
+          <w:rStyle w:val="VerbatimChar"/>
+        </w:rPr>
+        <w:t xml:space="preserve">                                      </w:t>
+      </w:r>
+      <w:r>
+        <w:br/>
+      </w:r>
+      <w:r>
+        <w:rPr>
+          <w:rStyle w:val="VerbatimChar"/>
+        </w:rPr>
+        <w:t xml:space="preserve"> Critical Chi-Square      286.8077    </w:t>
+      </w:r>
+      <w:r>
+        <w:br/>
+      </w:r>
+      <w:r>
+        <w:rPr>
+          <w:rStyle w:val="VerbatimChar"/>
+        </w:rPr>
+        <w:t xml:space="preserve"> Alpha                    0.050000    </w:t>
+      </w:r>
+      <w:r>
+        <w:br/>
+      </w:r>
+      <w:r>
+        <w:rPr>
+          <w:rStyle w:val="VerbatimChar"/>
+        </w:rPr>
+        <w:t xml:space="preserve"> Beta                     6.740368e-16</w:t>
+      </w:r>
+      <w:r>
+        <w:br/>
+      </w:r>
+      <w:r>
+        <w:rPr>
+          <w:rStyle w:val="VerbatimChar"/>
+        </w:rPr>
+        <w:t xml:space="preserve"> Power (1 - Beta)         &gt; 0.9999    </w:t>
+      </w:r>
+      <w:r>
+        <w:br/>
+      </w:r>
+      <w:r>
+        <w:rPr>
+          <w:rStyle w:val="VerbatimChar"/>
+        </w:rPr>
+        <w:t xml:space="preserve"> Implied Alpha/Beta Ratio 7.417993e+13</w:t>
+      </w:r>
+    </w:p>
+    <w:tbl>
+      <w:tblPr>
+        <w:tblStyle w:val="Table"/>
+        <w:tblW w:type="pct" w:w="5000"/>
+        <w:tblLayout w:type="fixed"/>
+        <w:tblLook w:firstRow="0" w:lastRow="0" w:firstColumn="0" w:lastColumn="0" w:noHBand="0" w:noVBand="0" w:val="0000"/>
+      </w:tblPr>
+      <w:tblGrid>
+        <w:gridCol w:w="7920"/>
+      </w:tblGrid>
+      <w:tr>
+        <w:tc>
+          <w:tcPr/>
+          <w:bookmarkStart w:id="204" w:name="fig-posthoc-realmodel"/>
+          <w:p>
+            <w:pPr>
+              <w:pStyle w:val="Compact"/>
+              <w:jc w:val="center"/>
+            </w:pPr>
+            <w:r>
+              <w:drawing>
+                <wp:inline>
+                  <wp:extent cx="5334000" cy="3333749"/>
+                  <wp:effectExtent b="0" l="0" r="0" t="0"/>
+                  <wp:docPr descr="" title="" id="202" name="Picture"/>
+                  <a:graphic>
+                    <a:graphicData uri="http://schemas.openxmlformats.org/drawingml/2006/picture">
+                      <pic:pic>
+                        <pic:nvPicPr>
+                          <pic:cNvPr descr="index_files/figure-docx/Scripts-AnalysisScripts-06_posthoc-fig-posthoc-realmodel-output-2.png" id="203" name="Picture"/>
+                          <pic:cNvPicPr>
+                            <a:picLocks noChangeArrowheads="1" noChangeAspect="1"/>
+                          </pic:cNvPicPr>
+                        </pic:nvPicPr>
+                        <pic:blipFill>
+                          <a:blip r:embed="rId201"/>
+                          <a:stretch>
+                            <a:fillRect/>
+                          </a:stretch>
+                        </pic:blipFill>
+                        <pic:spPr bwMode="auto">
+                          <a:xfrm>
+                            <a:off x="0" y="0"/>
+                            <a:ext cx="5334000" cy="3333749"/>
+                          </a:xfrm>
+                          <a:prstGeom prst="rect">
+                            <a:avLst/>
+                          </a:prstGeom>
+                          <a:noFill/>
+                          <a:ln w="9525">
+                            <a:noFill/>
+                            <a:headEnd/>
+                            <a:tailEnd/>
+                          </a:ln>
+                        </pic:spPr>
+                      </pic:pic>
+                    </a:graphicData>
+                  </a:graphic>
+                </wp:inline>
+              </w:drawing>
+            </w:r>
+          </w:p>
+          <w:p>
+            <w:pPr>
+              <w:jc w:val="center"/>
+            </w:pPr>
+            <w:pPr>
+              <w:jc w:val="left"/>
+              <w:spacing w:before="200"/>
+              <w:pStyle w:val="ImageCaption"/>
+            </w:pPr>
+            <w:r>
+              <w:t xml:space="preserve">Figure 23: Post hoc power analysis for the real model.</w:t>
+            </w:r>
+          </w:p>
+          <w:bookmarkEnd w:id="204"/>
+        </w:tc>
+      </w:tr>
+    </w:tbl>
+    <w:p>
+      <w:pPr>
+        <w:pStyle w:val="BodyText"/>
+      </w:pPr>
+      <w:r>
+        <w:rPr>
+          <w:vertAlign w:val="subscript"/>
+        </w:rPr>
+        <w:t xml:space="preserve">Source:</w:t>
+      </w:r>
+      <w:r>
+        <w:rPr>
+          <w:vertAlign w:val="subscript"/>
+        </w:rPr>
+        <w:t xml:space="preserve"> </w:t>
+      </w:r>
+      <w:hyperlink r:id="rId205">
+        <w:r>
+          <w:rPr>
+            <w:rStyle w:val="Hyperlink"/>
+            <w:vertAlign w:val="subscript"/>
+          </w:rPr>
+          <w:t xml:space="preserve">Post Hoc Power Analysis</w:t>
+        </w:r>
+      </w:hyperlink>
+    </w:p>
+    <w:p>
+      <w:pPr>
+        <w:pStyle w:val="BodyText"/>
+      </w:pPr>
+      <w:r>
+        <w:t xml:space="preserve">The</w:t>
+      </w:r>
+      <w:r>
+        <w:t xml:space="preserve"> </w:t>
+      </w:r>
+      <w:hyperlink w:anchor="fig-posthoc-realmodel">
+        <w:r>
+          <w:rPr>
+            <w:rStyle w:val="Hyperlink"/>
+          </w:rPr>
+          <w:t xml:space="preserve">Figure 23</w:t>
+        </w:r>
+      </w:hyperlink>
+      <w:r>
+        <w:t xml:space="preserve"> </w:t>
+      </w:r>
+      <w:r>
+        <w:t xml:space="preserve">shows an extremely high detection capacity for the tested discrepancy. With</w:t>
+      </w:r>
+      <w:r>
+        <w:t xml:space="preserve"> </w:t>
+      </w:r>
+      <m:oMath>
+        <m:sSub>
+          <m:e>
+            <m:r>
+              <m:t>F</m:t>
+            </m:r>
+          </m:e>
+          <m:sub>
+            <m:r>
+              <m:t>0</m:t>
+            </m:r>
+          </m:sub>
+        </m:sSub>
+        <m:r>
+          <m:rPr>
+            <m:sty m:val="p"/>
+          </m:rPr>
+          <m:t>=</m:t>
+        </m:r>
+      </m:oMath>
+      <w:r>
+        <w:t xml:space="preserve"> </w:t>
+      </w:r>
+      <w:r>
+        <w:t xml:space="preserve">0.304,</w:t>
+      </w:r>
+      <w:r>
+        <w:t xml:space="preserve"> </w:t>
+      </w:r>
+      <m:oMath>
+        <m:r>
+          <m:t>R</m:t>
+        </m:r>
+        <m:r>
+          <m:t>M</m:t>
+        </m:r>
+        <m:r>
+          <m:t>S</m:t>
+        </m:r>
+        <m:r>
+          <m:t>E</m:t>
+        </m:r>
+        <m:r>
+          <m:t>A</m:t>
+        </m:r>
+        <m:r>
+          <m:rPr>
+            <m:sty m:val="p"/>
+          </m:rPr>
+          <m:t>=</m:t>
+        </m:r>
+      </m:oMath>
+      <w:r>
+        <w:t xml:space="preserve"> </w:t>
+      </w:r>
+      <w:r>
+        <w:t xml:space="preserve">0.035,</w:t>
+      </w:r>
+      <w:r>
+        <w:t xml:space="preserve"> </w:t>
+      </w:r>
+      <m:oMath>
+        <m:r>
+          <m:t>d</m:t>
+        </m:r>
+        <m:r>
+          <m:t>f</m:t>
+        </m:r>
+        <m:r>
+          <m:rPr>
+            <m:sty m:val="p"/>
+          </m:rPr>
+          <m:t>=</m:t>
+        </m:r>
+      </m:oMath>
+      <w:r>
+        <w:t xml:space="preserve"> </w:t>
+      </w:r>
+      <w:r>
+        <w:t xml:space="preserve">249, and</w:t>
+      </w:r>
+      <w:r>
+        <w:t xml:space="preserve"> </w:t>
+      </w:r>
+      <m:oMath>
+        <m:r>
+          <m:t>N</m:t>
+        </m:r>
+        <m:r>
+          <m:rPr>
+            <m:sty m:val="p"/>
+          </m:rPr>
+          <m:t>=</m:t>
+        </m:r>
+      </m:oMath>
+      <w:r>
+        <w:t xml:space="preserve"> </w:t>
+      </w:r>
+      <w:r>
+        <w:t xml:space="preserve">1047, the noncentrality parameter reached</w:t>
+      </w:r>
+      <w:r>
+        <w:t xml:space="preserve"> </w:t>
+      </w:r>
+      <m:oMath>
+        <m:r>
+          <m:t>N</m:t>
+        </m:r>
+        <m:r>
+          <m:t>C</m:t>
+        </m:r>
+        <m:r>
+          <m:t>P</m:t>
+        </m:r>
+        <m:r>
+          <m:rPr>
+            <m:sty m:val="p"/>
+          </m:rPr>
+          <m:t>=</m:t>
+        </m:r>
+      </m:oMath>
+      <w:r>
+        <w:t xml:space="preserve"> </w:t>
+      </w:r>
+      <w:r>
+        <w:t xml:space="preserve">317.848, while the critical value was only</w:t>
+      </w:r>
+      <w:r>
+        <w:t xml:space="preserve"> </w:t>
+      </w:r>
+      <m:oMath>
+        <m:sSubSup>
+          <m:e>
+            <m:r>
+              <m:t>χ</m:t>
+            </m:r>
+          </m:e>
+          <m:sub>
+            <m:r>
+              <m:t>c</m:t>
+            </m:r>
+            <m:r>
+              <m:t>r</m:t>
+            </m:r>
+            <m:r>
+              <m:t>i</m:t>
+            </m:r>
+            <m:r>
+              <m:t>t</m:t>
+            </m:r>
+          </m:sub>
+          <m:sup>
+            <m:r>
+              <m:t>2</m:t>
+            </m:r>
+          </m:sup>
+        </m:sSubSup>
+        <m:r>
+          <m:rPr>
+            <m:sty m:val="p"/>
+          </m:rPr>
+          <m:t>=</m:t>
+        </m:r>
+      </m:oMath>
+      <w:r>
+        <w:t xml:space="preserve"> </w:t>
+      </w:r>
+      <w:r>
+        <w:t xml:space="preserve">286.808.</w:t>
+      </w:r>
+    </w:p>
+    <w:p>
+      <w:pPr>
+        <w:pStyle w:val="BodyText"/>
+      </w:pPr>
+      <w:r>
+        <w:t xml:space="preserve">The graphical result shows the same pattern as in the previous case, although with less separation between the two distributions. Even so, the noncentral distribution still lies predominantly to the right of the cutoff, so the probability of failing to detect the effect is practically zero.</w:t>
+      </w:r>
+    </w:p>
+    <w:p>
+      <w:pPr>
+        <w:pStyle w:val="BodyText"/>
+      </w:pPr>
+      <w:r>
+        <w:t xml:space="preserve">When both</w:t>
+      </w:r>
+      <w:r>
+        <w:t xml:space="preserve"> </w:t>
+      </w:r>
+      <w:r>
+        <w:rPr>
+          <w:rStyle w:val="VerbatimChar"/>
+        </w:rPr>
+        <w:t xml:space="preserve">modelH0</w:t>
+      </w:r>
+      <w:r>
+        <w:t xml:space="preserve"> </w:t>
+      </w:r>
+      <w:r>
+        <w:t xml:space="preserve">and</w:t>
+      </w:r>
+      <w:r>
+        <w:t xml:space="preserve"> </w:t>
+      </w:r>
+      <w:r>
+        <w:rPr>
+          <w:rStyle w:val="VerbatimChar"/>
+        </w:rPr>
+        <w:t xml:space="preserve">modelH1</w:t>
+      </w:r>
+      <w:r>
+        <w:t xml:space="preserve"> </w:t>
+      </w:r>
+      <w:r>
+        <w:t xml:space="preserve">are specified (</w:t>
+      </w:r>
+      <w:hyperlink w:anchor="fig-posthoc-misspec">
+        <w:r>
+          <w:rPr>
+            <w:rStyle w:val="Hyperlink"/>
+          </w:rPr>
+          <w:t xml:space="preserve">Figure 24</w:t>
+        </w:r>
+      </w:hyperlink>
+      <w:r>
+        <w:t xml:space="preserve">), the analysis becomes a nested-model comparison. In that case, power refers to the probability of detecting the additional restrictions imposed by</w:t>
+      </w:r>
+      <w:r>
+        <w:t xml:space="preserve"> </w:t>
+      </w:r>
+      <m:oMath>
+        <m:sSub>
+          <m:e>
+            <m:r>
+              <m:t>H</m:t>
+            </m:r>
+          </m:e>
+          <m:sub>
+            <m:r>
+              <m:t>0</m:t>
+            </m:r>
+          </m:sub>
+        </m:sSub>
+      </m:oMath>
+      <w:r>
+        <w:t xml:space="preserve"> </w:t>
+      </w:r>
+      <w:r>
+        <w:t xml:space="preserve">relative to a less restrictive competitor, which is usually the conceptually preferable strategy when the research question concerns a particular constrained relation rather than the model as a whole</w:t>
+      </w:r>
+      <w:r>
+        <w:t xml:space="preserve"> </w:t>
+      </w:r>
+      <w:r>
+        <w:t xml:space="preserve">(Jak et al., 2021; Jobst et al., 2023; Moshagen &amp; Bader, 2024)</w:t>
+      </w:r>
+      <w:r>
+        <w:t xml:space="preserve">.</w:t>
+      </w:r>
+    </w:p>
+    <w:p>
+      <w:pPr>
+        <w:pStyle w:val="BodyText"/>
+      </w:pPr>
+      <w:r>
+        <w:t xml:space="preserve">This distinction is important because the same sample size may imply very different power depending on the hypothesis under evaluation. A study can be adequately powered to detect overall misspecification against the saturated model and still be poorly powered for a more localized restriction, or the reverse, because power in SEM is always tied to the specific discrepancy being tested</w:t>
+      </w:r>
+      <w:r>
+        <w:t xml:space="preserve"> </w:t>
+      </w:r>
+      <w:r>
+        <w:t xml:space="preserve">(Jobst et al., 2023; Moshagen &amp; Bader, 2024; Wang, 2023)</w:t>
+      </w:r>
+      <w:r>
+        <w:t xml:space="preserve">.</w:t>
+      </w:r>
+    </w:p>
+    <w:p>
+      <w:pPr>
+        <w:pStyle w:val="SourceCode"/>
+      </w:pPr>
+      <w:r>
+        <w:br/>
+      </w:r>
+      <w:r>
+        <w:rPr>
+          <w:rStyle w:val="VerbatimChar"/>
+        </w:rPr>
+        <w:t xml:space="preserve"> semPower: Post hoc power analysis</w:t>
+      </w:r>
+      <w:r>
+        <w:br/>
+      </w:r>
+      <w:r>
+        <w:rPr>
+          <w:rStyle w:val="VerbatimChar"/>
+        </w:rPr>
+        <w:t xml:space="preserve">                                  </w:t>
+      </w:r>
+      <w:r>
+        <w:br/>
+      </w:r>
+      <w:r>
+        <w:rPr>
+          <w:rStyle w:val="VerbatimChar"/>
+        </w:rPr>
+        <w:t xml:space="preserve"> F0                       0.009082</w:t>
+      </w:r>
+      <w:r>
+        <w:br/>
+      </w:r>
+      <w:r>
+        <w:rPr>
+          <w:rStyle w:val="VerbatimChar"/>
+        </w:rPr>
+        <w:t xml:space="preserve"> RMSEA                    0.055021</w:t>
+      </w:r>
+      <w:r>
+        <w:br/>
+      </w:r>
+      <w:r>
+        <w:rPr>
+          <w:rStyle w:val="VerbatimChar"/>
+        </w:rPr>
+        <w:t xml:space="preserve"> Mc                       0.995469</w:t>
+      </w:r>
+      <w:r>
+        <w:br/>
+      </w:r>
+      <w:r>
+        <w:rPr>
+          <w:rStyle w:val="VerbatimChar"/>
+        </w:rPr>
+        <w:t xml:space="preserve">                                  </w:t>
+      </w:r>
+      <w:r>
+        <w:br/>
+      </w:r>
+      <w:r>
+        <w:rPr>
+          <w:rStyle w:val="VerbatimChar"/>
+        </w:rPr>
+        <w:t xml:space="preserve"> df                       3       </w:t>
+      </w:r>
+      <w:r>
+        <w:br/>
+      </w:r>
+      <w:r>
+        <w:rPr>
+          <w:rStyle w:val="VerbatimChar"/>
+        </w:rPr>
+        <w:t xml:space="preserve"> Num Observations         1047    </w:t>
+      </w:r>
+      <w:r>
+        <w:br/>
+      </w:r>
+      <w:r>
+        <w:rPr>
+          <w:rStyle w:val="VerbatimChar"/>
+        </w:rPr>
+        <w:t xml:space="preserve"> NCP                      9.499715</w:t>
+      </w:r>
+      <w:r>
+        <w:br/>
+      </w:r>
+      <w:r>
+        <w:rPr>
+          <w:rStyle w:val="VerbatimChar"/>
+        </w:rPr>
+        <w:t xml:space="preserve">                                  </w:t>
+      </w:r>
+      <w:r>
+        <w:br/>
+      </w:r>
+      <w:r>
+        <w:rPr>
+          <w:rStyle w:val="VerbatimChar"/>
+        </w:rPr>
+        <w:t xml:space="preserve"> Critical Chi-Square      7.814728</w:t>
+      </w:r>
+      <w:r>
+        <w:br/>
+      </w:r>
+      <w:r>
+        <w:rPr>
+          <w:rStyle w:val="VerbatimChar"/>
+        </w:rPr>
+        <w:t xml:space="preserve"> Alpha                    0.050000</w:t>
+      </w:r>
+      <w:r>
+        <w:br/>
+      </w:r>
+      <w:r>
+        <w:rPr>
+          <w:rStyle w:val="VerbatimChar"/>
+        </w:rPr>
+        <w:t xml:space="preserve"> Beta                     0.262955</w:t>
+      </w:r>
+      <w:r>
+        <w:br/>
+      </w:r>
+      <w:r>
+        <w:rPr>
+          <w:rStyle w:val="VerbatimChar"/>
+        </w:rPr>
+        <w:t xml:space="preserve"> Power (1 - Beta)         0.737045</w:t>
+      </w:r>
+      <w:r>
+        <w:br/>
+      </w:r>
+      <w:r>
+        <w:rPr>
+          <w:rStyle w:val="VerbatimChar"/>
+        </w:rPr>
+        <w:t xml:space="preserve"> Implied Alpha/Beta Ratio 0.190147</w:t>
+      </w:r>
+    </w:p>
+    <w:tbl>
+      <w:tblPr>
+        <w:tblStyle w:val="Table"/>
+        <w:tblW w:type="pct" w:w="5000"/>
+        <w:tblLayout w:type="fixed"/>
+        <w:tblLook w:firstRow="0" w:lastRow="0" w:firstColumn="0" w:lastColumn="0" w:noHBand="0" w:noVBand="0" w:val="0000"/>
+      </w:tblPr>
+      <w:tblGrid>
+        <w:gridCol w:w="7920"/>
+      </w:tblGrid>
+      <w:tr>
+        <w:tc>
+          <w:tcPr/>
+          <w:bookmarkStart w:id="209" w:name="fig-posthoc-misspec"/>
+          <w:p>
+            <w:pPr>
+              <w:pStyle w:val="Compact"/>
+              <w:jc w:val="center"/>
+            </w:pPr>
+            <w:r>
+              <w:drawing>
+                <wp:inline>
+                  <wp:extent cx="5334000" cy="3333749"/>
+                  <wp:effectExtent b="0" l="0" r="0" t="0"/>
+                  <wp:docPr descr="" title="" id="207" name="Picture"/>
+                  <a:graphic>
+                    <a:graphicData uri="http://schemas.openxmlformats.org/drawingml/2006/picture">
+                      <pic:pic>
+                        <pic:nvPicPr>
+                          <pic:cNvPr descr="index_files/figure-docx/Scripts-AnalysisScripts-06_posthoc-fig-posthoc-misspec-output-3.png" id="208" name="Picture"/>
+                          <pic:cNvPicPr>
+                            <a:picLocks noChangeArrowheads="1" noChangeAspect="1"/>
+                          </pic:cNvPicPr>
+                        </pic:nvPicPr>
+                        <pic:blipFill>
+                          <a:blip r:embed="rId206"/>
+                          <a:stretch>
+                            <a:fillRect/>
+                          </a:stretch>
+                        </pic:blipFill>
+                        <pic:spPr bwMode="auto">
+                          <a:xfrm>
+                            <a:off x="0" y="0"/>
+                            <a:ext cx="5334000" cy="3333749"/>
+                          </a:xfrm>
+                          <a:prstGeom prst="rect">
+                            <a:avLst/>
+                          </a:prstGeom>
+                          <a:noFill/>
+                          <a:ln w="9525">
+                            <a:noFill/>
+                            <a:headEnd/>
+                            <a:tailEnd/>
+                          </a:ln>
+                        </pic:spPr>
+                      </pic:pic>
+                    </a:graphicData>
+                  </a:graphic>
+                </wp:inline>
+              </w:drawing>
+            </w:r>
+          </w:p>
+          <w:p>
+            <w:pPr>
+              <w:jc w:val="center"/>
+            </w:pPr>
+            <w:pPr>
+              <w:jc w:val="left"/>
+              <w:spacing w:before="200"/>
+              <w:pStyle w:val="ImageCaption"/>
+            </w:pPr>
+            <w:r>
+              <w:t xml:space="preserve">Figure 24: Post hoc power analysis for the misspecified model.</w:t>
+            </w:r>
+          </w:p>
+          <w:bookmarkEnd w:id="209"/>
+        </w:tc>
+      </w:tr>
+    </w:tbl>
+    <w:p>
+      <w:pPr>
+        <w:pStyle w:val="BodyText"/>
+      </w:pPr>
+      <w:r>
+        <w:rPr>
+          <w:vertAlign w:val="subscript"/>
+        </w:rPr>
+        <w:t xml:space="preserve">Source:</w:t>
+      </w:r>
+      <w:r>
+        <w:rPr>
+          <w:vertAlign w:val="subscript"/>
+        </w:rPr>
+        <w:t xml:space="preserve"> </w:t>
+      </w:r>
+      <w:hyperlink r:id="rId210">
+        <w:r>
+          <w:rPr>
+            <w:rStyle w:val="Hyperlink"/>
+            <w:vertAlign w:val="subscript"/>
+          </w:rPr>
+          <w:t xml:space="preserve">Post Hoc Power Analysis</w:t>
+        </w:r>
+      </w:hyperlink>
+    </w:p>
+    <w:p>
+      <w:pPr>
+        <w:pStyle w:val="BodyText"/>
+      </w:pPr>
+      <w:r>
+        <w:t xml:space="preserve">The</w:t>
+      </w:r>
+      <w:r>
+        <w:t xml:space="preserve"> </w:t>
+      </w:r>
+      <w:hyperlink w:anchor="fig-posthoc-misspec">
+        <w:r>
+          <w:rPr>
+            <w:rStyle w:val="Hyperlink"/>
+          </w:rPr>
+          <w:t xml:space="preserve">Figure 24</w:t>
+        </w:r>
+      </w:hyperlink>
+      <w:r>
+        <w:t xml:space="preserve"> </w:t>
+      </w:r>
+      <w:r>
+        <w:t xml:space="preserve">yields a much more moderate result. Although the sample size was the same, the tested discrepancy was much smaller, with</w:t>
+      </w:r>
+      <w:r>
+        <w:t xml:space="preserve"> </w:t>
+      </w:r>
+      <m:oMath>
+        <m:sSub>
+          <m:e>
+            <m:r>
+              <m:t>F</m:t>
+            </m:r>
+          </m:e>
+          <m:sub>
+            <m:r>
+              <m:t>0</m:t>
+            </m:r>
+          </m:sub>
+        </m:sSub>
+        <m:r>
+          <m:rPr>
+            <m:sty m:val="p"/>
+          </m:rPr>
+          <m:t>=</m:t>
+        </m:r>
+      </m:oMath>
+      <w:r>
+        <w:t xml:space="preserve"> </w:t>
+      </w:r>
+      <w:r>
+        <w:t xml:space="preserve">0.009,</w:t>
+      </w:r>
+      <w:r>
+        <w:t xml:space="preserve"> </w:t>
+      </w:r>
+      <m:oMath>
+        <m:r>
+          <m:t>R</m:t>
+        </m:r>
+        <m:r>
+          <m:t>M</m:t>
+        </m:r>
+        <m:r>
+          <m:t>S</m:t>
+        </m:r>
+        <m:r>
+          <m:t>E</m:t>
+        </m:r>
+        <m:r>
+          <m:t>A</m:t>
+        </m:r>
+        <m:r>
+          <m:rPr>
+            <m:sty m:val="p"/>
+          </m:rPr>
+          <m:t>=</m:t>
+        </m:r>
+      </m:oMath>
+      <w:r>
+        <w:t xml:space="preserve"> </w:t>
+      </w:r>
+      <w:r>
+        <w:t xml:space="preserve">0.055 and only</w:t>
+      </w:r>
+      <w:r>
+        <w:t xml:space="preserve"> </w:t>
+      </w:r>
+      <m:oMath>
+        <m:r>
+          <m:t>d</m:t>
+        </m:r>
+        <m:r>
+          <m:t>f</m:t>
+        </m:r>
+        <m:r>
+          <m:rPr>
+            <m:sty m:val="p"/>
+          </m:rPr>
+          <m:t>=</m:t>
+        </m:r>
+      </m:oMath>
+      <w:r>
+        <w:t xml:space="preserve"> </w:t>
+      </w:r>
+      <w:r>
+        <w:t xml:space="preserve">3, which led to a comparatively small</w:t>
+      </w:r>
+      <w:r>
+        <w:t xml:space="preserve"> </w:t>
+      </w:r>
+      <m:oMath>
+        <m:r>
+          <m:t>N</m:t>
+        </m:r>
+        <m:r>
+          <m:t>C</m:t>
+        </m:r>
+        <m:r>
+          <m:t>P</m:t>
+        </m:r>
+        <m:r>
+          <m:rPr>
+            <m:sty m:val="p"/>
+          </m:rPr>
+          <m:t>=</m:t>
+        </m:r>
+      </m:oMath>
+      <w:r>
+        <w:t xml:space="preserve"> </w:t>
+      </w:r>
+      <w:r>
+        <w:t xml:space="preserve">9.5.</w:t>
+      </w:r>
+    </w:p>
+    <w:p>
+      <w:pPr>
+        <w:pStyle w:val="BodyText"/>
+      </w:pPr>
+      <w:r>
+        <w:t xml:space="preserve">The critical value was</w:t>
+      </w:r>
+      <w:r>
+        <w:t xml:space="preserve"> </w:t>
+      </w:r>
+      <m:oMath>
+        <m:sSubSup>
+          <m:e>
+            <m:r>
+              <m:t>χ</m:t>
+            </m:r>
+          </m:e>
+          <m:sub>
+            <m:r>
+              <m:t>c</m:t>
+            </m:r>
+            <m:r>
+              <m:t>r</m:t>
+            </m:r>
+            <m:r>
+              <m:t>i</m:t>
+            </m:r>
+            <m:r>
+              <m:t>t</m:t>
+            </m:r>
+          </m:sub>
+          <m:sup>
+            <m:r>
+              <m:t>2</m:t>
+            </m:r>
+          </m:sup>
+        </m:sSubSup>
+        <m:r>
+          <m:rPr>
+            <m:sty m:val="p"/>
+          </m:rPr>
+          <m:t>=</m:t>
+        </m:r>
+      </m:oMath>
+      <w:r>
+        <w:t xml:space="preserve"> </w:t>
+      </w:r>
+      <w:r>
+        <w:t xml:space="preserve">7.815, and this time the overlap between the central and noncentral distributions was substantial. Accordingly,</w:t>
+      </w:r>
+      <w:r>
+        <w:t xml:space="preserve"> </w:t>
+      </w:r>
+      <m:oMath>
+        <m:r>
+          <m:t>β</m:t>
+        </m:r>
+        <m:r>
+          <m:rPr>
+            <m:sty m:val="p"/>
+          </m:rPr>
+          <m:t>=</m:t>
+        </m:r>
+      </m:oMath>
+      <w:r>
+        <w:t xml:space="preserve"> </w:t>
+      </w:r>
+      <w:r>
+        <w:t xml:space="preserve">0.263 and power was 0.737, indicating that the analysis did not reach the conventional</w:t>
+      </w:r>
+      <w:r>
+        <w:t xml:space="preserve"> </w:t>
+      </w:r>
+      <m:oMath>
+        <m:r>
+          <m:t>0.80</m:t>
+        </m:r>
+      </m:oMath>
+      <w:r>
+        <w:t xml:space="preserve"> </w:t>
+      </w:r>
+      <w:r>
+        <w:t xml:space="preserve">threshold.</w:t>
+      </w:r>
+    </w:p>
+    <w:p>
+      <w:pPr>
+        <w:pStyle w:val="BodyText"/>
+      </w:pPr>
+      <w:r>
+        <w:t xml:space="preserve">The graph reflects this clearly. Unlike the first two plots, the noncentral curve is only moderately shifted to the right of the critical value, and the shaded</w:t>
+      </w:r>
+      <w:r>
+        <w:t xml:space="preserve"> </w:t>
+      </w:r>
+      <m:oMath>
+        <m:r>
+          <m:t>β</m:t>
+        </m:r>
+      </m:oMath>
+      <w:r>
+        <w:t xml:space="preserve"> </w:t>
+      </w:r>
+      <w:r>
+        <w:t xml:space="preserve">area is visibly large, showing a nontrivial probability of not detecting the tested discrepancy.</w:t>
+      </w:r>
+    </w:p>
+    <w:p>
+      <w:pPr>
+        <w:pStyle w:val="BodyText"/>
+      </w:pPr>
+      <w:r>
+        <w:t xml:space="preserve">More broadly, these chunks illustrate the two main analytical routes available in SEM post hoc power assessment: a model-free route based on a prespecified fit index value, and a model-based route in which the effect is induced by the discrepancy between population and analysis models. The latter is often more substantively interpretable, whereas the former is simpler and more general, especially when the main interest is sensitivity to a chosen level of global misfit</w:t>
+      </w:r>
+      <w:r>
+        <w:t xml:space="preserve"> </w:t>
+      </w:r>
+      <w:r>
+        <w:t xml:space="preserve">(Jak et al., 2021; Moshagen &amp; Bader, 2024)</w:t>
+      </w:r>
+      <w:r>
+        <w:t xml:space="preserve">.</w:t>
+      </w:r>
+    </w:p>
+    <w:p>
+      <w:pPr>
+        <w:pStyle w:val="BodyText"/>
+      </w:pPr>
+      <w:r>
+        <w:t xml:space="preserve">Analytical post hoc power is typically preferred whenever its asymptotic assumptions are reasonable, because it is computationally immediate, free from Monte Carlo sampling error, and directly tied to the theoretical reference distributions of the SEM test statistic. Even so, its interpretation remains conditional on the chosen effect definition, the assumed fitting function, and the specific null-versus-alternative comparison encoded by the models</w:t>
+      </w:r>
+      <w:r>
+        <w:t xml:space="preserve"> </w:t>
+      </w:r>
+      <w:r>
+        <w:t xml:space="preserve">(Jobst et al., 2023; Moshagen &amp; Bader, 2024)</w:t>
+      </w:r>
+      <w:r>
+        <w:t xml:space="preserve">.</w:t>
+      </w:r>
+    </w:p>
+    <w:bookmarkEnd w:id="211"/>
+    <w:bookmarkEnd w:id="212"/>
+    <w:bookmarkStart w:id="233" w:name="references"/>
+    <w:p>
+      <w:pPr>
+        <w:pStyle w:val="Heading2"/>
+      </w:pPr>
+      <w:r>
         <w:t xml:space="preserve">References</w:t>
       </w:r>
     </w:p>
-    <w:bookmarkStart w:id="194" w:name="refs"/>
-    <w:bookmarkStart w:id="175" w:name="ref-feng2023"/>
+    <w:bookmarkStart w:id="232" w:name="refs"/>
+    <w:bookmarkStart w:id="213" w:name="ref-feng2023"/>
     <w:p>
       <w:pPr>
         <w:pStyle w:val="Bibliography"/>
@@ -26613,8 +29864,8 @@
         <w:t xml:space="preserve">. The Guilford Press.</w:t>
       </w:r>
     </w:p>
-    <w:bookmarkEnd w:id="175"/>
-    <w:bookmarkStart w:id="177" w:name="ref-jak2021"/>
+    <w:bookmarkEnd w:id="213"/>
+    <w:bookmarkStart w:id="215" w:name="ref-jak2021"/>
     <w:p>
       <w:pPr>
         <w:pStyle w:val="Bibliography"/>
@@ -26675,7 +29926,7 @@
       <w:r>
         <w:t xml:space="preserve"> </w:t>
       </w:r>
-      <w:hyperlink r:id="rId176">
+      <w:hyperlink r:id="rId214">
         <w:r>
           <w:rPr>
             <w:rStyle w:val="Hyperlink"/>
@@ -26684,8 +29935,8 @@
         </w:r>
       </w:hyperlink>
     </w:p>
-    <w:bookmarkEnd w:id="177"/>
-    <w:bookmarkStart w:id="179" w:name="ref-jobst2023"/>
+    <w:bookmarkEnd w:id="215"/>
+    <w:bookmarkStart w:id="217" w:name="ref-jobst2023"/>
     <w:p>
       <w:pPr>
         <w:pStyle w:val="Bibliography"/>
@@ -26722,7 +29973,7 @@
       <w:r>
         <w:t xml:space="preserve"> </w:t>
       </w:r>
-      <w:hyperlink r:id="rId178">
+      <w:hyperlink r:id="rId216">
         <w:r>
           <w:rPr>
             <w:rStyle w:val="Hyperlink"/>
@@ -26731,8 +29982,8 @@
         </w:r>
       </w:hyperlink>
     </w:p>
-    <w:bookmarkEnd w:id="179"/>
-    <w:bookmarkStart w:id="181" w:name="ref-kyriazos2018"/>
+    <w:bookmarkEnd w:id="217"/>
+    <w:bookmarkStart w:id="219" w:name="ref-kyriazos2018"/>
     <w:p>
       <w:pPr>
         <w:pStyle w:val="Bibliography"/>
@@ -26850,7 +30101,7 @@
       <w:r>
         <w:t xml:space="preserve"> </w:t>
       </w:r>
-      <w:hyperlink r:id="rId180">
+      <w:hyperlink r:id="rId218">
         <w:r>
           <w:rPr>
             <w:rStyle w:val="Hyperlink"/>
@@ -26859,8 +30110,8 @@
         </w:r>
       </w:hyperlink>
     </w:p>
-    <w:bookmarkEnd w:id="181"/>
-    <w:bookmarkStart w:id="183" w:name="ref-lin2022"/>
+    <w:bookmarkEnd w:id="219"/>
+    <w:bookmarkStart w:id="221" w:name="ref-lin2022"/>
     <w:p>
       <w:pPr>
         <w:pStyle w:val="Bibliography"/>
@@ -26909,7 +30160,7 @@
       <w:r>
         <w:t xml:space="preserve"> </w:t>
       </w:r>
-      <w:hyperlink r:id="rId182">
+      <w:hyperlink r:id="rId220">
         <w:r>
           <w:rPr>
             <w:rStyle w:val="Hyperlink"/>
@@ -26918,8 +30169,8 @@
         </w:r>
       </w:hyperlink>
     </w:p>
-    <w:bookmarkEnd w:id="183"/>
-    <w:bookmarkStart w:id="185" w:name="ref-maccallum1996"/>
+    <w:bookmarkEnd w:id="221"/>
+    <w:bookmarkStart w:id="223" w:name="ref-maccallum1996"/>
     <w:p>
       <w:pPr>
         <w:pStyle w:val="Bibliography"/>
@@ -26956,7 +30207,7 @@
       <w:r>
         <w:t xml:space="preserve"> </w:t>
       </w:r>
-      <w:hyperlink r:id="rId184">
+      <w:hyperlink r:id="rId222">
         <w:r>
           <w:rPr>
             <w:rStyle w:val="Hyperlink"/>
@@ -26965,8 +30216,8 @@
         </w:r>
       </w:hyperlink>
     </w:p>
-    <w:bookmarkEnd w:id="185"/>
-    <w:bookmarkStart w:id="187" w:name="ref-moshagen2024"/>
+    <w:bookmarkEnd w:id="223"/>
+    <w:bookmarkStart w:id="225" w:name="ref-moshagen2024"/>
     <w:p>
       <w:pPr>
         <w:pStyle w:val="Bibliography"/>
@@ -27024,7 +30275,7 @@
       <w:r>
         <w:t xml:space="preserve"> </w:t>
       </w:r>
-      <w:hyperlink r:id="rId186">
+      <w:hyperlink r:id="rId224">
         <w:r>
           <w:rPr>
             <w:rStyle w:val="Hyperlink"/>
@@ -27033,8 +30284,8 @@
         </w:r>
       </w:hyperlink>
     </w:p>
-    <w:bookmarkEnd w:id="187"/>
-    <w:bookmarkStart w:id="189" w:name="ref-mosqueirataipe2026"/>
+    <w:bookmarkEnd w:id="225"/>
+    <w:bookmarkStart w:id="227" w:name="ref-mosqueirataipe2026"/>
     <w:p>
       <w:pPr>
         <w:pStyle w:val="Bibliography"/>
@@ -27086,7 +30337,7 @@
       <w:r>
         <w:t xml:space="preserve"> </w:t>
       </w:r>
-      <w:hyperlink r:id="rId188">
+      <w:hyperlink r:id="rId226">
         <w:r>
           <w:rPr>
             <w:rStyle w:val="Hyperlink"/>
@@ -27095,8 +30346,8 @@
         </w:r>
       </w:hyperlink>
     </w:p>
-    <w:bookmarkEnd w:id="189"/>
-    <w:bookmarkStart w:id="191" w:name="ref-simsem2021"/>
+    <w:bookmarkEnd w:id="227"/>
+    <w:bookmarkStart w:id="229" w:name="ref-simsem2021"/>
     <w:p>
       <w:pPr>
         <w:pStyle w:val="Bibliography"/>
@@ -27134,7 +30385,7 @@
       <w:r>
         <w:t xml:space="preserve"> </w:t>
       </w:r>
-      <w:hyperlink r:id="rId190">
+      <w:hyperlink r:id="rId228">
         <w:r>
           <w:rPr>
             <w:rStyle w:val="Hyperlink"/>
@@ -27143,8 +30394,8 @@
         </w:r>
       </w:hyperlink>
     </w:p>
-    <w:bookmarkEnd w:id="191"/>
-    <w:bookmarkStart w:id="193" w:name="ref-wang2023"/>
+    <w:bookmarkEnd w:id="229"/>
+    <w:bookmarkStart w:id="231" w:name="ref-wang2023"/>
     <w:p>
       <w:pPr>
         <w:pStyle w:val="Bibliography"/>
@@ -27234,7 +30485,7 @@
       <w:r>
         <w:t xml:space="preserve"> </w:t>
       </w:r>
-      <w:hyperlink r:id="rId192">
+      <w:hyperlink r:id="rId230">
         <w:r>
           <w:rPr>
             <w:rStyle w:val="Hyperlink"/>
@@ -27243,9 +30494,9 @@
         </w:r>
       </w:hyperlink>
     </w:p>
-    <w:bookmarkEnd w:id="193"/>
-    <w:bookmarkEnd w:id="194"/>
-    <w:bookmarkEnd w:id="195"/>
+    <w:bookmarkEnd w:id="231"/>
+    <w:bookmarkEnd w:id="232"/>
+    <w:bookmarkEnd w:id="233"/>
     <w:sectPr>
       <w:footnotePr>
         <w:numRestart w:val="eachSect"/>

</xml_diff>

<commit_message>
fix: comments in chuncks revised
</commit_message>
<xml_diff>
--- a/docs/index.docx
+++ b/docs/index.docx
@@ -31,7 +31,7 @@
         <w:pStyle w:val="Date"/>
       </w:pPr>
       <w:r>
-        <w:t xml:space="preserve">2026-09-22</w:t>
+        <w:t xml:space="preserve">2026-09-23</w:t>
       </w:r>
     </w:p>
     <w:p>
@@ -10955,7 +10955,7 @@
         <w:rPr>
           <w:rStyle w:val="VerbatimChar"/>
         </w:rPr>
-        <w:t xml:space="preserve">Model degrees of freedom (with std.lv = TRUE): 245 </w:t>
+        <w:t xml:space="preserve">Model degrees of freedom: 245 </w:t>
       </w:r>
     </w:p>
     <w:p>
@@ -13919,7 +13919,7 @@
           <m:t>=</m:t>
         </m:r>
         <m:r>
-          <m:t>103</m:t>
+          <m:t>100</m:t>
         </m:r>
       </m:oMath>
       <w:r>
@@ -25177,33 +25177,7 @@
         <w:t xml:space="preserve"> </w:t>
       </w:r>
       <w:r>
-        <w:t xml:space="preserve">above the most demanding simulation result (</w:t>
-      </w:r>
-      <m:oMath>
-        <m:r>
-          <m:t>N</m:t>
-        </m:r>
-        <m:r>
-          <m:rPr>
-            <m:sty m:val="p"/>
-          </m:rPr>
-          <m:t>=</m:t>
-        </m:r>
-        <m:r>
-          <m:t>330</m:t>
-        </m:r>
-      </m:oMath>
-      <w:r>
-        <w:t xml:space="preserve"> </w:t>
-      </w:r>
-      <w:r>
-        <w:t xml:space="preserve">under the naive</w:t>
-      </w:r>
-      <w:r>
-        <w:t xml:space="preserve"> </w:t>
-      </w:r>
-      <w:r>
-        <w:t xml:space="preserve">population) — allows us to ask: does this</w:t>
+        <w:t xml:space="preserve">above the most demanding simulation result allows us to ask: does this</w:t>
       </w:r>
       <w:r>
         <w:t xml:space="preserve"> </w:t>
@@ -27025,7 +26999,7 @@
         <w:t xml:space="preserve">(Jak et al., 2021; Moshagen &amp; Bader, 2024)</w:t>
       </w:r>
       <w:r>
-        <w:t xml:space="preserve">. Three specifications are compared here,</w:t>
+        <w:t xml:space="preserve">. Two specifications are compared here,</w:t>
       </w:r>
       <w:r>
         <w:t xml:space="preserve"> </w:t>

</xml_diff>

<commit_message>
feat: sempower plots narrative change
</commit_message>
<xml_diff>
--- a/docs/index.docx
+++ b/docs/index.docx
@@ -3339,22 +3339,12 @@
               <w:t xml:space="preserve">Table 1: Summary of population models used for sensitivity analysis</w:t>
             </w:r>
           </w:p>
-          <w:p>
-            <w:pPr>
-              <w:pStyle w:val="Compact"/>
-              <w:jc w:val="center"/>
-            </w:pPr>
-            <w:r>
-              <w:t xml:space="preserve">CFA Population Models Parameter</w:t>
-            </w:r>
-          </w:p>
           <w:tbl>
             <w:tblPr>
               <w:tblStyle w:val="Table"/>
               <w:tblW w:type="pct" w:w="4870"/>
               <w:tblLayout w:type="fixed"/>
               <w:tblLook w:firstRow="1" w:lastRow="0" w:firstColumn="0" w:lastColumn="0" w:noHBand="0" w:noVBand="0" w:val="0020"/>
-              <w:tblCaption w:val="CFA Population Models Parameter"/>
             </w:tblPr>
             <w:tblGrid>
               <w:gridCol w:w="2982"/>
@@ -8753,7 +8743,7 @@
     </w:p>
     <w:bookmarkEnd w:id="47"/>
     <w:bookmarkEnd w:id="48"/>
-    <w:bookmarkStart w:id="87" w:name="sec-analytical"/>
+    <w:bookmarkStart w:id="86" w:name="sec-analytical"/>
     <w:p>
       <w:pPr>
         <w:pStyle w:val="Heading2"/>
@@ -8877,7 +8867,7 @@
         <w:t xml:space="preserve">.</w:t>
       </w:r>
     </w:p>
-    <w:bookmarkStart w:id="50" w:name="sec-df"/>
+    <w:bookmarkStart w:id="49" w:name="sec-df"/>
     <w:p>
       <w:pPr>
         <w:pStyle w:val="Heading3"/>
@@ -8949,48 +8939,123 @@
         <w:t xml:space="preserve"> </w:t>
       </w:r>
       <w:r>
-        <w:t xml:space="preserve">post hoc power calculation can proceed:</w:t>
+        <w:t xml:space="preserve">post hoc power calculation can proceed</w:t>
+      </w:r>
+      <w:r>
+        <w:t xml:space="preserve"> </w:t>
+      </w:r>
+      <w:r>
+        <w:t xml:space="preserve">(Jak et al., 2021; Moshagen &amp; Bader, 2024)</w:t>
+      </w:r>
+      <w:r>
+        <w:t xml:space="preserve">. For the</w:t>
+      </w:r>
+      <w:r>
+        <w:t xml:space="preserve"> </w:t>
+      </w:r>
+      <w:r>
+        <w:t xml:space="preserve">hypothesized four-factor WHOQOL-BREF CFA model analyzed here (comprising</w:t>
+      </w:r>
+      <w:r>
+        <w:t xml:space="preserve"> </w:t>
+      </w:r>
+      <w:r>
+        <w:t xml:space="preserve">24 observed indicators, yielding</w:t>
+      </w:r>
+      <w:r>
+        <w:t xml:space="preserve"> </w:t>
+      </w:r>
+      <m:oMath>
+        <m:r>
+          <m:t>p</m:t>
+        </m:r>
+        <m:r>
+          <m:rPr>
+            <m:sty m:val="p"/>
+          </m:rPr>
+          <m:t>(</m:t>
+        </m:r>
+        <m:r>
+          <m:t>p</m:t>
+        </m:r>
+        <m:r>
+          <m:rPr>
+            <m:sty m:val="p"/>
+          </m:rPr>
+          <m:t>+</m:t>
+        </m:r>
+        <m:r>
+          <m:t>1</m:t>
+        </m:r>
+        <m:r>
+          <m:rPr>
+            <m:sty m:val="p"/>
+          </m:rPr>
+          <m:t>)</m:t>
+        </m:r>
+        <m:r>
+          <m:rPr>
+            <m:sty m:val="p"/>
+          </m:rPr>
+          <m:t>/</m:t>
+        </m:r>
+        <m:r>
+          <m:t>2</m:t>
+        </m:r>
+        <m:r>
+          <m:rPr>
+            <m:sty m:val="p"/>
+          </m:rPr>
+          <m:t>=</m:t>
+        </m:r>
+        <m:r>
+          <m:t>300</m:t>
+        </m:r>
+      </m:oMath>
+      <w:r>
+        <w:t xml:space="preserve"> </w:t>
+      </w:r>
+      <w:r>
+        <w:t xml:space="preserve">non-redundant sample</w:t>
+      </w:r>
+      <w:r>
+        <w:t xml:space="preserve"> </w:t>
+      </w:r>
+      <w:r>
+        <w:t xml:space="preserve">moments and 55 freely estimated parameters under standardized latent</w:t>
+      </w:r>
+      <w:r>
+        <w:t xml:space="preserve"> </w:t>
+      </w:r>
+      <w:r>
+        <w:t xml:space="preserve">variables), this yields</w:t>
+      </w:r>
+      <w:r>
+        <w:t xml:space="preserve"> </w:t>
+      </w:r>
+      <m:oMath>
+        <m:r>
+          <m:t>d</m:t>
+        </m:r>
+        <m:r>
+          <m:t>f</m:t>
+        </m:r>
+        <m:r>
+          <m:rPr>
+            <m:sty m:val="p"/>
+          </m:rPr>
+          <m:t>=</m:t>
+        </m:r>
+        <m:r>
+          <m:t>245</m:t>
+        </m:r>
+      </m:oMath>
+      <w:r>
+        <w:t xml:space="preserve">.</w:t>
       </w:r>
     </w:p>
-    <w:p>
-      <w:pPr>
-        <w:pStyle w:val="SourceCode"/>
-      </w:pPr>
-      <w:r>
-        <w:rPr>
-          <w:rStyle w:val="VerbatimChar"/>
-        </w:rPr>
-        <w:t xml:space="preserve">Model degrees of freedom: 245 </w:t>
-      </w:r>
-    </w:p>
-    <w:p>
-      <w:pPr>
-        <w:pStyle w:val="FirstParagraph"/>
-      </w:pPr>
-      <w:r>
-        <w:rPr>
-          <w:vertAlign w:val="subscript"/>
-        </w:rPr>
-        <w:t xml:space="preserve">Source:</w:t>
-      </w:r>
-      <w:r>
-        <w:rPr>
-          <w:vertAlign w:val="subscript"/>
-        </w:rPr>
-        <w:t xml:space="preserve"> </w:t>
-      </w:r>
-      <w:hyperlink r:id="rId49">
-        <w:r>
-          <w:rPr>
-            <w:rStyle w:val="Hyperlink"/>
-            <w:vertAlign w:val="subscript"/>
-          </w:rPr>
-          <w:t xml:space="preserve">Analytical Power Analysis</w:t>
-        </w:r>
-      </w:hyperlink>
-    </w:p>
-    <w:bookmarkEnd w:id="50"/>
-    <w:bookmarkStart w:id="67" w:name="sec-apriori"/>
+    <w:bookmarkEnd w:id="49"/>
+    <w:bookmarkStart w:id="66" w:name="sec-apriori"/>
     <w:p>
       <w:pPr>
         <w:pStyle w:val="Heading3"/>
@@ -8999,7 +9064,7 @@
         <w:t xml:space="preserve">3.2 A Priori: How Many Observations?</w:t>
       </w:r>
     </w:p>
-    <w:bookmarkStart w:id="58" w:name="model-free-approach-rmsea-based"/>
+    <w:bookmarkStart w:id="57" w:name="model-free-approach-rmsea-based"/>
     <w:p>
       <w:pPr>
         <w:pStyle w:val="Heading4"/>
@@ -9233,7 +9298,7 @@
       <w:tr>
         <w:tc>
           <w:tcPr/>
-          <w:bookmarkStart w:id="51" w:name="tbl-apriori-rmsea"/>
+          <w:bookmarkStart w:id="50" w:name="tbl-apriori-rmsea"/>
           <w:p>
             <w:pPr>
               <w:jc w:val="center"/>
@@ -9874,7 +9939,7 @@
               </w:tc>
             </w:tr>
           </w:tbl>
-          <w:bookmarkEnd w:id="51"/>
+          <w:bookmarkEnd w:id="50"/>
           <w:p/>
         </w:tc>
       </w:tr>
@@ -9895,7 +9960,7 @@
         </w:rPr>
         <w:t xml:space="preserve"> </w:t>
       </w:r>
-      <w:hyperlink r:id="rId52">
+      <w:hyperlink r:id="rId51">
         <w:r>
           <w:rPr>
             <w:rStyle w:val="Hyperlink"/>
@@ -10771,7 +10836,7 @@
       <w:tr>
         <w:tc>
           <w:tcPr/>
-          <w:bookmarkStart w:id="56" w:name="fig-apriori-rmsea"/>
+          <w:bookmarkStart w:id="55" w:name="fig-apriori-rmsea"/>
           <w:p>
             <w:pPr>
               <w:pStyle w:val="Compact"/>
@@ -10782,18 +10847,18 @@
                 <wp:inline>
                   <wp:extent cx="5334000" cy="3333749"/>
                   <wp:effectExtent b="0" l="0" r="0" t="0"/>
-                  <wp:docPr descr="" title="" id="54" name="Picture"/>
+                  <wp:docPr descr="" title="" id="53" name="Picture"/>
                   <a:graphic>
                     <a:graphicData uri="http://schemas.openxmlformats.org/drawingml/2006/picture">
                       <pic:pic>
                         <pic:nvPicPr>
-                          <pic:cNvPr descr="index_files/figure-docx/Scripts-AnalysisScripts-02_analytical_power-fig-apriori-rmsea-output-1.png" id="55" name="Picture"/>
+                          <pic:cNvPr descr="index_files/figure-docx/Scripts-AnalysisScripts-02_analytical_power-fig-apriori-rmsea-output-1.png" id="54" name="Picture"/>
                           <pic:cNvPicPr>
                             <a:picLocks noChangeArrowheads="1" noChangeAspect="1"/>
                           </pic:cNvPicPr>
                         </pic:nvPicPr>
                         <pic:blipFill>
-                          <a:blip r:embed="rId53"/>
+                          <a:blip r:embed="rId52"/>
                           <a:stretch>
                             <a:fillRect/>
                           </a:stretch>
@@ -10833,7 +10898,7 @@
               <w:t xml:space="preserve">Figure 6: A priori power analysis for exact fit with RMSEA-based effect size</w:t>
             </w:r>
           </w:p>
-          <w:bookmarkEnd w:id="56"/>
+          <w:bookmarkEnd w:id="55"/>
         </w:tc>
       </w:tr>
     </w:tbl>
@@ -10853,7 +10918,7 @@
         </w:rPr>
         <w:t xml:space="preserve"> </w:t>
       </w:r>
-      <w:hyperlink r:id="rId57">
+      <w:hyperlink r:id="rId56">
         <w:r>
           <w:rPr>
             <w:rStyle w:val="Hyperlink"/>
@@ -10863,8 +10928,8 @@
         </w:r>
       </w:hyperlink>
     </w:p>
-    <w:bookmarkEnd w:id="58"/>
-    <w:bookmarkStart w:id="66" w:name="model-based-approach"/>
+    <w:bookmarkEnd w:id="57"/>
+    <w:bookmarkStart w:id="65" w:name="model-based-approach"/>
     <w:p>
       <w:pPr>
         <w:pStyle w:val="Heading4"/>
@@ -11115,7 +11180,7 @@
       <w:tr>
         <w:tc>
           <w:tcPr/>
-          <w:bookmarkStart w:id="59" w:name="tbl-apriori-popmodel"/>
+          <w:bookmarkStart w:id="58" w:name="tbl-apriori-popmodel"/>
           <w:p>
             <w:pPr>
               <w:jc w:val="center"/>
@@ -11756,7 +11821,7 @@
               </w:tc>
             </w:tr>
           </w:tbl>
-          <w:bookmarkEnd w:id="59"/>
+          <w:bookmarkEnd w:id="58"/>
           <w:p/>
         </w:tc>
       </w:tr>
@@ -11777,7 +11842,7 @@
         </w:rPr>
         <w:t xml:space="preserve"> </w:t>
       </w:r>
-      <w:hyperlink r:id="rId60">
+      <w:hyperlink r:id="rId59">
         <w:r>
           <w:rPr>
             <w:rStyle w:val="Hyperlink"/>
@@ -12073,7 +12138,7 @@
       <w:tr>
         <w:tc>
           <w:tcPr/>
-          <w:bookmarkStart w:id="64" w:name="fig-apriori-popmodel"/>
+          <w:bookmarkStart w:id="63" w:name="fig-apriori-popmodel"/>
           <w:p>
             <w:pPr>
               <w:pStyle w:val="Compact"/>
@@ -12084,18 +12149,18 @@
                 <wp:inline>
                   <wp:extent cx="5334000" cy="3333749"/>
                   <wp:effectExtent b="0" l="0" r="0" t="0"/>
-                  <wp:docPr descr="" title="" id="62" name="Picture"/>
+                  <wp:docPr descr="" title="" id="61" name="Picture"/>
                   <a:graphic>
                     <a:graphicData uri="http://schemas.openxmlformats.org/drawingml/2006/picture">
                       <pic:pic>
                         <pic:nvPicPr>
-                          <pic:cNvPr descr="index_files/figure-docx/Scripts-AnalysisScripts-02_analytical_power-fig-apriori-popmodel-output-1.png" id="63" name="Picture"/>
+                          <pic:cNvPr descr="index_files/figure-docx/Scripts-AnalysisScripts-02_analytical_power-fig-apriori-popmodel-output-1.png" id="62" name="Picture"/>
                           <pic:cNvPicPr>
                             <a:picLocks noChangeArrowheads="1" noChangeAspect="1"/>
                           </pic:cNvPicPr>
                         </pic:nvPicPr>
                         <pic:blipFill>
-                          <a:blip r:embed="rId61"/>
+                          <a:blip r:embed="rId60"/>
                           <a:stretch>
                             <a:fillRect/>
                           </a:stretch>
@@ -12135,7 +12200,7 @@
               <w:t xml:space="preserve">Figure 7: A priori power analysis Model-based approach (h1model vs analyzemodel)</w:t>
             </w:r>
           </w:p>
-          <w:bookmarkEnd w:id="64"/>
+          <w:bookmarkEnd w:id="63"/>
         </w:tc>
       </w:tr>
     </w:tbl>
@@ -12155,7 +12220,7 @@
         </w:rPr>
         <w:t xml:space="preserve"> </w:t>
       </w:r>
-      <w:hyperlink r:id="rId65">
+      <w:hyperlink r:id="rId64">
         <w:r>
           <w:rPr>
             <w:rStyle w:val="Hyperlink"/>
@@ -12165,9 +12230,9 @@
         </w:r>
       </w:hyperlink>
     </w:p>
+    <w:bookmarkEnd w:id="65"/>
     <w:bookmarkEnd w:id="66"/>
-    <w:bookmarkEnd w:id="67"/>
-    <w:bookmarkStart w:id="80" w:name="sec-power-curves"/>
+    <w:bookmarkStart w:id="79" w:name="sec-power-curves"/>
     <w:p>
       <w:pPr>
         <w:pStyle w:val="Heading3"/>
@@ -12262,7 +12327,7 @@
         <w:t xml:space="preserve">.</w:t>
       </w:r>
     </w:p>
-    <w:bookmarkStart w:id="73" w:name="model-free-approach-rmsea-based-1"/>
+    <w:bookmarkStart w:id="72" w:name="model-free-approach-rmsea-based-1"/>
     <w:p>
       <w:pPr>
         <w:pStyle w:val="Heading4"/>
@@ -12423,7 +12488,7 @@
       <w:tr>
         <w:tc>
           <w:tcPr/>
-          <w:bookmarkStart w:id="71" w:name="fig-power-rmsea"/>
+          <w:bookmarkStart w:id="70" w:name="fig-power-rmsea"/>
           <w:p>
             <w:pPr>
               <w:pStyle w:val="Compact"/>
@@ -12434,18 +12499,18 @@
                 <wp:inline>
                   <wp:extent cx="5334000" cy="3333749"/>
                   <wp:effectExtent b="0" l="0" r="0" t="0"/>
-                  <wp:docPr descr="" title="" id="69" name="Picture"/>
+                  <wp:docPr descr="" title="" id="68" name="Picture"/>
                   <a:graphic>
                     <a:graphicData uri="http://schemas.openxmlformats.org/drawingml/2006/picture">
                       <pic:pic>
                         <pic:nvPicPr>
-                          <pic:cNvPr descr="index_files/figure-docx/Scripts-AnalysisScripts-02_analytical_power-fig-power-rmsea-output-1.png" id="70" name="Picture"/>
+                          <pic:cNvPr descr="index_files/figure-docx/Scripts-AnalysisScripts-02_analytical_power-fig-power-rmsea-output-1.png" id="69" name="Picture"/>
                           <pic:cNvPicPr>
                             <a:picLocks noChangeArrowheads="1" noChangeAspect="1"/>
                           </pic:cNvPicPr>
                         </pic:nvPicPr>
                         <pic:blipFill>
-                          <a:blip r:embed="rId68"/>
+                          <a:blip r:embed="rId67"/>
                           <a:stretch>
                             <a:fillRect/>
                           </a:stretch>
@@ -12485,7 +12550,7 @@
               <w:t xml:space="preserve">Figure 8: Power as a function of sample size for RMSEA = 0.05</w:t>
             </w:r>
           </w:p>
-          <w:bookmarkEnd w:id="71"/>
+          <w:bookmarkEnd w:id="70"/>
         </w:tc>
       </w:tr>
     </w:tbl>
@@ -12505,7 +12570,7 @@
         </w:rPr>
         <w:t xml:space="preserve"> </w:t>
       </w:r>
-      <w:hyperlink r:id="rId72">
+      <w:hyperlink r:id="rId71">
         <w:r>
           <w:rPr>
             <w:rStyle w:val="Hyperlink"/>
@@ -12581,8 +12646,8 @@
         <w:t xml:space="preserve">convert into detection probability in this particular setting.</w:t>
       </w:r>
     </w:p>
-    <w:bookmarkEnd w:id="73"/>
-    <w:bookmarkStart w:id="79" w:name="model-based-approach-1"/>
+    <w:bookmarkEnd w:id="72"/>
+    <w:bookmarkStart w:id="78" w:name="model-based-approach-1"/>
     <w:p>
       <w:pPr>
         <w:pStyle w:val="Heading4"/>
@@ -12689,7 +12754,7 @@
       <w:tr>
         <w:tc>
           <w:tcPr/>
-          <w:bookmarkStart w:id="77" w:name="fig-power-popmodel"/>
+          <w:bookmarkStart w:id="76" w:name="fig-power-popmodel"/>
           <w:p>
             <w:pPr>
               <w:pStyle w:val="Compact"/>
@@ -12700,18 +12765,18 @@
                 <wp:inline>
                   <wp:extent cx="5334000" cy="3333749"/>
                   <wp:effectExtent b="0" l="0" r="0" t="0"/>
-                  <wp:docPr descr="" title="" id="75" name="Picture"/>
+                  <wp:docPr descr="" title="" id="74" name="Picture"/>
                   <a:graphic>
                     <a:graphicData uri="http://schemas.openxmlformats.org/drawingml/2006/picture">
                       <pic:pic>
                         <pic:nvPicPr>
-                          <pic:cNvPr descr="index_files/figure-docx/Scripts-AnalysisScripts-02_analytical_power-fig-power-popmodel-output-1.png" id="76" name="Picture"/>
+                          <pic:cNvPr descr="index_files/figure-docx/Scripts-AnalysisScripts-02_analytical_power-fig-power-popmodel-output-1.png" id="75" name="Picture"/>
                           <pic:cNvPicPr>
                             <a:picLocks noChangeArrowheads="1" noChangeAspect="1"/>
                           </pic:cNvPicPr>
                         </pic:nvPicPr>
                         <pic:blipFill>
-                          <a:blip r:embed="rId74"/>
+                          <a:blip r:embed="rId73"/>
                           <a:stretch>
                             <a:fillRect/>
                           </a:stretch>
@@ -12751,7 +12816,7 @@
               <w:t xml:space="preserve">Figure 9: Power as a function of sample size for the population model (popModel)</w:t>
             </w:r>
           </w:p>
-          <w:bookmarkEnd w:id="77"/>
+          <w:bookmarkEnd w:id="76"/>
         </w:tc>
       </w:tr>
     </w:tbl>
@@ -12771,7 +12836,7 @@
         </w:rPr>
         <w:t xml:space="preserve"> </w:t>
       </w:r>
-      <w:hyperlink r:id="rId78">
+      <w:hyperlink r:id="rId77">
         <w:r>
           <w:rPr>
             <w:rStyle w:val="Hyperlink"/>
@@ -12978,9 +13043,9 @@
         <w:t xml:space="preserve">with further gains becoming marginal above that.</w:t>
       </w:r>
     </w:p>
+    <w:bookmarkEnd w:id="78"/>
     <w:bookmarkEnd w:id="79"/>
-    <w:bookmarkEnd w:id="80"/>
-    <w:bookmarkStart w:id="86" w:name="summary-table"/>
+    <w:bookmarkStart w:id="85" w:name="summary-table"/>
     <w:p>
       <w:pPr>
         <w:pStyle w:val="Heading3"/>
@@ -13126,7 +13191,7 @@
       <w:tr>
         <w:tc>
           <w:tcPr/>
-          <w:bookmarkStart w:id="81" w:name="tbl-analytical-summary"/>
+          <w:bookmarkStart w:id="80" w:name="tbl-analytical-summary"/>
           <w:p>
             <w:pPr>
               <w:jc w:val="center"/>
@@ -13368,7 +13433,7 @@
               </w:tc>
             </w:tr>
           </w:tbl>
-          <w:bookmarkEnd w:id="81"/>
+          <w:bookmarkEnd w:id="80"/>
           <w:p/>
         </w:tc>
       </w:tr>
@@ -13389,7 +13454,7 @@
         </w:rPr>
         <w:t xml:space="preserve"> </w:t>
       </w:r>
-      <w:hyperlink r:id="rId82">
+      <w:hyperlink r:id="rId81">
         <w:r>
           <w:rPr>
             <w:rStyle w:val="Hyperlink"/>
@@ -13440,18 +13505,18 @@
                 <wp:inline>
                   <wp:extent cx="152400" cy="152400"/>
                   <wp:effectExtent b="0" l="0" r="0" t="0"/>
-                  <wp:docPr descr="" title="" id="84" name="Picture"/>
+                  <wp:docPr descr="" title="" id="83" name="Picture"/>
                   <a:graphic>
                     <a:graphicData uri="http://schemas.openxmlformats.org/drawingml/2006/picture">
                       <pic:pic>
                         <pic:nvPicPr>
-                          <pic:cNvPr descr="C:\Program Files\Quarto\share\formats\docx\important.png" id="85" name="Picture"/>
+                          <pic:cNvPr descr="C:\Program Files\Quarto\share\formats\docx\important.png" id="84" name="Picture"/>
                           <pic:cNvPicPr>
                             <a:picLocks noChangeArrowheads="1" noChangeAspect="1"/>
                           </pic:cNvPicPr>
                         </pic:nvPicPr>
                         <pic:blipFill>
-                          <a:blip r:embed="rId83"/>
+                          <a:blip r:embed="rId82"/>
                           <a:stretch>
                             <a:fillRect/>
                           </a:stretch>
@@ -13594,9 +13659,9 @@
         </w:tc>
       </w:tr>
     </w:tbl>
+    <w:bookmarkEnd w:id="85"/>
     <w:bookmarkEnd w:id="86"/>
-    <w:bookmarkEnd w:id="87"/>
-    <w:bookmarkStart w:id="121" w:name="sec-sim-ideal"/>
+    <w:bookmarkStart w:id="120" w:name="sec-sim-ideal"/>
     <w:p>
       <w:pPr>
         <w:pStyle w:val="Heading2"/>
@@ -13984,7 +14049,7 @@
         <w:t xml:space="preserve">.</w:t>
       </w:r>
     </w:p>
-    <w:bookmarkStart w:id="100" w:name="main-analysis-under-ideal-conditions"/>
+    <w:bookmarkStart w:id="99" w:name="main-analysis-under-ideal-conditions"/>
     <w:p>
       <w:pPr>
         <w:pStyle w:val="Heading3"/>
@@ -14084,7 +14149,7 @@
       <w:tr>
         <w:tc>
           <w:tcPr/>
-          <w:bookmarkStart w:id="91" w:name="fig-power-curve-ideal"/>
+          <w:bookmarkStart w:id="90" w:name="fig-power-curve-ideal"/>
           <w:p>
             <w:pPr>
               <w:pStyle w:val="Compact"/>
@@ -14095,18 +14160,18 @@
                 <wp:inline>
                   <wp:extent cx="5334000" cy="3333749"/>
                   <wp:effectExtent b="0" l="0" r="0" t="0"/>
-                  <wp:docPr descr="" title="" id="89" name="Picture"/>
+                  <wp:docPr descr="" title="" id="88" name="Picture"/>
                   <a:graphic>
                     <a:graphicData uri="http://schemas.openxmlformats.org/drawingml/2006/picture">
                       <pic:pic>
                         <pic:nvPicPr>
-                          <pic:cNvPr descr="index_files/figure-docx/Scripts-AnalysisScripts-03_simulation_ideal-fig-power-curve-ideal-output-1.png" id="90" name="Picture"/>
+                          <pic:cNvPr descr="index_files/figure-docx/Scripts-AnalysisScripts-03_simulation_ideal-fig-power-curve-ideal-output-1.png" id="89" name="Picture"/>
                           <pic:cNvPicPr>
                             <a:picLocks noChangeArrowheads="1" noChangeAspect="1"/>
                           </pic:cNvPicPr>
                         </pic:nvPicPr>
                         <pic:blipFill>
-                          <a:blip r:embed="rId88"/>
+                          <a:blip r:embed="rId87"/>
                           <a:stretch>
                             <a:fillRect/>
                           </a:stretch>
@@ -14146,7 +14211,7 @@
               <w:t xml:space="preserve">Figure 10: Power curves for fit indices under ideal conditions.</w:t>
             </w:r>
           </w:p>
-          <w:bookmarkEnd w:id="91"/>
+          <w:bookmarkEnd w:id="90"/>
         </w:tc>
       </w:tr>
     </w:tbl>
@@ -14166,7 +14231,7 @@
         </w:rPr>
         <w:t xml:space="preserve"> </w:t>
       </w:r>
-      <w:hyperlink r:id="rId92">
+      <w:hyperlink r:id="rId91">
         <w:r>
           <w:rPr>
             <w:rStyle w:val="Hyperlink"/>
@@ -14292,7 +14357,7 @@
       <w:tr>
         <w:tc>
           <w:tcPr/>
-          <w:bookmarkStart w:id="96" w:name="fig-fit-curve-ideal"/>
+          <w:bookmarkStart w:id="95" w:name="fig-fit-curve-ideal"/>
           <w:p>
             <w:pPr>
               <w:pStyle w:val="Compact"/>
@@ -14303,18 +14368,18 @@
                 <wp:inline>
                   <wp:extent cx="5334000" cy="3333749"/>
                   <wp:effectExtent b="0" l="0" r="0" t="0"/>
-                  <wp:docPr descr="" title="" id="94" name="Picture"/>
+                  <wp:docPr descr="" title="" id="93" name="Picture"/>
                   <a:graphic>
                     <a:graphicData uri="http://schemas.openxmlformats.org/drawingml/2006/picture">
                       <pic:pic>
                         <pic:nvPicPr>
-                          <pic:cNvPr descr="index_files/figure-docx/Scripts-AnalysisScripts-03_simulation_ideal-fig-fit-curve-ideal-output-1.png" id="95" name="Picture"/>
+                          <pic:cNvPr descr="index_files/figure-docx/Scripts-AnalysisScripts-03_simulation_ideal-fig-fit-curve-ideal-output-1.png" id="94" name="Picture"/>
                           <pic:cNvPicPr>
                             <a:picLocks noChangeArrowheads="1" noChangeAspect="1"/>
                           </pic:cNvPicPr>
                         </pic:nvPicPr>
                         <pic:blipFill>
-                          <a:blip r:embed="rId93"/>
+                          <a:blip r:embed="rId92"/>
                           <a:stretch>
                             <a:fillRect/>
                           </a:stretch>
@@ -14354,7 +14419,7 @@
               <w:t xml:space="preserve">Figure 11: Power curves for fit indices under ideal conditions without logistic smoothing.</w:t>
             </w:r>
           </w:p>
-          <w:bookmarkEnd w:id="96"/>
+          <w:bookmarkEnd w:id="95"/>
         </w:tc>
       </w:tr>
     </w:tbl>
@@ -14374,7 +14439,7 @@
         </w:rPr>
         <w:t xml:space="preserve"> </w:t>
       </w:r>
-      <w:hyperlink r:id="rId97">
+      <w:hyperlink r:id="rId96">
         <w:r>
           <w:rPr>
             <w:rStyle w:val="Hyperlink"/>
@@ -14518,7 +14583,7 @@
       <w:tr>
         <w:tc>
           <w:tcPr/>
-          <w:bookmarkStart w:id="98" w:name="tbl-power-cutoff-ideal"/>
+          <w:bookmarkStart w:id="97" w:name="tbl-power-cutoff-ideal"/>
           <w:p>
             <w:pPr>
               <w:jc w:val="center"/>
@@ -14743,7 +14808,7 @@
               </w:tc>
             </w:tr>
           </w:tbl>
-          <w:bookmarkEnd w:id="98"/>
+          <w:bookmarkEnd w:id="97"/>
           <w:p/>
         </w:tc>
       </w:tr>
@@ -14764,7 +14829,7 @@
         </w:rPr>
         <w:t xml:space="preserve"> </w:t>
       </w:r>
-      <w:hyperlink r:id="rId99">
+      <w:hyperlink r:id="rId98">
         <w:r>
           <w:rPr>
             <w:rStyle w:val="Hyperlink"/>
@@ -14936,8 +15001,8 @@
         <w:t xml:space="preserve">.</w:t>
       </w:r>
     </w:p>
-    <w:bookmarkEnd w:id="100"/>
-    <w:bookmarkStart w:id="108" w:name="X70068e6c6160cb41119ebf72f66dcb66c5fd7ee"/>
+    <w:bookmarkEnd w:id="99"/>
+    <w:bookmarkStart w:id="107" w:name="X70068e6c6160cb41119ebf72f66dcb66c5fd7ee"/>
     <w:p>
       <w:pPr>
         <w:pStyle w:val="Heading3"/>
@@ -15111,7 +15176,7 @@
       <w:tr>
         <w:tc>
           <w:tcPr/>
-          <w:bookmarkStart w:id="104" w:name="fig-fit-curve-traditional"/>
+          <w:bookmarkStart w:id="103" w:name="fig-fit-curve-traditional"/>
           <w:p>
             <w:pPr>
               <w:pStyle w:val="Compact"/>
@@ -15122,18 +15187,18 @@
                 <wp:inline>
                   <wp:extent cx="5334000" cy="3333749"/>
                   <wp:effectExtent b="0" l="0" r="0" t="0"/>
-                  <wp:docPr descr="" title="" id="102" name="Picture"/>
+                  <wp:docPr descr="" title="" id="101" name="Picture"/>
                   <a:graphic>
                     <a:graphicData uri="http://schemas.openxmlformats.org/drawingml/2006/picture">
                       <pic:pic>
                         <pic:nvPicPr>
-                          <pic:cNvPr descr="index_files/figure-docx/Scripts-AnalysisScripts-03_simulation_ideal-fig-fit-curve-traditional-output-1.png" id="103" name="Picture"/>
+                          <pic:cNvPr descr="index_files/figure-docx/Scripts-AnalysisScripts-03_simulation_ideal-fig-fit-curve-traditional-output-1.png" id="102" name="Picture"/>
                           <pic:cNvPicPr>
                             <a:picLocks noChangeArrowheads="1" noChangeAspect="1"/>
                           </pic:cNvPicPr>
                         </pic:nvPicPr>
                         <pic:blipFill>
-                          <a:blip r:embed="rId101"/>
+                          <a:blip r:embed="rId100"/>
                           <a:stretch>
                             <a:fillRect/>
                           </a:stretch>
@@ -15173,7 +15238,7 @@
               <w:t xml:space="preserve">Figure 12: Power curves using traditional fit index cutoffs under ideal conditions.</w:t>
             </w:r>
           </w:p>
-          <w:bookmarkEnd w:id="104"/>
+          <w:bookmarkEnd w:id="103"/>
         </w:tc>
       </w:tr>
     </w:tbl>
@@ -15193,7 +15258,7 @@
         </w:rPr>
         <w:t xml:space="preserve"> </w:t>
       </w:r>
-      <w:hyperlink r:id="rId105">
+      <w:hyperlink r:id="rId104">
         <w:r>
           <w:rPr>
             <w:rStyle w:val="Hyperlink"/>
@@ -15359,7 +15424,7 @@
       <w:tr>
         <w:tc>
           <w:tcPr/>
-          <w:bookmarkStart w:id="106" w:name="tbl-power-cutoff-traditional-ideal"/>
+          <w:bookmarkStart w:id="105" w:name="tbl-power-cutoff-traditional-ideal"/>
           <w:p>
             <w:pPr>
               <w:jc w:val="center"/>
@@ -15518,7 +15583,7 @@
               </w:tc>
             </w:tr>
           </w:tbl>
-          <w:bookmarkEnd w:id="106"/>
+          <w:bookmarkEnd w:id="105"/>
           <w:p/>
         </w:tc>
       </w:tr>
@@ -15539,7 +15604,7 @@
         </w:rPr>
         <w:t xml:space="preserve"> </w:t>
       </w:r>
-      <w:hyperlink r:id="rId107">
+      <w:hyperlink r:id="rId106">
         <w:r>
           <w:rPr>
             <w:rStyle w:val="Hyperlink"/>
@@ -15549,8 +15614,8 @@
         </w:r>
       </w:hyperlink>
     </w:p>
-    <w:bookmarkEnd w:id="108"/>
-    <w:bookmarkStart w:id="113" w:name="targeting-specific-parameters"/>
+    <w:bookmarkEnd w:id="107"/>
+    <w:bookmarkStart w:id="112" w:name="targeting-specific-parameters"/>
     <w:p>
       <w:pPr>
         <w:pStyle w:val="Heading3"/>
@@ -15680,7 +15745,7 @@
       <w:tr>
         <w:tc>
           <w:tcPr/>
-          <w:bookmarkStart w:id="109" w:name="tbl-param-estimate-ideal"/>
+          <w:bookmarkStart w:id="108" w:name="tbl-param-estimate-ideal"/>
           <w:p>
             <w:pPr>
               <w:jc w:val="center"/>
@@ -19352,7 +19417,7 @@
               </w:tc>
             </w:tr>
           </w:tbl>
-          <w:bookmarkEnd w:id="109"/>
+          <w:bookmarkEnd w:id="108"/>
           <w:p/>
         </w:tc>
       </w:tr>
@@ -19373,7 +19438,7 @@
         </w:rPr>
         <w:t xml:space="preserve"> </w:t>
       </w:r>
-      <w:hyperlink r:id="rId110">
+      <w:hyperlink r:id="rId109">
         <w:r>
           <w:rPr>
             <w:rStyle w:val="Hyperlink"/>
@@ -19662,7 +19727,7 @@
       <w:tr>
         <w:tc>
           <w:tcPr/>
-          <w:bookmarkStart w:id="111" w:name="tbl-power-n-ideal"/>
+          <w:bookmarkStart w:id="110" w:name="tbl-power-n-ideal"/>
           <w:p>
             <w:pPr>
               <w:jc w:val="center"/>
@@ -20110,7 +20175,7 @@
               </w:tc>
             </w:tr>
           </w:tbl>
-          <w:bookmarkEnd w:id="111"/>
+          <w:bookmarkEnd w:id="110"/>
           <w:p/>
         </w:tc>
       </w:tr>
@@ -20131,7 +20196,7 @@
         </w:rPr>
         <w:t xml:space="preserve"> </w:t>
       </w:r>
-      <w:hyperlink r:id="rId112">
+      <w:hyperlink r:id="rId111">
         <w:r>
           <w:rPr>
             <w:rStyle w:val="Hyperlink"/>
@@ -20304,8 +20369,8 @@
         <w:t xml:space="preserve">for parameter-level planning in this model.</w:t>
       </w:r>
     </w:p>
-    <w:bookmarkEnd w:id="113"/>
-    <w:bookmarkStart w:id="120" w:name="recovering-population-parameters"/>
+    <w:bookmarkEnd w:id="112"/>
+    <w:bookmarkStart w:id="119" w:name="recovering-population-parameters"/>
     <w:p>
       <w:pPr>
         <w:pStyle w:val="Heading3"/>
@@ -20314,7 +20379,7 @@
         <w:t xml:space="preserve">4.4 Recovering population parameters</w:t>
       </w:r>
     </w:p>
-    <w:bookmarkStart w:id="116" w:name="X1209260cfd11d7a4f20ced4599fb769750fdbcd"/>
+    <w:bookmarkStart w:id="115" w:name="X1209260cfd11d7a4f20ced4599fb769750fdbcd"/>
     <w:p>
       <w:pPr>
         <w:pStyle w:val="Heading4"/>
@@ -20504,7 +20569,7 @@
       <w:tr>
         <w:tc>
           <w:tcPr/>
-          <w:bookmarkStart w:id="114" w:name="tbl-power-n-naive"/>
+          <w:bookmarkStart w:id="113" w:name="tbl-power-n-naive"/>
           <w:p>
             <w:pPr>
               <w:jc w:val="center"/>
@@ -21173,7 +21238,7 @@
               </w:tc>
             </w:tr>
           </w:tbl>
-          <w:bookmarkEnd w:id="114"/>
+          <w:bookmarkEnd w:id="113"/>
           <w:p/>
         </w:tc>
       </w:tr>
@@ -21194,7 +21259,7 @@
         </w:rPr>
         <w:t xml:space="preserve"> </w:t>
       </w:r>
-      <w:hyperlink r:id="rId115">
+      <w:hyperlink r:id="rId114">
         <w:r>
           <w:rPr>
             <w:rStyle w:val="Hyperlink"/>
@@ -21622,8 +21687,8 @@
         <w:t xml:space="preserve">sample size for the naive scenario.</w:t>
       </w:r>
     </w:p>
-    <w:bookmarkEnd w:id="116"/>
-    <w:bookmarkStart w:id="119" w:name="X56f8ae3dd1d94e0156a3456a70160ad55f74458"/>
+    <w:bookmarkEnd w:id="115"/>
+    <w:bookmarkStart w:id="118" w:name="X56f8ae3dd1d94e0156a3456a70160ad55f74458"/>
     <w:p>
       <w:pPr>
         <w:pStyle w:val="Heading4"/>
@@ -21940,7 +22005,7 @@
       <w:tr>
         <w:tc>
           <w:tcPr/>
-          <w:bookmarkStart w:id="117" w:name="tbl-power-n-opt"/>
+          <w:bookmarkStart w:id="116" w:name="tbl-power-n-opt"/>
           <w:p>
             <w:pPr>
               <w:jc w:val="center"/>
@@ -22131,7 +22196,7 @@
               </w:tc>
             </w:tr>
           </w:tbl>
-          <w:bookmarkEnd w:id="117"/>
+          <w:bookmarkEnd w:id="116"/>
           <w:p/>
         </w:tc>
       </w:tr>
@@ -22152,7 +22217,7 @@
         </w:rPr>
         <w:t xml:space="preserve"> </w:t>
       </w:r>
-      <w:hyperlink r:id="rId118">
+      <w:hyperlink r:id="rId117">
         <w:r>
           <w:rPr>
             <w:rStyle w:val="Hyperlink"/>
@@ -22341,10 +22406,10 @@
         <w:t xml:space="preserve">.</w:t>
       </w:r>
     </w:p>
+    <w:bookmarkEnd w:id="118"/>
     <w:bookmarkEnd w:id="119"/>
     <w:bookmarkEnd w:id="120"/>
-    <w:bookmarkEnd w:id="121"/>
-    <w:bookmarkStart w:id="164" w:name="sec-sim-robust"/>
+    <w:bookmarkStart w:id="163" w:name="sec-sim-robust"/>
     <w:p>
       <w:pPr>
         <w:pStyle w:val="Heading2"/>
@@ -22521,7 +22586,7 @@
         <w:t xml:space="preserve">.</w:t>
       </w:r>
     </w:p>
-    <w:bookmarkStart w:id="134" w:name="sec-missing"/>
+    <w:bookmarkStart w:id="133" w:name="sec-missing"/>
     <w:p>
       <w:pPr>
         <w:pStyle w:val="Heading3"/>
@@ -22625,7 +22690,7 @@
       <w:tr>
         <w:tc>
           <w:tcPr/>
-          <w:bookmarkStart w:id="125" w:name="fig-power-curve-missing"/>
+          <w:bookmarkStart w:id="124" w:name="fig-power-curve-missing"/>
           <w:p>
             <w:pPr>
               <w:pStyle w:val="Compact"/>
@@ -22636,18 +22701,18 @@
                 <wp:inline>
                   <wp:extent cx="5334000" cy="3333749"/>
                   <wp:effectExtent b="0" l="0" r="0" t="0"/>
-                  <wp:docPr descr="" title="" id="123" name="Picture"/>
+                  <wp:docPr descr="" title="" id="122" name="Picture"/>
                   <a:graphic>
                     <a:graphicData uri="http://schemas.openxmlformats.org/drawingml/2006/picture">
                       <pic:pic>
                         <pic:nvPicPr>
-                          <pic:cNvPr descr="index_files/figure-docx/Scripts-AnalysisScripts-04_simulation_robust-fig-power-curve-missing-output-1.png" id="124" name="Picture"/>
+                          <pic:cNvPr descr="index_files/figure-docx/Scripts-AnalysisScripts-04_simulation_robust-fig-power-curve-missing-output-1.png" id="123" name="Picture"/>
                           <pic:cNvPicPr>
                             <a:picLocks noChangeArrowheads="1" noChangeAspect="1"/>
                           </pic:cNvPicPr>
                         </pic:nvPicPr>
                         <pic:blipFill>
-                          <a:blip r:embed="rId122"/>
+                          <a:blip r:embed="rId121"/>
                           <a:stretch>
                             <a:fillRect/>
                           </a:stretch>
@@ -22687,7 +22752,7 @@
               <w:t xml:space="preserve">Figure 13: Power curves for fit indices under missing data conditions.</w:t>
             </w:r>
           </w:p>
-          <w:bookmarkEnd w:id="125"/>
+          <w:bookmarkEnd w:id="124"/>
         </w:tc>
       </w:tr>
     </w:tbl>
@@ -22707,7 +22772,7 @@
         </w:rPr>
         <w:t xml:space="preserve"> </w:t>
       </w:r>
-      <w:hyperlink r:id="rId126">
+      <w:hyperlink r:id="rId125">
         <w:r>
           <w:rPr>
             <w:rStyle w:val="Hyperlink"/>
@@ -22730,7 +22795,7 @@
       <w:tr>
         <w:tc>
           <w:tcPr/>
-          <w:bookmarkStart w:id="130" w:name="fig-fit-curve-missing"/>
+          <w:bookmarkStart w:id="129" w:name="fig-fit-curve-missing"/>
           <w:p>
             <w:pPr>
               <w:pStyle w:val="Compact"/>
@@ -22741,18 +22806,18 @@
                 <wp:inline>
                   <wp:extent cx="5334000" cy="3333749"/>
                   <wp:effectExtent b="0" l="0" r="0" t="0"/>
-                  <wp:docPr descr="" title="" id="128" name="Picture"/>
+                  <wp:docPr descr="" title="" id="127" name="Picture"/>
                   <a:graphic>
                     <a:graphicData uri="http://schemas.openxmlformats.org/drawingml/2006/picture">
                       <pic:pic>
                         <pic:nvPicPr>
-                          <pic:cNvPr descr="index_files/figure-docx/Scripts-AnalysisScripts-04_simulation_robust-fig-fit-curve-missing-output-1.png" id="129" name="Picture"/>
+                          <pic:cNvPr descr="index_files/figure-docx/Scripts-AnalysisScripts-04_simulation_robust-fig-fit-curve-missing-output-1.png" id="128" name="Picture"/>
                           <pic:cNvPicPr>
                             <a:picLocks noChangeArrowheads="1" noChangeAspect="1"/>
                           </pic:cNvPicPr>
                         </pic:nvPicPr>
                         <pic:blipFill>
-                          <a:blip r:embed="rId127"/>
+                          <a:blip r:embed="rId126"/>
                           <a:stretch>
                             <a:fillRect/>
                           </a:stretch>
@@ -22792,7 +22857,7 @@
               <w:t xml:space="preserve">Figure 14: Power curves for fit indices under missing data conditions without logistic smoothing.</w:t>
             </w:r>
           </w:p>
-          <w:bookmarkEnd w:id="130"/>
+          <w:bookmarkEnd w:id="129"/>
         </w:tc>
       </w:tr>
     </w:tbl>
@@ -22812,7 +22877,7 @@
         </w:rPr>
         <w:t xml:space="preserve"> </w:t>
       </w:r>
-      <w:hyperlink r:id="rId131">
+      <w:hyperlink r:id="rId130">
         <w:r>
           <w:rPr>
             <w:rStyle w:val="Hyperlink"/>
@@ -22881,7 +22946,7 @@
       <w:tr>
         <w:tc>
           <w:tcPr/>
-          <w:bookmarkStart w:id="132" w:name="tbl-power-cutoff-missing"/>
+          <w:bookmarkStart w:id="131" w:name="tbl-power-cutoff-missing"/>
           <w:p>
             <w:pPr>
               <w:jc w:val="center"/>
@@ -23106,7 +23171,7 @@
               </w:tc>
             </w:tr>
           </w:tbl>
-          <w:bookmarkEnd w:id="132"/>
+          <w:bookmarkEnd w:id="131"/>
           <w:p/>
         </w:tc>
       </w:tr>
@@ -23127,7 +23192,7 @@
         </w:rPr>
         <w:t xml:space="preserve"> </w:t>
       </w:r>
-      <w:hyperlink r:id="rId133">
+      <w:hyperlink r:id="rId132">
         <w:r>
           <w:rPr>
             <w:rStyle w:val="Hyperlink"/>
@@ -23346,8 +23411,8 @@
         <w:t xml:space="preserve">performance.</w:t>
       </w:r>
     </w:p>
-    <w:bookmarkEnd w:id="134"/>
-    <w:bookmarkStart w:id="147" w:name="sec-nonnormal"/>
+    <w:bookmarkEnd w:id="133"/>
+    <w:bookmarkStart w:id="146" w:name="sec-nonnormal"/>
     <w:p>
       <w:pPr>
         <w:pStyle w:val="Heading3"/>
@@ -23498,7 +23563,7 @@
       <w:tr>
         <w:tc>
           <w:tcPr/>
-          <w:bookmarkStart w:id="138" w:name="fig-power-curve-nnorm"/>
+          <w:bookmarkStart w:id="137" w:name="fig-power-curve-nnorm"/>
           <w:p>
             <w:pPr>
               <w:pStyle w:val="Compact"/>
@@ -23509,18 +23574,18 @@
                 <wp:inline>
                   <wp:extent cx="5334000" cy="3333749"/>
                   <wp:effectExtent b="0" l="0" r="0" t="0"/>
-                  <wp:docPr descr="" title="" id="136" name="Picture"/>
+                  <wp:docPr descr="" title="" id="135" name="Picture"/>
                   <a:graphic>
                     <a:graphicData uri="http://schemas.openxmlformats.org/drawingml/2006/picture">
                       <pic:pic>
                         <pic:nvPicPr>
-                          <pic:cNvPr descr="index_files/figure-docx/Scripts-AnalysisScripts-04_simulation_robust-fig-power-curve-nnorm-output-1.png" id="137" name="Picture"/>
+                          <pic:cNvPr descr="index_files/figure-docx/Scripts-AnalysisScripts-04_simulation_robust-fig-power-curve-nnorm-output-1.png" id="136" name="Picture"/>
                           <pic:cNvPicPr>
                             <a:picLocks noChangeArrowheads="1" noChangeAspect="1"/>
                           </pic:cNvPicPr>
                         </pic:nvPicPr>
                         <pic:blipFill>
-                          <a:blip r:embed="rId135"/>
+                          <a:blip r:embed="rId134"/>
                           <a:stretch>
                             <a:fillRect/>
                           </a:stretch>
@@ -23560,7 +23625,7 @@
               <w:t xml:space="preserve">Figure 15: Power curves for fit indices under non-normal conditions.</w:t>
             </w:r>
           </w:p>
-          <w:bookmarkEnd w:id="138"/>
+          <w:bookmarkEnd w:id="137"/>
         </w:tc>
       </w:tr>
     </w:tbl>
@@ -23580,7 +23645,7 @@
         </w:rPr>
         <w:t xml:space="preserve"> </w:t>
       </w:r>
-      <w:hyperlink r:id="rId139">
+      <w:hyperlink r:id="rId138">
         <w:r>
           <w:rPr>
             <w:rStyle w:val="Hyperlink"/>
@@ -23674,7 +23739,7 @@
       <w:tr>
         <w:tc>
           <w:tcPr/>
-          <w:bookmarkStart w:id="143" w:name="fig-fit-curve-nnorm"/>
+          <w:bookmarkStart w:id="142" w:name="fig-fit-curve-nnorm"/>
           <w:p>
             <w:pPr>
               <w:pStyle w:val="Compact"/>
@@ -23685,18 +23750,18 @@
                 <wp:inline>
                   <wp:extent cx="5334000" cy="3333749"/>
                   <wp:effectExtent b="0" l="0" r="0" t="0"/>
-                  <wp:docPr descr="" title="" id="141" name="Picture"/>
+                  <wp:docPr descr="" title="" id="140" name="Picture"/>
                   <a:graphic>
                     <a:graphicData uri="http://schemas.openxmlformats.org/drawingml/2006/picture">
                       <pic:pic>
                         <pic:nvPicPr>
-                          <pic:cNvPr descr="index_files/figure-docx/Scripts-AnalysisScripts-04_simulation_robust-fig-fit-curve-nnorm-output-1.png" id="142" name="Picture"/>
+                          <pic:cNvPr descr="index_files/figure-docx/Scripts-AnalysisScripts-04_simulation_robust-fig-fit-curve-nnorm-output-1.png" id="141" name="Picture"/>
                           <pic:cNvPicPr>
                             <a:picLocks noChangeArrowheads="1" noChangeAspect="1"/>
                           </pic:cNvPicPr>
                         </pic:nvPicPr>
                         <pic:blipFill>
-                          <a:blip r:embed="rId140"/>
+                          <a:blip r:embed="rId139"/>
                           <a:stretch>
                             <a:fillRect/>
                           </a:stretch>
@@ -23736,7 +23801,7 @@
               <w:t xml:space="preserve">Figure 16: Power curves for fit indices under non-normal conditions without logistic smoothing.</w:t>
             </w:r>
           </w:p>
-          <w:bookmarkEnd w:id="143"/>
+          <w:bookmarkEnd w:id="142"/>
         </w:tc>
       </w:tr>
     </w:tbl>
@@ -23756,7 +23821,7 @@
         </w:rPr>
         <w:t xml:space="preserve"> </w:t>
       </w:r>
-      <w:hyperlink r:id="rId144">
+      <w:hyperlink r:id="rId143">
         <w:r>
           <w:rPr>
             <w:rStyle w:val="Hyperlink"/>
@@ -23830,7 +23895,7 @@
       <w:tr>
         <w:tc>
           <w:tcPr/>
-          <w:bookmarkStart w:id="145" w:name="tbl-power-cutoff-nnorm"/>
+          <w:bookmarkStart w:id="144" w:name="tbl-power-cutoff-nnorm"/>
           <w:p>
             <w:pPr>
               <w:jc w:val="center"/>
@@ -24055,7 +24120,7 @@
               </w:tc>
             </w:tr>
           </w:tbl>
-          <w:bookmarkEnd w:id="145"/>
+          <w:bookmarkEnd w:id="144"/>
           <w:p/>
         </w:tc>
       </w:tr>
@@ -24076,7 +24141,7 @@
         </w:rPr>
         <w:t xml:space="preserve"> </w:t>
       </w:r>
-      <w:hyperlink r:id="rId146">
+      <w:hyperlink r:id="rId145">
         <w:r>
           <w:rPr>
             <w:rStyle w:val="Hyperlink"/>
@@ -24238,8 +24303,8 @@
         <w:t xml:space="preserve">discrimination patterns in the figures.</w:t>
       </w:r>
     </w:p>
-    <w:bookmarkEnd w:id="147"/>
-    <w:bookmarkStart w:id="163" w:name="sec-scenarios-fixed"/>
+    <w:bookmarkEnd w:id="146"/>
+    <w:bookmarkStart w:id="162" w:name="sec-scenarios-fixed"/>
     <w:p>
       <w:pPr>
         <w:pStyle w:val="Heading3"/>
@@ -24518,7 +24583,7 @@
       <w:tr>
         <w:tc>
           <w:tcPr/>
-          <w:bookmarkStart w:id="151" w:name="fig-power-curve-fixed"/>
+          <w:bookmarkStart w:id="150" w:name="fig-power-curve-fixed"/>
           <w:p>
             <w:pPr>
               <w:pStyle w:val="Compact"/>
@@ -24529,18 +24594,18 @@
                 <wp:inline>
                   <wp:extent cx="5334000" cy="3333749"/>
                   <wp:effectExtent b="0" l="0" r="0" t="0"/>
-                  <wp:docPr descr="" title="" id="149" name="Picture"/>
+                  <wp:docPr descr="" title="" id="148" name="Picture"/>
                   <a:graphic>
                     <a:graphicData uri="http://schemas.openxmlformats.org/drawingml/2006/picture">
                       <pic:pic>
                         <pic:nvPicPr>
-                          <pic:cNvPr descr="index_files/figure-docx/Scripts-AnalysisScripts-05_model_comparison-fig-power-curve-fixed-output-1.png" id="150" name="Picture"/>
+                          <pic:cNvPr descr="index_files/figure-docx/Scripts-AnalysisScripts-05_model_comparison-fig-power-curve-fixed-output-1.png" id="149" name="Picture"/>
                           <pic:cNvPicPr>
                             <a:picLocks noChangeArrowheads="1" noChangeAspect="1"/>
                           </pic:cNvPicPr>
                         </pic:nvPicPr>
                         <pic:blipFill>
-                          <a:blip r:embed="rId148"/>
+                          <a:blip r:embed="rId147"/>
                           <a:stretch>
                             <a:fillRect/>
                           </a:stretch>
@@ -24580,7 +24645,7 @@
               <w:t xml:space="preserve">Figure 17: Power curves for fit indices with fixed sample size.</w:t>
             </w:r>
           </w:p>
-          <w:bookmarkEnd w:id="151"/>
+          <w:bookmarkEnd w:id="150"/>
         </w:tc>
       </w:tr>
     </w:tbl>
@@ -24600,7 +24665,7 @@
         </w:rPr>
         <w:t xml:space="preserve"> </w:t>
       </w:r>
-      <w:hyperlink r:id="rId152">
+      <w:hyperlink r:id="rId151">
         <w:r>
           <w:rPr>
             <w:rStyle w:val="Hyperlink"/>
@@ -24748,7 +24813,7 @@
       <w:tr>
         <w:tc>
           <w:tcPr/>
-          <w:bookmarkStart w:id="153" w:name="tbl-power-cutoff-fixed"/>
+          <w:bookmarkStart w:id="152" w:name="tbl-power-cutoff-fixed"/>
           <w:p>
             <w:pPr>
               <w:jc w:val="center"/>
@@ -24973,7 +25038,7 @@
               </w:tc>
             </w:tr>
           </w:tbl>
-          <w:bookmarkEnd w:id="153"/>
+          <w:bookmarkEnd w:id="152"/>
           <w:p/>
         </w:tc>
       </w:tr>
@@ -24994,7 +25059,7 @@
         </w:rPr>
         <w:t xml:space="preserve"> </w:t>
       </w:r>
-      <w:hyperlink r:id="rId154">
+      <w:hyperlink r:id="rId153">
         <w:r>
           <w:rPr>
             <w:rStyle w:val="Hyperlink"/>
@@ -25004,7 +25069,7 @@
         </w:r>
       </w:hyperlink>
     </w:p>
-    <w:bookmarkStart w:id="162" w:name="power-analysis-with-traditional-cutoffs"/>
+    <w:bookmarkStart w:id="161" w:name="power-analysis-with-traditional-cutoffs"/>
     <w:p>
       <w:pPr>
         <w:pStyle w:val="Heading4"/>
@@ -25128,7 +25193,7 @@
       <w:tr>
         <w:tc>
           <w:tcPr/>
-          <w:bookmarkStart w:id="158" w:name="fig-curve-fixed-traditional"/>
+          <w:bookmarkStart w:id="157" w:name="fig-curve-fixed-traditional"/>
           <w:p>
             <w:pPr>
               <w:pStyle w:val="Compact"/>
@@ -25139,18 +25204,18 @@
                 <wp:inline>
                   <wp:extent cx="5334000" cy="3333749"/>
                   <wp:effectExtent b="0" l="0" r="0" t="0"/>
-                  <wp:docPr descr="" title="" id="156" name="Picture"/>
+                  <wp:docPr descr="" title="" id="155" name="Picture"/>
                   <a:graphic>
                     <a:graphicData uri="http://schemas.openxmlformats.org/drawingml/2006/picture">
                       <pic:pic>
                         <pic:nvPicPr>
-                          <pic:cNvPr descr="index_files/figure-docx/Scripts-AnalysisScripts-05_model_comparison-fig-curve-fixed-traditional-output-1.png" id="157" name="Picture"/>
+                          <pic:cNvPr descr="index_files/figure-docx/Scripts-AnalysisScripts-05_model_comparison-fig-curve-fixed-traditional-output-1.png" id="156" name="Picture"/>
                           <pic:cNvPicPr>
                             <a:picLocks noChangeArrowheads="1" noChangeAspect="1"/>
                           </pic:cNvPicPr>
                         </pic:nvPicPr>
                         <pic:blipFill>
-                          <a:blip r:embed="rId155"/>
+                          <a:blip r:embed="rId154"/>
                           <a:stretch>
                             <a:fillRect/>
                           </a:stretch>
@@ -25190,7 +25255,7 @@
               <w:t xml:space="preserve">Figure 18: Power curves using traditional fit index cutoffs with fixed sample size.</w:t>
             </w:r>
           </w:p>
-          <w:bookmarkEnd w:id="158"/>
+          <w:bookmarkEnd w:id="157"/>
         </w:tc>
       </w:tr>
     </w:tbl>
@@ -25210,7 +25275,7 @@
         </w:rPr>
         <w:t xml:space="preserve"> </w:t>
       </w:r>
-      <w:hyperlink r:id="rId159">
+      <w:hyperlink r:id="rId158">
         <w:r>
           <w:rPr>
             <w:rStyle w:val="Hyperlink"/>
@@ -25233,7 +25298,7 @@
       <w:tr>
         <w:tc>
           <w:tcPr/>
-          <w:bookmarkStart w:id="160" w:name="tbl-power-cutoff-traditional-fixed"/>
+          <w:bookmarkStart w:id="159" w:name="tbl-power-cutoff-traditional-fixed"/>
           <w:p>
             <w:pPr>
               <w:jc w:val="center"/>
@@ -25392,7 +25457,7 @@
               </w:tc>
             </w:tr>
           </w:tbl>
-          <w:bookmarkEnd w:id="160"/>
+          <w:bookmarkEnd w:id="159"/>
           <w:p/>
         </w:tc>
       </w:tr>
@@ -25413,7 +25478,7 @@
         </w:rPr>
         <w:t xml:space="preserve"> </w:t>
       </w:r>
-      <w:hyperlink r:id="rId161">
+      <w:hyperlink r:id="rId160">
         <w:r>
           <w:rPr>
             <w:rStyle w:val="Hyperlink"/>
@@ -25498,10 +25563,10 @@
         <w:t xml:space="preserve">.</w:t>
       </w:r>
     </w:p>
+    <w:bookmarkEnd w:id="161"/>
     <w:bookmarkEnd w:id="162"/>
     <w:bookmarkEnd w:id="163"/>
-    <w:bookmarkEnd w:id="164"/>
-    <w:bookmarkStart w:id="190" w:name="sec-post-hoc"/>
+    <w:bookmarkStart w:id="189" w:name="sec-post-hoc"/>
     <w:p>
       <w:pPr>
         <w:pStyle w:val="Heading2"/>
@@ -25612,7 +25677,7 @@
         <w:t xml:space="preserve">would have rejected meaningful misspecification.</w:t>
       </w:r>
     </w:p>
-    <w:bookmarkStart w:id="172" w:name="with-simulation"/>
+    <w:bookmarkStart w:id="171" w:name="with-simulation"/>
     <w:p>
       <w:pPr>
         <w:pStyle w:val="Heading3"/>
@@ -25707,7 +25772,7 @@
       <w:tr>
         <w:tc>
           <w:tcPr/>
-          <w:bookmarkStart w:id="168" w:name="fig-posthoc-plotpower"/>
+          <w:bookmarkStart w:id="167" w:name="fig-posthoc-plotpower"/>
           <w:p>
             <w:pPr>
               <w:pStyle w:val="Compact"/>
@@ -25718,18 +25783,18 @@
                 <wp:inline>
                   <wp:extent cx="5334000" cy="3333749"/>
                   <wp:effectExtent b="0" l="0" r="0" t="0"/>
-                  <wp:docPr descr="" title="" id="166" name="Picture"/>
+                  <wp:docPr descr="" title="" id="165" name="Picture"/>
                   <a:graphic>
                     <a:graphicData uri="http://schemas.openxmlformats.org/drawingml/2006/picture">
                       <pic:pic>
                         <pic:nvPicPr>
-                          <pic:cNvPr descr="index_files/figure-docx/Scripts-AnalysisScripts-06_posthoc-fig-posthoc-plotpower-output-1.png" id="167" name="Picture"/>
+                          <pic:cNvPr descr="index_files/figure-docx/Scripts-AnalysisScripts-06_posthoc-fig-posthoc-plotpower-output-1.png" id="166" name="Picture"/>
                           <pic:cNvPicPr>
                             <a:picLocks noChangeArrowheads="1" noChangeAspect="1"/>
                           </pic:cNvPicPr>
                         </pic:nvPicPr>
                         <pic:blipFill>
-                          <a:blip r:embed="rId165"/>
+                          <a:blip r:embed="rId164"/>
                           <a:stretch>
                             <a:fillRect/>
                           </a:stretch>
@@ -25769,7 +25834,7 @@
               <w:t xml:space="preserve">Figure 19: Power curve for post hoc analysis based on simulation.</w:t>
             </w:r>
           </w:p>
-          <w:bookmarkEnd w:id="168"/>
+          <w:bookmarkEnd w:id="167"/>
         </w:tc>
       </w:tr>
     </w:tbl>
@@ -25789,7 +25854,7 @@
         </w:rPr>
         <w:t xml:space="preserve"> </w:t>
       </w:r>
-      <w:hyperlink r:id="rId169">
+      <w:hyperlink r:id="rId168">
         <w:r>
           <w:rPr>
             <w:rStyle w:val="Hyperlink"/>
@@ -25812,7 +25877,7 @@
       <w:tr>
         <w:tc>
           <w:tcPr/>
-          <w:bookmarkStart w:id="170" w:name="tbl-posthoc-power"/>
+          <w:bookmarkStart w:id="169" w:name="tbl-posthoc-power"/>
           <w:p>
             <w:pPr>
               <w:jc w:val="center"/>
@@ -25950,7 +26015,7 @@
               </w:tc>
             </w:tr>
           </w:tbl>
-          <w:bookmarkEnd w:id="170"/>
+          <w:bookmarkEnd w:id="169"/>
           <w:p/>
         </w:tc>
       </w:tr>
@@ -25971,7 +26036,7 @@
         </w:rPr>
         <w:t xml:space="preserve"> </w:t>
       </w:r>
-      <w:hyperlink r:id="rId171">
+      <w:hyperlink r:id="rId170">
         <w:r>
           <w:rPr>
             <w:rStyle w:val="Hyperlink"/>
@@ -26180,8 +26245,8 @@
         <w:t xml:space="preserve">model fit is poor.</w:t>
       </w:r>
     </w:p>
-    <w:bookmarkEnd w:id="172"/>
-    <w:bookmarkStart w:id="189" w:name="with-analytical-solutions"/>
+    <w:bookmarkEnd w:id="171"/>
+    <w:bookmarkStart w:id="188" w:name="with-analytical-solutions"/>
     <w:p>
       <w:pPr>
         <w:pStyle w:val="Heading3"/>
@@ -26266,7 +26331,7 @@
         <w:t xml:space="preserve">substantively specific formulation.</w:t>
       </w:r>
     </w:p>
-    <w:bookmarkStart w:id="180" w:name="model-free-specification"/>
+    <w:bookmarkStart w:id="179" w:name="model-free-specification"/>
     <w:p>
       <w:pPr>
         <w:pStyle w:val="Heading4"/>
@@ -26370,7 +26435,7 @@
       <w:tr>
         <w:tc>
           <w:tcPr/>
-          <w:bookmarkStart w:id="173" w:name="tbl-posthoc-rmsea"/>
+          <w:bookmarkStart w:id="172" w:name="tbl-posthoc-rmsea"/>
           <w:p>
             <w:pPr>
               <w:jc w:val="center"/>
@@ -27017,7 +27082,7 @@
               </w:tc>
             </w:tr>
           </w:tbl>
-          <w:bookmarkEnd w:id="173"/>
+          <w:bookmarkEnd w:id="172"/>
           <w:p/>
         </w:tc>
       </w:tr>
@@ -27038,7 +27103,7 @@
         </w:rPr>
         <w:t xml:space="preserve"> </w:t>
       </w:r>
-      <w:hyperlink r:id="rId174">
+      <w:hyperlink r:id="rId173">
         <w:r>
           <w:rPr>
             <w:rStyle w:val="Hyperlink"/>
@@ -27298,7 +27363,7 @@
       <w:tr>
         <w:tc>
           <w:tcPr/>
-          <w:bookmarkStart w:id="178" w:name="fig-posthoc-rmsea"/>
+          <w:bookmarkStart w:id="177" w:name="fig-posthoc-rmsea"/>
           <w:p>
             <w:pPr>
               <w:pStyle w:val="Compact"/>
@@ -27309,18 +27374,18 @@
                 <wp:inline>
                   <wp:extent cx="5334000" cy="3333749"/>
                   <wp:effectExtent b="0" l="0" r="0" t="0"/>
-                  <wp:docPr descr="" title="" id="176" name="Picture"/>
+                  <wp:docPr descr="" title="" id="175" name="Picture"/>
                   <a:graphic>
                     <a:graphicData uri="http://schemas.openxmlformats.org/drawingml/2006/picture">
                       <pic:pic>
                         <pic:nvPicPr>
-                          <pic:cNvPr descr="index_files/figure-docx/Scripts-AnalysisScripts-06_posthoc-fig-posthoc-rmsea-output-1.png" id="177" name="Picture"/>
+                          <pic:cNvPr descr="index_files/figure-docx/Scripts-AnalysisScripts-06_posthoc-fig-posthoc-rmsea-output-1.png" id="176" name="Picture"/>
                           <pic:cNvPicPr>
                             <a:picLocks noChangeArrowheads="1" noChangeAspect="1"/>
                           </pic:cNvPicPr>
                         </pic:nvPicPr>
                         <pic:blipFill>
-                          <a:blip r:embed="rId175"/>
+                          <a:blip r:embed="rId174"/>
                           <a:stretch>
                             <a:fillRect/>
                           </a:stretch>
@@ -27360,7 +27425,7 @@
               <w:t xml:space="preserve">Figure 20: Post hoc power analysis for RMSEA = 0.05.</w:t>
             </w:r>
           </w:p>
-          <w:bookmarkEnd w:id="178"/>
+          <w:bookmarkEnd w:id="177"/>
         </w:tc>
       </w:tr>
     </w:tbl>
@@ -27380,7 +27445,7 @@
         </w:rPr>
         <w:t xml:space="preserve"> </w:t>
       </w:r>
-      <w:hyperlink r:id="rId179">
+      <w:hyperlink r:id="rId178">
         <w:r>
           <w:rPr>
             <w:rStyle w:val="Hyperlink"/>
@@ -27390,8 +27455,8 @@
         </w:r>
       </w:hyperlink>
     </w:p>
-    <w:bookmarkEnd w:id="180"/>
-    <w:bookmarkStart w:id="188" w:name="model-based-specification-global-fit"/>
+    <w:bookmarkEnd w:id="179"/>
+    <w:bookmarkStart w:id="187" w:name="model-based-specification-global-fit"/>
     <w:p>
       <w:pPr>
         <w:pStyle w:val="Heading4"/>
@@ -27469,7 +27534,7 @@
       <w:tr>
         <w:tc>
           <w:tcPr/>
-          <w:bookmarkStart w:id="181" w:name="tbl-posthoc-realmodel"/>
+          <w:bookmarkStart w:id="180" w:name="tbl-posthoc-realmodel"/>
           <w:p>
             <w:pPr>
               <w:jc w:val="center"/>
@@ -28210,7 +28275,7 @@
               </w:tc>
             </w:tr>
           </w:tbl>
-          <w:bookmarkEnd w:id="181"/>
+          <w:bookmarkEnd w:id="180"/>
           <w:p/>
         </w:tc>
       </w:tr>
@@ -28231,7 +28296,7 @@
         </w:rPr>
         <w:t xml:space="preserve"> </w:t>
       </w:r>
-      <w:hyperlink r:id="rId182">
+      <w:hyperlink r:id="rId181">
         <w:r>
           <w:rPr>
             <w:rStyle w:val="Hyperlink"/>
@@ -28433,7 +28498,7 @@
       <w:tr>
         <w:tc>
           <w:tcPr/>
-          <w:bookmarkStart w:id="186" w:name="fig-posthoc-realmodel"/>
+          <w:bookmarkStart w:id="185" w:name="fig-posthoc-realmodel"/>
           <w:p>
             <w:pPr>
               <w:pStyle w:val="Compact"/>
@@ -28444,18 +28509,18 @@
                 <wp:inline>
                   <wp:extent cx="5334000" cy="3333749"/>
                   <wp:effectExtent b="0" l="0" r="0" t="0"/>
-                  <wp:docPr descr="" title="" id="184" name="Picture"/>
+                  <wp:docPr descr="" title="" id="183" name="Picture"/>
                   <a:graphic>
                     <a:graphicData uri="http://schemas.openxmlformats.org/drawingml/2006/picture">
                       <pic:pic>
                         <pic:nvPicPr>
-                          <pic:cNvPr descr="index_files/figure-docx/Scripts-AnalysisScripts-06_posthoc-fig-posthoc-realmodel-output-1.png" id="185" name="Picture"/>
+                          <pic:cNvPr descr="index_files/figure-docx/Scripts-AnalysisScripts-06_posthoc-fig-posthoc-realmodel-output-1.png" id="184" name="Picture"/>
                           <pic:cNvPicPr>
                             <a:picLocks noChangeArrowheads="1" noChangeAspect="1"/>
                           </pic:cNvPicPr>
                         </pic:nvPicPr>
                         <pic:blipFill>
-                          <a:blip r:embed="rId183"/>
+                          <a:blip r:embed="rId182"/>
                           <a:stretch>
                             <a:fillRect/>
                           </a:stretch>
@@ -28495,7 +28560,7 @@
               <w:t xml:space="preserve">Figure 21: Post hoc power analysis for the real model.</w:t>
             </w:r>
           </w:p>
-          <w:bookmarkEnd w:id="186"/>
+          <w:bookmarkEnd w:id="185"/>
         </w:tc>
       </w:tr>
     </w:tbl>
@@ -28515,7 +28580,7 @@
         </w:rPr>
         <w:t xml:space="preserve"> </w:t>
       </w:r>
-      <w:hyperlink r:id="rId187">
+      <w:hyperlink r:id="rId186">
         <w:r>
           <w:rPr>
             <w:rStyle w:val="Hyperlink"/>
@@ -28629,10 +28694,10 @@
         <w:t xml:space="preserve">.</w:t>
       </w:r>
     </w:p>
+    <w:bookmarkEnd w:id="187"/>
     <w:bookmarkEnd w:id="188"/>
     <w:bookmarkEnd w:id="189"/>
-    <w:bookmarkEnd w:id="190"/>
-    <w:bookmarkStart w:id="232" w:name="references"/>
+    <w:bookmarkStart w:id="231" w:name="references"/>
     <w:p>
       <w:pPr>
         <w:pStyle w:val="Heading2"/>
@@ -28641,8 +28706,8 @@
         <w:t xml:space="preserve">References</w:t>
       </w:r>
     </w:p>
-    <w:bookmarkStart w:id="231" w:name="refs"/>
-    <w:bookmarkStart w:id="192" w:name="ref-aguirre-urreta2024"/>
+    <w:bookmarkStart w:id="230" w:name="refs"/>
+    <w:bookmarkStart w:id="191" w:name="ref-aguirre-urreta2024"/>
     <w:p>
       <w:pPr>
         <w:pStyle w:val="Bibliography"/>
@@ -28718,7 +28783,7 @@
       <w:r>
         <w:t xml:space="preserve"> </w:t>
       </w:r>
-      <w:hyperlink r:id="rId191">
+      <w:hyperlink r:id="rId190">
         <w:r>
           <w:rPr>
             <w:rStyle w:val="Hyperlink"/>
@@ -28727,8 +28792,8 @@
         </w:r>
       </w:hyperlink>
     </w:p>
-    <w:bookmarkEnd w:id="192"/>
-    <w:bookmarkStart w:id="194" w:name="ref-buchberger2024"/>
+    <w:bookmarkEnd w:id="191"/>
+    <w:bookmarkStart w:id="193" w:name="ref-buchberger2024"/>
     <w:p>
       <w:pPr>
         <w:pStyle w:val="Bibliography"/>
@@ -28786,7 +28851,7 @@
       <w:r>
         <w:t xml:space="preserve"> </w:t>
       </w:r>
-      <w:hyperlink r:id="rId193">
+      <w:hyperlink r:id="rId192">
         <w:r>
           <w:rPr>
             <w:rStyle w:val="Hyperlink"/>
@@ -28795,8 +28860,8 @@
         </w:r>
       </w:hyperlink>
     </w:p>
-    <w:bookmarkEnd w:id="194"/>
-    <w:bookmarkStart w:id="195" w:name="ref-feng2023"/>
+    <w:bookmarkEnd w:id="193"/>
+    <w:bookmarkStart w:id="194" w:name="ref-feng2023"/>
     <w:p>
       <w:pPr>
         <w:pStyle w:val="Bibliography"/>
@@ -28853,8 +28918,8 @@
         <w:t xml:space="preserve">. The Guilford Press.</w:t>
       </w:r>
     </w:p>
-    <w:bookmarkEnd w:id="195"/>
-    <w:bookmarkStart w:id="197" w:name="ref-irmer2024"/>
+    <w:bookmarkEnd w:id="194"/>
+    <w:bookmarkStart w:id="196" w:name="ref-irmer2024"/>
     <w:p>
       <w:pPr>
         <w:pStyle w:val="Bibliography"/>
@@ -28891,7 +28956,7 @@
       <w:r>
         <w:t xml:space="preserve"> </w:t>
       </w:r>
-      <w:hyperlink r:id="rId196">
+      <w:hyperlink r:id="rId195">
         <w:r>
           <w:rPr>
             <w:rStyle w:val="Hyperlink"/>
@@ -28900,8 +28965,8 @@
         </w:r>
       </w:hyperlink>
     </w:p>
-    <w:bookmarkEnd w:id="197"/>
-    <w:bookmarkStart w:id="199" w:name="ref-jak2021"/>
+    <w:bookmarkEnd w:id="196"/>
+    <w:bookmarkStart w:id="198" w:name="ref-jak2021"/>
     <w:p>
       <w:pPr>
         <w:pStyle w:val="Bibliography"/>
@@ -28962,7 +29027,7 @@
       <w:r>
         <w:t xml:space="preserve"> </w:t>
       </w:r>
-      <w:hyperlink r:id="rId198">
+      <w:hyperlink r:id="rId197">
         <w:r>
           <w:rPr>
             <w:rStyle w:val="Hyperlink"/>
@@ -28971,8 +29036,8 @@
         </w:r>
       </w:hyperlink>
     </w:p>
-    <w:bookmarkEnd w:id="199"/>
-    <w:bookmarkStart w:id="201" w:name="ref-jobst2023"/>
+    <w:bookmarkEnd w:id="198"/>
+    <w:bookmarkStart w:id="200" w:name="ref-jobst2023"/>
     <w:p>
       <w:pPr>
         <w:pStyle w:val="Bibliography"/>
@@ -29009,7 +29074,7 @@
       <w:r>
         <w:t xml:space="preserve"> </w:t>
       </w:r>
-      <w:hyperlink r:id="rId200">
+      <w:hyperlink r:id="rId199">
         <w:r>
           <w:rPr>
             <w:rStyle w:val="Hyperlink"/>
@@ -29018,8 +29083,8 @@
         </w:r>
       </w:hyperlink>
     </w:p>
-    <w:bookmarkEnd w:id="201"/>
-    <w:bookmarkStart w:id="203" w:name="ref-kyriazos2018"/>
+    <w:bookmarkEnd w:id="200"/>
+    <w:bookmarkStart w:id="202" w:name="ref-kyriazos2018"/>
     <w:p>
       <w:pPr>
         <w:pStyle w:val="Bibliography"/>
@@ -29137,7 +29202,7 @@
       <w:r>
         <w:t xml:space="preserve"> </w:t>
       </w:r>
-      <w:hyperlink r:id="rId202">
+      <w:hyperlink r:id="rId201">
         <w:r>
           <w:rPr>
             <w:rStyle w:val="Hyperlink"/>
@@ -29146,8 +29211,8 @@
         </w:r>
       </w:hyperlink>
     </w:p>
-    <w:bookmarkEnd w:id="203"/>
-    <w:bookmarkStart w:id="205" w:name="ref-liang2024"/>
+    <w:bookmarkEnd w:id="202"/>
+    <w:bookmarkStart w:id="204" w:name="ref-liang2024"/>
     <w:p>
       <w:pPr>
         <w:pStyle w:val="Bibliography"/>
@@ -29195,7 +29260,7 @@
       <w:r>
         <w:t xml:space="preserve"> </w:t>
       </w:r>
-      <w:hyperlink r:id="rId204">
+      <w:hyperlink r:id="rId203">
         <w:r>
           <w:rPr>
             <w:rStyle w:val="Hyperlink"/>
@@ -29204,8 +29269,8 @@
         </w:r>
       </w:hyperlink>
     </w:p>
-    <w:bookmarkEnd w:id="205"/>
-    <w:bookmarkStart w:id="207" w:name="ref-lin2022"/>
+    <w:bookmarkEnd w:id="204"/>
+    <w:bookmarkStart w:id="206" w:name="ref-lin2022"/>
     <w:p>
       <w:pPr>
         <w:pStyle w:val="Bibliography"/>
@@ -29254,7 +29319,7 @@
       <w:r>
         <w:t xml:space="preserve"> </w:t>
       </w:r>
-      <w:hyperlink r:id="rId206">
+      <w:hyperlink r:id="rId205">
         <w:r>
           <w:rPr>
             <w:rStyle w:val="Hyperlink"/>
@@ -29263,8 +29328,8 @@
         </w:r>
       </w:hyperlink>
     </w:p>
-    <w:bookmarkEnd w:id="207"/>
-    <w:bookmarkStart w:id="209" w:name="ref-maccallum1996"/>
+    <w:bookmarkEnd w:id="206"/>
+    <w:bookmarkStart w:id="208" w:name="ref-maccallum1996"/>
     <w:p>
       <w:pPr>
         <w:pStyle w:val="Bibliography"/>
@@ -29301,7 +29366,7 @@
       <w:r>
         <w:t xml:space="preserve"> </w:t>
       </w:r>
-      <w:hyperlink r:id="rId208">
+      <w:hyperlink r:id="rId207">
         <w:r>
           <w:rPr>
             <w:rStyle w:val="Hyperlink"/>
@@ -29310,8 +29375,8 @@
         </w:r>
       </w:hyperlink>
     </w:p>
-    <w:bookmarkEnd w:id="209"/>
-    <w:bookmarkStart w:id="211" w:name="ref-mcneish2021"/>
+    <w:bookmarkEnd w:id="208"/>
+    <w:bookmarkStart w:id="210" w:name="ref-mcneish2021"/>
     <w:p>
       <w:pPr>
         <w:pStyle w:val="Bibliography"/>
@@ -29348,7 +29413,7 @@
       <w:r>
         <w:t xml:space="preserve"> </w:t>
       </w:r>
-      <w:hyperlink r:id="rId210">
+      <w:hyperlink r:id="rId209">
         <w:r>
           <w:rPr>
             <w:rStyle w:val="Hyperlink"/>
@@ -29357,8 +29422,8 @@
         </w:r>
       </w:hyperlink>
     </w:p>
-    <w:bookmarkEnd w:id="211"/>
-    <w:bookmarkStart w:id="213" w:name="ref-moshagen2024"/>
+    <w:bookmarkEnd w:id="210"/>
+    <w:bookmarkStart w:id="212" w:name="ref-moshagen2024"/>
     <w:p>
       <w:pPr>
         <w:pStyle w:val="Bibliography"/>
@@ -29416,7 +29481,7 @@
       <w:r>
         <w:t xml:space="preserve"> </w:t>
       </w:r>
-      <w:hyperlink r:id="rId212">
+      <w:hyperlink r:id="rId211">
         <w:r>
           <w:rPr>
             <w:rStyle w:val="Hyperlink"/>
@@ -29425,8 +29490,8 @@
         </w:r>
       </w:hyperlink>
     </w:p>
-    <w:bookmarkEnd w:id="213"/>
-    <w:bookmarkStart w:id="215" w:name="ref-mosqueirataipe2026"/>
+    <w:bookmarkEnd w:id="212"/>
+    <w:bookmarkStart w:id="214" w:name="ref-mosqueirataipe2026"/>
     <w:p>
       <w:pPr>
         <w:pStyle w:val="Bibliography"/>
@@ -29478,7 +29543,7 @@
       <w:r>
         <w:t xml:space="preserve"> </w:t>
       </w:r>
-      <w:hyperlink r:id="rId214">
+      <w:hyperlink r:id="rId213">
         <w:r>
           <w:rPr>
             <w:rStyle w:val="Hyperlink"/>
@@ -29487,8 +29552,8 @@
         </w:r>
       </w:hyperlink>
     </w:p>
-    <w:bookmarkEnd w:id="215"/>
-    <w:bookmarkStart w:id="217" w:name="ref-muthen2002a"/>
+    <w:bookmarkEnd w:id="214"/>
+    <w:bookmarkStart w:id="216" w:name="ref-muthen2002a"/>
     <w:p>
       <w:pPr>
         <w:pStyle w:val="Bibliography"/>
@@ -29582,7 +29647,7 @@
       <w:r>
         <w:t xml:space="preserve"> </w:t>
       </w:r>
-      <w:hyperlink r:id="rId216">
+      <w:hyperlink r:id="rId215">
         <w:r>
           <w:rPr>
             <w:rStyle w:val="Hyperlink"/>
@@ -29591,8 +29656,8 @@
         </w:r>
       </w:hyperlink>
     </w:p>
-    <w:bookmarkEnd w:id="217"/>
-    <w:bookmarkStart w:id="219" w:name="ref-simsem2021"/>
+    <w:bookmarkEnd w:id="216"/>
+    <w:bookmarkStart w:id="218" w:name="ref-simsem2021"/>
     <w:p>
       <w:pPr>
         <w:pStyle w:val="Bibliography"/>
@@ -29630,7 +29695,7 @@
       <w:r>
         <w:t xml:space="preserve"> </w:t>
       </w:r>
-      <w:hyperlink r:id="rId218">
+      <w:hyperlink r:id="rId217">
         <w:r>
           <w:rPr>
             <w:rStyle w:val="Hyperlink"/>
@@ -29639,8 +29704,8 @@
         </w:r>
       </w:hyperlink>
     </w:p>
-    <w:bookmarkEnd w:id="219"/>
-    <w:bookmarkStart w:id="221" w:name="ref-rogers2022"/>
+    <w:bookmarkEnd w:id="218"/>
+    <w:bookmarkStart w:id="220" w:name="ref-rogers2022"/>
     <w:p>
       <w:pPr>
         <w:pStyle w:val="Bibliography"/>
@@ -29707,7 +29772,7 @@
       <w:r>
         <w:t xml:space="preserve"> </w:t>
       </w:r>
-      <w:hyperlink r:id="rId220">
+      <w:hyperlink r:id="rId219">
         <w:r>
           <w:rPr>
             <w:rStyle w:val="Hyperlink"/>
@@ -29716,8 +29781,8 @@
         </w:r>
       </w:hyperlink>
     </w:p>
-    <w:bookmarkEnd w:id="221"/>
-    <w:bookmarkStart w:id="223" w:name="ref-schoemann2014"/>
+    <w:bookmarkEnd w:id="220"/>
+    <w:bookmarkStart w:id="222" w:name="ref-schoemann2014"/>
     <w:p>
       <w:pPr>
         <w:pStyle w:val="Bibliography"/>
@@ -29766,7 +29831,7 @@
       <w:r>
         <w:t xml:space="preserve"> </w:t>
       </w:r>
-      <w:hyperlink r:id="rId222">
+      <w:hyperlink r:id="rId221">
         <w:r>
           <w:rPr>
             <w:rStyle w:val="Hyperlink"/>
@@ -29775,8 +29840,8 @@
         </w:r>
       </w:hyperlink>
     </w:p>
-    <w:bookmarkEnd w:id="223"/>
-    <w:bookmarkStart w:id="225" w:name="ref-wang2023"/>
+    <w:bookmarkEnd w:id="222"/>
+    <w:bookmarkStart w:id="224" w:name="ref-wang2023"/>
     <w:p>
       <w:pPr>
         <w:pStyle w:val="Bibliography"/>
@@ -29866,7 +29931,7 @@
       <w:r>
         <w:t xml:space="preserve"> </w:t>
       </w:r>
-      <w:hyperlink r:id="rId224">
+      <w:hyperlink r:id="rId223">
         <w:r>
           <w:rPr>
             <w:rStyle w:val="Hyperlink"/>
@@ -29875,8 +29940,8 @@
         </w:r>
       </w:hyperlink>
     </w:p>
-    <w:bookmarkEnd w:id="225"/>
-    <w:bookmarkStart w:id="227" w:name="ref-wang2021"/>
+    <w:bookmarkEnd w:id="224"/>
+    <w:bookmarkStart w:id="226" w:name="ref-wang2021"/>
     <w:p>
       <w:pPr>
         <w:pStyle w:val="Bibliography"/>
@@ -29967,7 +30032,7 @@
       <w:r>
         <w:t xml:space="preserve"> </w:t>
       </w:r>
-      <w:hyperlink r:id="rId226">
+      <w:hyperlink r:id="rId225">
         <w:r>
           <w:rPr>
             <w:rStyle w:val="Hyperlink"/>
@@ -29976,8 +30041,8 @@
         </w:r>
       </w:hyperlink>
     </w:p>
-    <w:bookmarkEnd w:id="227"/>
-    <w:bookmarkStart w:id="229" w:name="ref-wolf2013"/>
+    <w:bookmarkEnd w:id="226"/>
+    <w:bookmarkStart w:id="228" w:name="ref-wolf2013"/>
     <w:p>
       <w:pPr>
         <w:pStyle w:val="Bibliography"/>
@@ -30074,7 +30139,7 @@
       <w:r>
         <w:t xml:space="preserve"> </w:t>
       </w:r>
-      <w:hyperlink r:id="rId228">
+      <w:hyperlink r:id="rId227">
         <w:r>
           <w:rPr>
             <w:rStyle w:val="Hyperlink"/>
@@ -30083,8 +30148,8 @@
         </w:r>
       </w:hyperlink>
     </w:p>
-    <w:bookmarkEnd w:id="229"/>
-    <w:bookmarkStart w:id="230" w:name="ref-zhang2018"/>
+    <w:bookmarkEnd w:id="228"/>
+    <w:bookmarkStart w:id="229" w:name="ref-zhang2018"/>
     <w:p>
       <w:pPr>
         <w:pStyle w:val="Bibliography"/>
@@ -30148,9 +30213,9 @@
         <w:t xml:space="preserve">. ISDSA Press.</w:t>
       </w:r>
     </w:p>
+    <w:bookmarkEnd w:id="229"/>
     <w:bookmarkEnd w:id="230"/>
     <w:bookmarkEnd w:id="231"/>
-    <w:bookmarkEnd w:id="232"/>
     <w:sectPr>
       <w:footnotePr>
         <w:numRestart w:val="eachSect"/>

</xml_diff>